<commit_message>
Check public occupation-by-industry employment; qualify within-industry claim in revised manuscript
Co-Authored-By: Claude Sonnet 5.5 <noreply@anthropic.com>
Claude-Session: https://claude.ai/code/session_01H4JvRLBkzRHsy6jU5TcEWv
</commit_message>
<xml_diff>
--- a/isr_paper/revised/Acquired_Not_Yet_Assimilated_ISR.docx
+++ b/isr_paper/revised/Acquired_Not_Yet_Assimilated_ISR.docx
@@ -7195,7 +7195,7 @@
         <w:rPr>
           <w:rFonts w:ascii="Times New Roman" w:cs="Times New Roman" w:eastAsia="Times New Roman" w:hAnsi="Times New Roman"/>
         </w:rPr>
-        <w:t xml:space="preserve">European Labour Force Survey employment in video and film production, advertising, and other professional activities including design and photography rose between 2019–2021 and 2023–2025 by 0.13, 0.11, and 0.15 log points, against a median of 0.04 across 88 industries; creative industries gained 0.09 log points relative to other industries (randomization p = 0.20). US sector postings in arts, media, and marketing fell relative to other sectors, but so did software and data postings, and the same sectors were not stable before the base period. Neither series isolates visual generation, and both are consistent with every account in Table 1 other than large and rapid net substitution.</w:t>
+        <w:t>European Labour Force Survey employment in video and film production, advertising, and other professional activities including design and photography rose between 2019–2021 and 2023–2025 by 0.13, 0.11, and 0.15 log points, against a median of 0.04 across 88 industries; creative industries gained 0.09 log points relative to other industries (randomization p = 0.20). US sector postings in arts, media, and marketing fell relative to other sectors, but so did software and data postings, and the same sectors were not stable before the base period. The finest public occupation-by-industry cross-tabulation (one-digit occupations by industry section) shows professionals’ employment growing by 0.26 log points in information and communication, 0.17 in professional and technical activities, and 0.14 in arts and entertainment, against a median of 0.19 across 19 sections; these groups are dominated by occupations other than visual production, and two-digit occupation data (cultural professionals, +0.09) are too coarse to isolate designers or artists. Neither series isolates visual generation, and both are consistent with every account in Table 1 other than large and rapid net substitution.</w:t>
       </w:r>
     </w:p>
     <w:p>
@@ -8232,7 +8232,7 @@
         <w:rPr>
           <w:rFonts w:ascii="Times New Roman" w:cs="Times New Roman" w:eastAsia="Times New Roman" w:hAnsi="Times New Roman"/>
         </w:rPr>
-        <w:t>A related reading is that falling demand for visual-production occupations reflects structural change in industries, such as shifts in how marketing and media content is produced and bought, and that generative AI accelerates change already under way rather than starting it. Our evidence is compatible with this reading. The European gradient was already moving in the same direction before 2022 (−0.007 per year, not statistically significant), and the estimates depend on the language-exposure control. In the model, acceleration enters through the acceptance threshold: the technology lowers the cost of review and generation for tasks in industries that were already reducing their demand for them, so assimilation is most likely where structural pressure exists. Country-year fixed effects absorb economy-wide shocks but not industry-specific restructuring, and the employment series in Section 7.3 show growth, not contraction, in the creative industries, so any restructuring would have to operate within industries as well as across them. Separating the two requires firm-level data that observe an employer’s industry, its use of the tool, and its hiring together.</w:t>
+        <w:t>A related reading is that falling demand for visual-production occupations reflects structural change in industries, such as shifts in how marketing and media content is produced and bought, and that generative AI accelerates change already under way rather than starting it. Our evidence is compatible with this reading. The European gradient was already moving in the same direction before 2022 (−0.007 per year, not statistically significant), and the estimates depend on the language-exposure control. In the model, acceleration enters through the acceptance threshold: the technology lowers the cost of review and generation for tasks in industries that were already reducing their demand for them, so assimilation is most likely where structural pressure exists. Country-year fixed effects absorb economy-wide shocks but not industry-specific restructuring, and the industry employment series in Section 7.3 show no contraction in the creative industries. Public data cannot show what happened to visual-production occupations within those industries, so the within-industry reading is a hypothesis rather than a finding. Separating the two requires firm-level data that observe an employer’s industry, its use of the tool, and its hiring together.</w:t>
       </w:r>
     </w:p>
     <w:p>

</xml_diff>

<commit_message>
Strengthen theory: review bottleneck, displacement/reinstatement/scale decomposition, attrition dynamics; derivations in Appendix C
Co-Authored-By: Claude Sonnet 5.5 <noreply@anthropic.com>
Claude-Session: https://claude.ai/code/session_01H4JvRLBkzRHsy6jU5TcEWv
</commit_message>
<xml_diff>
--- a/isr_paper/revised/Acquired_Not_Yet_Assimilated_ISR.docx
+++ b/isr_paper/revised/Acquired_Not_Yet_Assimilated_ISR.docx
@@ -200,7 +200,7 @@
         <w:rPr>
           <w:rFonts w:ascii="Times New Roman" w:cs="Times New Roman" w:eastAsia="Times New Roman" w:hAnsi="Times New Roman"/>
         </w:rPr>
-        <w:t>The paper contributes to information systems research in three ways. It extends assimilation theory to generative AI by identifying review cost as the place where complementary assets enter, and by explaining why near-zero acquisition costs should make assimilation gaps wider for generative tools than for the enterprise systems on which the theory was built. It provides a detectability bound that tells researchers when occupation-level hiring designs can and cannot be informative about generative-AI assimilation, and it shows how the bound changes the reading of exposure gradients: the 2023 European gradient is no larger than the trend that preceded the technology, and the 2024 gradient is too imprecise to separate the scenarios. And it turns the gap into a falsifiable research design, with predictions that distinguish the four accounts once linked data become available.</w:t>
+        <w:t>The paper contributes to information systems research in three ways. It extends assimilation theory to generative AI by identifying review cost as the place where complementary assets enter, and by explaining why near-zero acquisition costs should make assimilation gaps wider for generative tools than for the enterprise systems on which the theory was built. Embedding review cost in a task-based model of labor demand shows that review sets a floor on the labor that assimilation can save, that cheaper generation raises employment only if demand for visual output is elastic, and that employers who adjust through attrition make adverts the earlier and employment the later signal. It provides a detectability bound that tells researchers when occupation-level hiring designs can and cannot be informative about generative-AI assimilation, and it shows that a common empirical strategy currently attributes to the technology declines that the technology cannot have produced. And it turns the gap into a falsifiable research design, with predictions that distinguish the four accounts once linked data become available.</w:t>
       </w:r>
     </w:p>
     <w:p>
@@ -304,7 +304,7 @@
         <w:rPr>
           <w:rFonts w:ascii="Times New Roman" w:cs="Times New Roman" w:eastAsia="Times New Roman" w:hAnsi="Times New Roman"/>
         </w:rPr>
-        <w:t xml:space="preserve">A large literature maps AI capabilities onto occupational tasks (Webb 2020; Felten, Raj, and Seamans 2021; Eloundou et al. 2023). Exposure measures describe where a technology could matter, not where it has been acquired or assimilated. Acemoglu, Autor, Hazell, and Restrepo (2022) find that establishments exposed to AI change their hiring but detect little aggregate effect at the occupation or industry level. Evidence from online labor markets is sharper. Hui, Reshef, and Zhou (2024) document employment and earnings losses for freelancers exposed to ChatGPT and image generators, and Demirci, Hannane, and Zhu (2025) find that image-creation posts fell by about 17 percent after image generators were released, relative to manual-intensive jobs. On creator platforms, generative tools raise output for some artists and reallocate demand across creator types (Zhou and Lee 2024; Kim, Jin, and Lee 2026), and inside firms they raise individual productivity on suitable tasks (Brynjolfsson, Li, and Raymond 2025). These settings have something in common that our theory makes explicit: the buyer of a freelance task, or a worker inside a studied team, can switch to the tool without the firm first building a review routine or a compliance policy. We use the platform estimates as a reference for how large substitution can be once assimilation has occurred, not as a test of our account.</w:t>
+        <w:t>A large literature maps AI capabilities onto occupational tasks (Webb 2020; Felten, Raj, and Seamans 2021; Eloundou et al. 2023). Exposure measures describe where a technology could matter, not where it has been acquired or assimilated. Task-based models separate displacement, reinstatement, and productivity effects of automation (Acemoglu and Restrepo 2018, 2019), and models of unbalanced growth show that tasks that cannot be automated become bottlenecks (Baumol 1967; Aghion, Jones, and Jones 2019); we use both ideas in Section 3. Acemoglu, Autor, Hazell, and Restrepo (2022) find that establishments exposed to AI change their hiring but detect little aggregate effect at the occupation or industry level. Evidence from online labor markets is sharper. Hui, Reshef, and Zhou (2024) document employment and earnings losses for freelancers exposed to ChatGPT and image generators, and Demirci, Hannane, and Zhu (2025) find that image-creation posts fell by about 17 percent after image generators were released, relative to manual-intensive jobs. On creator platforms, generative tools raise output for some artists and reallocate demand across creator types (Zhou and Lee 2024; Kim, Jin, and Lee 2026), and inside firms they raise individual productivity on suitable tasks (Brynjolfsson, Li, and Raymond 2025). These settings have something in common that our theory makes explicit: the buyer of a freelance task, or a worker inside a studied team, can switch to the tool without the firm first building a review routine or a compliance policy. We use the platform estimates as a reference for how large substitution can be once assimilation has occurred, not as a test of our account.</w:t>
       </w:r>
     </w:p>
     <w:p>
@@ -1315,13 +1315,1482 @@
       <w:r>
         <w:rPr>
           <w:rFonts w:ascii="Times New Roman" w:cs="Times New Roman" w:eastAsia="Times New Roman" w:hAnsi="Times New Roman"/>
-          <w:b/>
           <w:bCs/>
           <w:color w:val="000000"/>
           <w:sz w:val="24"/>
           <w:szCs w:val="24"/>
         </w:rPr>
-        <w:t xml:space="preserve">3.4 Competing Accounts</w:t>
+        <w:t>3.4 Review as a Bottleneck Task</w:t>
+      </w:r>
+    </w:p>
+    <w:p>
+      <w:pPr>
+        <w:spacing w:after="160" w:line="276"/>
+        <w:jc w:val="both"/>
+      </w:pPr>
+      <w:r>
+        <w:rPr>
+          <w:rFonts w:ascii="Times New Roman" w:cs="Times New Roman" w:eastAsia="Times New Roman" w:hAnsi="Times New Roman"/>
+        </w:rPr>
+        <w:t xml:space="preserve">Equation (1) says when a firm assimilates a task. To see what assimilation does to labor demand, let a unit of the visual asset require </w:t>
+      </w:r>
+      <w:r>
+        <w:rPr>
+          <w:rFonts w:ascii="Times New Roman" w:cs="Times New Roman" w:eastAsia="Times New Roman" w:hAnsi="Times New Roman"/>
+          <w:i/>
+        </w:rPr>
+        <w:t>h</w:t>
+      </w:r>
+      <w:r>
+        <w:rPr>
+          <w:rFonts w:ascii="Times New Roman" w:cs="Times New Roman" w:eastAsia="Times New Roman" w:hAnsi="Times New Roman"/>
+        </w:rPr>
+        <w:t xml:space="preserve"> hours of human production, so that </w:t>
+      </w:r>
+      <w:r>
+        <w:rPr>
+          <w:rFonts w:ascii="Times New Roman" w:cs="Times New Roman" w:eastAsia="Times New Roman" w:hAnsi="Times New Roman"/>
+          <w:i/>
+        </w:rPr>
+        <w:t>θ</w:t>
+      </w:r>
+      <w:r>
+        <w:rPr>
+          <w:rFonts w:ascii="Times New Roman" w:cs="Times New Roman" w:eastAsia="Times New Roman" w:hAnsi="Times New Roman"/>
+        </w:rPr>
+        <w:t xml:space="preserve"> = </w:t>
+      </w:r>
+      <w:r>
+        <w:rPr>
+          <w:rFonts w:ascii="Times New Roman" w:cs="Times New Roman" w:eastAsia="Times New Roman" w:hAnsi="Times New Roman"/>
+          <w:i/>
+        </w:rPr>
+        <w:t>wh</w:t>
+      </w:r>
+      <w:r>
+        <w:rPr>
+          <w:rFonts w:ascii="Times New Roman" w:cs="Times New Roman" w:eastAsia="Times New Roman" w:hAnsi="Times New Roman"/>
+        </w:rPr>
+        <w:t xml:space="preserve">, and let review require </w:t>
+      </w:r>
+      <w:r>
+        <w:rPr>
+          <w:rFonts w:ascii="Times New Roman" w:cs="Times New Roman" w:eastAsia="Times New Roman" w:hAnsi="Times New Roman"/>
+          <w:i/>
+        </w:rPr>
+        <w:t>u</w:t>
+      </w:r>
+      <w:r>
+        <w:rPr>
+          <w:rFonts w:ascii="Times New Roman" w:cs="Times New Roman" w:eastAsia="Times New Roman" w:hAnsi="Times New Roman"/>
+        </w:rPr>
+        <w:t xml:space="preserve"> hours, so that </w:t>
+      </w:r>
+      <w:r>
+        <w:rPr>
+          <w:rFonts w:ascii="Times New Roman" w:cs="Times New Roman" w:eastAsia="Times New Roman" w:hAnsi="Times New Roman"/>
+          <w:i/>
+        </w:rPr>
+        <w:t>r</w:t>
+      </w:r>
+      <w:r>
+        <w:rPr>
+          <w:rFonts w:ascii="Times New Roman" w:cs="Times New Roman" w:eastAsia="Times New Roman" w:hAnsi="Times New Roman"/>
+        </w:rPr>
+        <w:t xml:space="preserve"> = </w:t>
+      </w:r>
+      <w:r>
+        <w:rPr>
+          <w:rFonts w:ascii="Times New Roman" w:cs="Times New Roman" w:eastAsia="Times New Roman" w:hAnsi="Times New Roman"/>
+          <w:i/>
+        </w:rPr>
+        <w:t>wu</w:t>
+      </w:r>
+      <w:r>
+        <w:rPr>
+          <w:rFonts w:ascii="Times New Roman" w:cs="Times New Roman" w:eastAsia="Times New Roman" w:hAnsi="Times New Roman"/>
+        </w:rPr>
+        <w:t xml:space="preserve">. Write </w:t>
+      </w:r>
+      <w:r>
+        <w:rPr>
+          <w:rFonts w:ascii="Times New Roman" w:cs="Times New Roman" w:eastAsia="Times New Roman" w:hAnsi="Times New Roman"/>
+          <w:i/>
+        </w:rPr>
+        <w:t>ρ</w:t>
+      </w:r>
+      <w:r>
+        <w:rPr>
+          <w:rFonts w:ascii="Times New Roman" w:cs="Times New Roman" w:eastAsia="Times New Roman" w:hAnsi="Times New Roman"/>
+        </w:rPr>
+        <w:t xml:space="preserve"> = </w:t>
+      </w:r>
+      <w:r>
+        <w:rPr>
+          <w:rFonts w:ascii="Times New Roman" w:cs="Times New Roman" w:eastAsia="Times New Roman" w:hAnsi="Times New Roman"/>
+          <w:i/>
+        </w:rPr>
+        <w:t>r</w:t>
+      </w:r>
+      <w:r>
+        <w:rPr>
+          <w:rFonts w:ascii="Times New Roman" w:cs="Times New Roman" w:eastAsia="Times New Roman" w:hAnsi="Times New Roman"/>
+        </w:rPr>
+        <w:t>/</w:t>
+      </w:r>
+      <w:r>
+        <w:rPr>
+          <w:rFonts w:ascii="Times New Roman" w:cs="Times New Roman" w:eastAsia="Times New Roman" w:hAnsi="Times New Roman"/>
+          <w:i/>
+        </w:rPr>
+        <w:t>θ</w:t>
+      </w:r>
+      <w:r>
+        <w:rPr>
+          <w:rFonts w:ascii="Times New Roman" w:cs="Times New Roman" w:eastAsia="Times New Roman" w:hAnsi="Times New Roman"/>
+        </w:rPr>
+        <w:t xml:space="preserve"> for review cost relative to human production and </w:t>
+      </w:r>
+      <w:r>
+        <w:rPr>
+          <w:rFonts w:ascii="Times New Roman" w:cs="Times New Roman" w:eastAsia="Times New Roman" w:hAnsi="Times New Roman"/>
+          <w:i/>
+        </w:rPr>
+        <w:t>γ</w:t>
+      </w:r>
+      <w:r>
+        <w:rPr>
+          <w:rFonts w:ascii="Times New Roman" w:cs="Times New Roman" w:eastAsia="Times New Roman" w:hAnsi="Times New Roman"/>
+        </w:rPr>
+        <w:t xml:space="preserve"> = </w:t>
+      </w:r>
+      <w:r>
+        <w:rPr>
+          <w:rFonts w:ascii="Times New Roman" w:cs="Times New Roman" w:eastAsia="Times New Roman" w:hAnsi="Times New Roman"/>
+          <w:i/>
+        </w:rPr>
+        <w:t>c</w:t>
+      </w:r>
+      <w:r>
+        <w:rPr>
+          <w:rFonts w:ascii="Times New Roman" w:cs="Times New Roman" w:eastAsia="Times New Roman" w:hAnsi="Times New Roman"/>
+        </w:rPr>
+        <w:t>/</w:t>
+      </w:r>
+      <w:r>
+        <w:rPr>
+          <w:rFonts w:ascii="Times New Roman" w:cs="Times New Roman" w:eastAsia="Times New Roman" w:hAnsi="Times New Roman"/>
+          <w:i/>
+        </w:rPr>
+        <w:t>θ</w:t>
+      </w:r>
+      <w:r>
+        <w:rPr>
+          <w:rFonts w:ascii="Times New Roman" w:cs="Times New Roman" w:eastAsia="Times New Roman" w:hAnsi="Times New Roman"/>
+        </w:rPr>
+        <w:t xml:space="preserve"> for generation cost relative to human production, so that </w:t>
+      </w:r>
+      <w:r>
+        <w:rPr>
+          <w:rFonts w:ascii="Times New Roman" w:cs="Times New Roman" w:eastAsia="Times New Roman" w:hAnsi="Times New Roman"/>
+          <w:i/>
+        </w:rPr>
+        <w:t>a</w:t>
+      </w:r>
+      <w:r>
+        <w:rPr>
+          <w:rFonts w:ascii="Times New Roman" w:cs="Times New Roman" w:eastAsia="Times New Roman" w:hAnsi="Times New Roman"/>
+        </w:rPr>
+        <w:t xml:space="preserve">* = </w:t>
+      </w:r>
+      <w:r>
+        <w:rPr>
+          <w:rFonts w:ascii="Times New Roman" w:cs="Times New Roman" w:eastAsia="Times New Roman" w:hAnsi="Times New Roman"/>
+          <w:i/>
+        </w:rPr>
+        <w:t>γ</w:t>
+      </w:r>
+      <w:r>
+        <w:rPr>
+          <w:rFonts w:ascii="Times New Roman" w:cs="Times New Roman" w:eastAsia="Times New Roman" w:hAnsi="Times New Roman"/>
+        </w:rPr>
+        <w:t xml:space="preserve"> + </w:t>
+      </w:r>
+      <w:r>
+        <w:rPr>
+          <w:rFonts w:ascii="Times New Roman" w:cs="Times New Roman" w:eastAsia="Times New Roman" w:hAnsi="Times New Roman"/>
+          <w:i/>
+        </w:rPr>
+        <w:t>ρ</w:t>
+      </w:r>
+      <w:r>
+        <w:rPr>
+          <w:rFonts w:ascii="Times New Roman" w:cs="Times New Roman" w:eastAsia="Times New Roman" w:hAnsi="Times New Roman"/>
+        </w:rPr>
+        <w:t xml:space="preserve">. With the generator, a unit of output needs review labor and, with probability 1 − </w:t>
+      </w:r>
+      <w:r>
+        <w:rPr>
+          <w:rFonts w:ascii="Times New Roman" w:cs="Times New Roman" w:eastAsia="Times New Roman" w:hAnsi="Times New Roman"/>
+          <w:i/>
+        </w:rPr>
+        <w:t>a</w:t>
+      </w:r>
+      <w:r>
+        <w:rPr>
+          <w:rFonts w:ascii="Times New Roman" w:cs="Times New Roman" w:eastAsia="Times New Roman" w:hAnsi="Times New Roman"/>
+        </w:rPr>
+        <w:t xml:space="preserve">, human production labor, so labor per unit falls from </w:t>
+      </w:r>
+      <w:r>
+        <w:rPr>
+          <w:rFonts w:ascii="Times New Roman" w:cs="Times New Roman" w:eastAsia="Times New Roman" w:hAnsi="Times New Roman"/>
+          <w:i/>
+        </w:rPr>
+        <w:t>h</w:t>
+      </w:r>
+      <w:r>
+        <w:rPr>
+          <w:rFonts w:ascii="Times New Roman" w:cs="Times New Roman" w:eastAsia="Times New Roman" w:hAnsi="Times New Roman"/>
+        </w:rPr>
+        <w:t xml:space="preserve"> to </w:t>
+      </w:r>
+      <w:r>
+        <w:rPr>
+          <w:rFonts w:ascii="Times New Roman" w:cs="Times New Roman" w:eastAsia="Times New Roman" w:hAnsi="Times New Roman"/>
+          <w:i/>
+        </w:rPr>
+        <w:t>u</w:t>
+      </w:r>
+      <w:r>
+        <w:rPr>
+          <w:rFonts w:ascii="Times New Roman" w:cs="Times New Roman" w:eastAsia="Times New Roman" w:hAnsi="Times New Roman"/>
+        </w:rPr>
+        <w:t xml:space="preserve"> + (1 − </w:t>
+      </w:r>
+      <w:r>
+        <w:rPr>
+          <w:rFonts w:ascii="Times New Roman" w:cs="Times New Roman" w:eastAsia="Times New Roman" w:hAnsi="Times New Roman"/>
+          <w:i/>
+        </w:rPr>
+        <w:t>a</w:t>
+      </w:r>
+      <w:r>
+        <w:rPr>
+          <w:rFonts w:ascii="Times New Roman" w:cs="Times New Roman" w:eastAsia="Times New Roman" w:hAnsi="Times New Roman"/>
+        </w:rPr>
+        <w:t>)</w:t>
+      </w:r>
+      <w:r>
+        <w:rPr>
+          <w:rFonts w:ascii="Times New Roman" w:cs="Times New Roman" w:eastAsia="Times New Roman" w:hAnsi="Times New Roman"/>
+          <w:i/>
+        </w:rPr>
+        <w:t>h</w:t>
+      </w:r>
+      <w:r>
+        <w:rPr>
+          <w:rFonts w:ascii="Times New Roman" w:cs="Times New Roman" w:eastAsia="Times New Roman" w:hAnsi="Times New Roman"/>
+        </w:rPr>
+        <w:t xml:space="preserve">, a ratio of 1 − </w:t>
+      </w:r>
+      <w:r>
+        <w:rPr>
+          <w:rFonts w:ascii="Times New Roman" w:cs="Times New Roman" w:eastAsia="Times New Roman" w:hAnsi="Times New Roman"/>
+          <w:i/>
+        </w:rPr>
+        <w:t>a</w:t>
+      </w:r>
+      <w:r>
+        <w:rPr>
+          <w:rFonts w:ascii="Times New Roman" w:cs="Times New Roman" w:eastAsia="Times New Roman" w:hAnsi="Times New Roman"/>
+        </w:rPr>
+        <w:t xml:space="preserve"> + </w:t>
+      </w:r>
+      <w:r>
+        <w:rPr>
+          <w:rFonts w:ascii="Times New Roman" w:cs="Times New Roman" w:eastAsia="Times New Roman" w:hAnsi="Times New Roman"/>
+          <w:i/>
+        </w:rPr>
+        <w:t>ρ</w:t>
+      </w:r>
+      <w:r>
+        <w:rPr>
+          <w:rFonts w:ascii="Times New Roman" w:cs="Times New Roman" w:eastAsia="Times New Roman" w:hAnsi="Times New Roman"/>
+        </w:rPr>
+        <w:t xml:space="preserve">, while cost per unit falls by the ratio </w:t>
+      </w:r>
+      <w:r>
+        <w:rPr>
+          <w:rFonts w:ascii="Times New Roman" w:cs="Times New Roman" w:eastAsia="Times New Roman" w:hAnsi="Times New Roman"/>
+          <w:i/>
+        </w:rPr>
+        <w:t>κ</w:t>
+      </w:r>
+      <w:r>
+        <w:rPr>
+          <w:rFonts w:ascii="Times New Roman" w:cs="Times New Roman" w:eastAsia="Times New Roman" w:hAnsi="Times New Roman"/>
+        </w:rPr>
+        <w:t xml:space="preserve"> = </w:t>
+      </w:r>
+      <w:r>
+        <w:rPr>
+          <w:rFonts w:ascii="Times New Roman" w:cs="Times New Roman" w:eastAsia="Times New Roman" w:hAnsi="Times New Roman"/>
+          <w:i/>
+        </w:rPr>
+        <w:t>γ</w:t>
+      </w:r>
+      <w:r>
+        <w:rPr>
+          <w:rFonts w:ascii="Times New Roman" w:cs="Times New Roman" w:eastAsia="Times New Roman" w:hAnsi="Times New Roman"/>
+        </w:rPr>
+        <w:t xml:space="preserve"> + </w:t>
+      </w:r>
+      <w:r>
+        <w:rPr>
+          <w:rFonts w:ascii="Times New Roman" w:cs="Times New Roman" w:eastAsia="Times New Roman" w:hAnsi="Times New Roman"/>
+          <w:i/>
+        </w:rPr>
+        <w:t>ρ</w:t>
+      </w:r>
+      <w:r>
+        <w:rPr>
+          <w:rFonts w:ascii="Times New Roman" w:cs="Times New Roman" w:eastAsia="Times New Roman" w:hAnsi="Times New Roman"/>
+        </w:rPr>
+        <w:t xml:space="preserve"> + 1 − </w:t>
+      </w:r>
+      <w:r>
+        <w:rPr>
+          <w:rFonts w:ascii="Times New Roman" w:cs="Times New Roman" w:eastAsia="Times New Roman" w:hAnsi="Times New Roman"/>
+          <w:i/>
+        </w:rPr>
+        <w:t>a</w:t>
+      </w:r>
+      <w:r>
+        <w:rPr>
+          <w:rFonts w:ascii="Times New Roman" w:cs="Times New Roman" w:eastAsia="Times New Roman" w:hAnsi="Times New Roman"/>
+        </w:rPr>
+        <w:t xml:space="preserve">. The ratio </w:t>
+      </w:r>
+      <w:r>
+        <w:rPr>
+          <w:rFonts w:ascii="Times New Roman" w:cs="Times New Roman" w:eastAsia="Times New Roman" w:hAnsi="Times New Roman"/>
+          <w:i/>
+        </w:rPr>
+        <w:t>κ</w:t>
+      </w:r>
+      <w:r>
+        <w:rPr>
+          <w:rFonts w:ascii="Times New Roman" w:cs="Times New Roman" w:eastAsia="Times New Roman" w:hAnsi="Times New Roman"/>
+        </w:rPr>
+        <w:t xml:space="preserve"> is below one exactly when </w:t>
+      </w:r>
+      <w:r>
+        <w:rPr>
+          <w:rFonts w:ascii="Times New Roman" w:cs="Times New Roman" w:eastAsia="Times New Roman" w:hAnsi="Times New Roman"/>
+          <w:i/>
+        </w:rPr>
+        <w:t>a</w:t>
+      </w:r>
+      <w:r>
+        <w:rPr>
+          <w:rFonts w:ascii="Times New Roman" w:cs="Times New Roman" w:eastAsia="Times New Roman" w:hAnsi="Times New Roman"/>
+        </w:rPr>
+        <w:t xml:space="preserve"> &gt; </w:t>
+      </w:r>
+      <w:r>
+        <w:rPr>
+          <w:rFonts w:ascii="Times New Roman" w:cs="Times New Roman" w:eastAsia="Times New Roman" w:hAnsi="Times New Roman"/>
+          <w:i/>
+        </w:rPr>
+        <w:t>a</w:t>
+      </w:r>
+      <w:r>
+        <w:rPr>
+          <w:rFonts w:ascii="Times New Roman" w:cs="Times New Roman" w:eastAsia="Times New Roman" w:hAnsi="Times New Roman"/>
+        </w:rPr>
+        <w:t xml:space="preserve">*. Review labor is paid the same wage as production labor; relaxing this changes </w:t>
+      </w:r>
+      <w:r>
+        <w:rPr>
+          <w:rFonts w:ascii="Times New Roman" w:cs="Times New Roman" w:eastAsia="Times New Roman" w:hAnsi="Times New Roman"/>
+          <w:i/>
+        </w:rPr>
+        <w:t>ρ</w:t>
+      </w:r>
+      <w:r>
+        <w:rPr>
+          <w:rFonts w:ascii="Times New Roman" w:cs="Times New Roman" w:eastAsia="Times New Roman" w:hAnsi="Times New Roman"/>
+        </w:rPr>
+        <w:t xml:space="preserve"> but not the argument.</w:t>
+      </w:r>
+    </w:p>
+    <w:p>
+      <w:pPr>
+        <w:spacing w:after="160" w:line="276"/>
+        <w:jc w:val="both"/>
+      </w:pPr>
+      <w:r>
+        <w:rPr>
+          <w:rFonts w:ascii="Times New Roman" w:cs="Times New Roman" w:eastAsia="Times New Roman" w:hAnsi="Times New Roman"/>
+          <w:b/>
+        </w:rPr>
+        <w:t>Proposition 1 (review floor).</w:t>
+      </w:r>
+      <w:r>
+        <w:rPr>
+          <w:rFonts w:ascii="Times New Roman" w:cs="Times New Roman" w:eastAsia="Times New Roman" w:hAnsi="Times New Roman"/>
+        </w:rPr>
+        <w:t xml:space="preserve"> Labor per unit of output at an assimilating firm cannot fall below the review share </w:t>
+      </w:r>
+      <w:r>
+        <w:rPr>
+          <w:rFonts w:ascii="Times New Roman" w:cs="Times New Roman" w:eastAsia="Times New Roman" w:hAnsi="Times New Roman"/>
+          <w:i/>
+        </w:rPr>
+        <w:t>ρ</w:t>
+      </w:r>
+      <w:r>
+        <w:rPr>
+          <w:rFonts w:ascii="Times New Roman" w:cs="Times New Roman" w:eastAsia="Times New Roman" w:hAnsi="Times New Roman"/>
+        </w:rPr>
+        <w:t xml:space="preserve">, however high the acceptance rate </w:t>
+      </w:r>
+      <w:r>
+        <w:rPr>
+          <w:rFonts w:ascii="Times New Roman" w:cs="Times New Roman" w:eastAsia="Times New Roman" w:hAnsi="Times New Roman"/>
+          <w:i/>
+        </w:rPr>
+        <w:t>a</w:t>
+      </w:r>
+      <w:r>
+        <w:rPr>
+          <w:rFonts w:ascii="Times New Roman" w:cs="Times New Roman" w:eastAsia="Times New Roman" w:hAnsi="Times New Roman"/>
+        </w:rPr>
+        <w:t xml:space="preserve">. If review hours do not fall with model quality, improvements in the generator reduce labor per unit only down to this floor, and when </w:t>
+      </w:r>
+      <w:r>
+        <w:rPr>
+          <w:rFonts w:ascii="Times New Roman" w:cs="Times New Roman" w:eastAsia="Times New Roman" w:hAnsi="Times New Roman"/>
+          <w:i/>
+        </w:rPr>
+        <w:t>ρ</w:t>
+      </w:r>
+      <w:r>
+        <w:rPr>
+          <w:rFonts w:ascii="Times New Roman" w:cs="Times New Roman" w:eastAsia="Times New Roman" w:hAnsi="Times New Roman"/>
+        </w:rPr>
+        <w:t xml:space="preserve"> is large relative to </w:t>
+      </w:r>
+      <w:r>
+        <w:rPr>
+          <w:rFonts w:ascii="Times New Roman" w:cs="Times New Roman" w:eastAsia="Times New Roman" w:hAnsi="Times New Roman"/>
+          <w:i/>
+        </w:rPr>
+        <w:t>a</w:t>
+      </w:r>
+      <w:r>
+        <w:rPr>
+          <w:rFonts w:ascii="Times New Roman" w:cs="Times New Roman" w:eastAsia="Times New Roman" w:hAnsi="Times New Roman"/>
+        </w:rPr>
+        <w:t xml:space="preserve"> the labor saved is small even though the task has been assimilated.</w:t>
+      </w:r>
+    </w:p>
+    <w:p>
+      <w:pPr>
+        <w:spacing w:after="160" w:line="276"/>
+        <w:jc w:val="both"/>
+      </w:pPr>
+      <w:r>
+        <w:rPr>
+          <w:rFonts w:ascii="Times New Roman" w:cs="Times New Roman" w:eastAsia="Times New Roman" w:hAnsi="Times New Roman"/>
+        </w:rPr>
+        <w:t xml:space="preserve">The floor is a bottleneck in the sense of Baumol (1967) and Aghion, Jones, and Jones (2019): when a task that can be automated is complementary to one that cannot, the task that cannot be automated becomes the binding constraint, and its share of the remaining labor rises as the generator improves. Because </w:t>
+      </w:r>
+      <w:r>
+        <w:rPr>
+          <w:rFonts w:ascii="Times New Roman" w:cs="Times New Roman" w:eastAsia="Times New Roman" w:hAnsi="Times New Roman"/>
+          <w:i/>
+        </w:rPr>
+        <w:t>ρ</w:t>
+      </w:r>
+      <w:r>
+        <w:rPr>
+          <w:rFonts w:ascii="Times New Roman" w:cs="Times New Roman" w:eastAsia="Times New Roman" w:hAnsi="Times New Roman"/>
+        </w:rPr>
+        <w:t xml:space="preserve"> depends on the complements </w:t>
+      </w:r>
+      <w:r>
+        <w:rPr>
+          <w:rFonts w:ascii="Times New Roman" w:cs="Times New Roman" w:eastAsia="Times New Roman" w:hAnsi="Times New Roman"/>
+          <w:i/>
+        </w:rPr>
+        <w:t>K</w:t>
+      </w:r>
+      <w:r>
+        <w:rPr>
+          <w:rFonts w:ascii="Times New Roman" w:cs="Times New Roman" w:eastAsia="Times New Roman" w:hAnsi="Times New Roman"/>
+        </w:rPr>
+        <w:t xml:space="preserve"> through review cost, the same complements that govern assimilation also govern how much labor assimilation can save.</w:t>
+      </w:r>
+    </w:p>
+    <w:p>
+      <w:pPr>
+        <w:pStyle w:val="Heading2"/>
+        <w:spacing w:after="120" w:before="280"/>
+      </w:pPr>
+      <w:r>
+        <w:rPr>
+          <w:rFonts w:ascii="Times New Roman" w:cs="Times New Roman" w:eastAsia="Times New Roman" w:hAnsi="Times New Roman"/>
+          <w:bCs/>
+          <w:color w:val="000000"/>
+          <w:sz w:val="24"/>
+          <w:szCs w:val="24"/>
+        </w:rPr>
+        <w:t>3.5 Displacement, Reinstatement, and Scale</w:t>
+      </w:r>
+    </w:p>
+    <w:p>
+      <w:pPr>
+        <w:spacing w:after="160" w:line="276"/>
+        <w:jc w:val="both"/>
+      </w:pPr>
+      <w:r>
+        <w:rPr>
+          <w:rFonts w:ascii="Times New Roman" w:cs="Times New Roman" w:eastAsia="Times New Roman" w:hAnsi="Times New Roman"/>
+        </w:rPr>
+        <w:t xml:space="preserve">Equation (2) leaves </w:t>
+      </w:r>
+      <w:r>
+        <w:rPr>
+          <w:rFonts w:ascii="Times New Roman" w:cs="Times New Roman" w:eastAsia="Times New Roman" w:hAnsi="Times New Roman"/>
+          <w:i/>
+        </w:rPr>
+        <w:t>β</w:t>
+      </w:r>
+      <w:r>
+        <w:rPr>
+          <w:rFonts w:ascii="Times New Roman" w:cs="Times New Roman" w:eastAsia="Times New Roman" w:hAnsi="Times New Roman"/>
+        </w:rPr>
+        <w:t xml:space="preserve"> unspecified. Let </w:t>
+      </w:r>
+      <w:r>
+        <w:rPr>
+          <w:rFonts w:ascii="Times New Roman" w:cs="Times New Roman" w:eastAsia="Times New Roman" w:hAnsi="Times New Roman"/>
+          <w:i/>
+        </w:rPr>
+        <w:t>ε</w:t>
+      </w:r>
+      <w:r>
+        <w:rPr>
+          <w:rFonts w:ascii="Times New Roman" w:cs="Times New Roman" w:eastAsia="Times New Roman" w:hAnsi="Times New Roman"/>
+        </w:rPr>
+        <w:t xml:space="preserve"> be the price elasticity of demand for the occupation’s visual output at the assimilating firm, so that output rises by </w:t>
+      </w:r>
+      <w:r>
+        <w:rPr>
+          <w:rFonts w:ascii="Times New Roman" w:cs="Times New Roman" w:eastAsia="Times New Roman" w:hAnsi="Times New Roman"/>
+          <w:i/>
+        </w:rPr>
+        <w:t>κ</w:t>
+      </w:r>
+      <w:r>
+        <w:rPr>
+          <w:rFonts w:ascii="Times New Roman" w:cs="Times New Roman" w:eastAsia="Times New Roman" w:hAnsi="Times New Roman"/>
+        </w:rPr>
+        <w:t>^(−</w:t>
+      </w:r>
+      <w:r>
+        <w:rPr>
+          <w:rFonts w:ascii="Times New Roman" w:cs="Times New Roman" w:eastAsia="Times New Roman" w:hAnsi="Times New Roman"/>
+          <w:i/>
+        </w:rPr>
+        <w:t>ε</w:t>
+      </w:r>
+      <w:r>
+        <w:rPr>
+          <w:rFonts w:ascii="Times New Roman" w:cs="Times New Roman" w:eastAsia="Times New Roman" w:hAnsi="Times New Roman"/>
+        </w:rPr>
+        <w:t xml:space="preserve">) when cost per unit falls by the ratio </w:t>
+      </w:r>
+      <w:r>
+        <w:rPr>
+          <w:rFonts w:ascii="Times New Roman" w:cs="Times New Roman" w:eastAsia="Times New Roman" w:hAnsi="Times New Roman"/>
+          <w:i/>
+        </w:rPr>
+        <w:t>κ</w:t>
+      </w:r>
+      <w:r>
+        <w:rPr>
+          <w:rFonts w:ascii="Times New Roman" w:cs="Times New Roman" w:eastAsia="Times New Roman" w:hAnsi="Times New Roman"/>
+        </w:rPr>
+        <w:t>. The net effect on demand for the occupation’s work at an assimilating employer is</w:t>
+      </w:r>
+    </w:p>
+    <w:p>
+      <w:pPr>
+        <w:spacing w:after="200" w:before="120"/>
+        <w:jc w:val="center"/>
+      </w:pPr>
+      <w:r>
+        <w:rPr>
+          <w:rFonts w:ascii="Times New Roman" w:cs="Times New Roman" w:eastAsia="Times New Roman" w:hAnsi="Times New Roman"/>
+          <w:i/>
+          <w:iCs/>
+        </w:rPr>
+        <w:t>β</w:t>
+      </w:r>
+      <w:r>
+        <w:rPr>
+          <w:rFonts w:ascii="Times New Roman" w:cs="Times New Roman" w:eastAsia="Times New Roman" w:hAnsi="Times New Roman"/>
+          <w:iCs/>
+        </w:rPr>
+        <w:t xml:space="preserve">  =  ln(1 − </w:t>
+      </w:r>
+      <w:r>
+        <w:rPr>
+          <w:rFonts w:ascii="Times New Roman" w:cs="Times New Roman" w:eastAsia="Times New Roman" w:hAnsi="Times New Roman"/>
+          <w:i/>
+          <w:iCs/>
+        </w:rPr>
+        <w:t>a</w:t>
+      </w:r>
+      <w:r>
+        <w:rPr>
+          <w:rFonts w:ascii="Times New Roman" w:cs="Times New Roman" w:eastAsia="Times New Roman" w:hAnsi="Times New Roman"/>
+          <w:iCs/>
+        </w:rPr>
+        <w:t xml:space="preserve"> + </w:t>
+      </w:r>
+      <w:r>
+        <w:rPr>
+          <w:rFonts w:ascii="Times New Roman" w:cs="Times New Roman" w:eastAsia="Times New Roman" w:hAnsi="Times New Roman"/>
+          <w:i/>
+          <w:iCs/>
+        </w:rPr>
+        <w:t>ρ</w:t>
+      </w:r>
+      <w:r>
+        <w:rPr>
+          <w:rFonts w:ascii="Times New Roman" w:cs="Times New Roman" w:eastAsia="Times New Roman" w:hAnsi="Times New Roman"/>
+          <w:iCs/>
+        </w:rPr>
+        <w:t xml:space="preserve">)  −  </w:t>
+      </w:r>
+      <w:r>
+        <w:rPr>
+          <w:rFonts w:ascii="Times New Roman" w:cs="Times New Roman" w:eastAsia="Times New Roman" w:hAnsi="Times New Roman"/>
+          <w:i/>
+          <w:iCs/>
+        </w:rPr>
+        <w:t>ε</w:t>
+      </w:r>
+      <w:r>
+        <w:rPr>
+          <w:rFonts w:ascii="Times New Roman" w:cs="Times New Roman" w:eastAsia="Times New Roman" w:hAnsi="Times New Roman"/>
+          <w:iCs/>
+        </w:rPr>
+        <w:t xml:space="preserve"> ln </w:t>
+      </w:r>
+      <w:r>
+        <w:rPr>
+          <w:rFonts w:ascii="Times New Roman" w:cs="Times New Roman" w:eastAsia="Times New Roman" w:hAnsi="Times New Roman"/>
+          <w:i/>
+          <w:iCs/>
+        </w:rPr>
+        <w:t>κ</w:t>
+      </w:r>
+      <w:r>
+        <w:rPr>
+          <w:rFonts w:ascii="Times New Roman" w:cs="Times New Roman" w:eastAsia="Times New Roman" w:hAnsi="Times New Roman"/>
+          <w:iCs/>
+        </w:rPr>
+        <w:t>.          (3)</w:t>
+      </w:r>
+    </w:p>
+    <w:p>
+      <w:pPr>
+        <w:spacing w:after="160" w:line="276"/>
+        <w:jc w:val="both"/>
+      </w:pPr>
+      <w:r>
+        <w:rPr>
+          <w:rFonts w:ascii="Times New Roman" w:cs="Times New Roman" w:eastAsia="Times New Roman" w:hAnsi="Times New Roman"/>
+        </w:rPr>
+        <w:t xml:space="preserve">The first term combines displacement, because the generator takes over a share </w:t>
+      </w:r>
+      <w:r>
+        <w:rPr>
+          <w:rFonts w:ascii="Times New Roman" w:cs="Times New Roman" w:eastAsia="Times New Roman" w:hAnsi="Times New Roman"/>
+          <w:i/>
+        </w:rPr>
+        <w:t>a</w:t>
+      </w:r>
+      <w:r>
+        <w:rPr>
+          <w:rFonts w:ascii="Times New Roman" w:cs="Times New Roman" w:eastAsia="Times New Roman" w:hAnsi="Times New Roman"/>
+        </w:rPr>
+        <w:t xml:space="preserve"> of human production, with reinstatement, because review and direction create labor </w:t>
+      </w:r>
+      <w:r>
+        <w:rPr>
+          <w:rFonts w:ascii="Times New Roman" w:cs="Times New Roman" w:eastAsia="Times New Roman" w:hAnsi="Times New Roman"/>
+          <w:i/>
+        </w:rPr>
+        <w:t>ρ</w:t>
+      </w:r>
+      <w:r>
+        <w:rPr>
+          <w:rFonts w:ascii="Times New Roman" w:cs="Times New Roman" w:eastAsia="Times New Roman" w:hAnsi="Times New Roman"/>
+        </w:rPr>
+        <w:t xml:space="preserve"> that did not exist before; these are the displacement and reinstatement effects of the task-based framework (Acemoglu and Restrepo 2018, 2019). The second term is the productivity or scale effect, which is positive because cheaper output raises the quantity demanded and with it the demand for review and direction. The values </w:t>
+      </w:r>
+      <w:r>
+        <w:rPr>
+          <w:rFonts w:ascii="Times New Roman" w:cs="Times New Roman" w:eastAsia="Times New Roman" w:hAnsi="Times New Roman"/>
+          <w:i/>
+        </w:rPr>
+        <w:t>β</w:t>
+      </w:r>
+      <w:r>
+        <w:rPr>
+          <w:rFonts w:ascii="Times New Roman" w:cs="Times New Roman" w:eastAsia="Times New Roman" w:hAnsi="Times New Roman"/>
+        </w:rPr>
+        <w:t xml:space="preserve"> = −0.19 and </w:t>
+      </w:r>
+      <w:r>
+        <w:rPr>
+          <w:rFonts w:ascii="Times New Roman" w:cs="Times New Roman" w:eastAsia="Times New Roman" w:hAnsi="Times New Roman"/>
+          <w:i/>
+        </w:rPr>
+        <w:t>β</w:t>
+      </w:r>
+      <w:r>
+        <w:rPr>
+          <w:rFonts w:ascii="Times New Roman" w:cs="Times New Roman" w:eastAsia="Times New Roman" w:hAnsi="Times New Roman"/>
+        </w:rPr>
+        <w:t xml:space="preserve"> = −0.5 used below are therefore reduced-form: each bundles </w:t>
+      </w:r>
+      <w:r>
+        <w:rPr>
+          <w:rFonts w:ascii="Times New Roman" w:cs="Times New Roman" w:eastAsia="Times New Roman" w:hAnsi="Times New Roman"/>
+          <w:i/>
+        </w:rPr>
+        <w:t>a</w:t>
+      </w:r>
+      <w:r>
+        <w:rPr>
+          <w:rFonts w:ascii="Times New Roman" w:cs="Times New Roman" w:eastAsia="Times New Roman" w:hAnsi="Times New Roman"/>
+        </w:rPr>
+        <w:t xml:space="preserve">, </w:t>
+      </w:r>
+      <w:r>
+        <w:rPr>
+          <w:rFonts w:ascii="Times New Roman" w:cs="Times New Roman" w:eastAsia="Times New Roman" w:hAnsi="Times New Roman"/>
+          <w:i/>
+        </w:rPr>
+        <w:t>ρ</w:t>
+      </w:r>
+      <w:r>
+        <w:rPr>
+          <w:rFonts w:ascii="Times New Roman" w:cs="Times New Roman" w:eastAsia="Times New Roman" w:hAnsi="Times New Roman"/>
+        </w:rPr>
+        <w:t xml:space="preserve">, </w:t>
+      </w:r>
+      <w:r>
+        <w:rPr>
+          <w:rFonts w:ascii="Times New Roman" w:cs="Times New Roman" w:eastAsia="Times New Roman" w:hAnsi="Times New Roman"/>
+          <w:i/>
+        </w:rPr>
+        <w:t>γ</w:t>
+      </w:r>
+      <w:r>
+        <w:rPr>
+          <w:rFonts w:ascii="Times New Roman" w:cs="Times New Roman" w:eastAsia="Times New Roman" w:hAnsi="Times New Roman"/>
+        </w:rPr>
+        <w:t xml:space="preserve">, and </w:t>
+      </w:r>
+      <w:r>
+        <w:rPr>
+          <w:rFonts w:ascii="Times New Roman" w:cs="Times New Roman" w:eastAsia="Times New Roman" w:hAnsi="Times New Roman"/>
+          <w:i/>
+        </w:rPr>
+        <w:t>ε</w:t>
+      </w:r>
+      <w:r>
+        <w:rPr>
+          <w:rFonts w:ascii="Times New Roman" w:cs="Times New Roman" w:eastAsia="Times New Roman" w:hAnsi="Times New Roman"/>
+        </w:rPr>
+        <w:t xml:space="preserve">. For example, with </w:t>
+      </w:r>
+      <w:r>
+        <w:rPr>
+          <w:rFonts w:ascii="Times New Roman" w:cs="Times New Roman" w:eastAsia="Times New Roman" w:hAnsi="Times New Roman"/>
+          <w:i/>
+        </w:rPr>
+        <w:t>a</w:t>
+      </w:r>
+      <w:r>
+        <w:rPr>
+          <w:rFonts w:ascii="Times New Roman" w:cs="Times New Roman" w:eastAsia="Times New Roman" w:hAnsi="Times New Roman"/>
+        </w:rPr>
+        <w:t xml:space="preserve"> = 0.8, </w:t>
+      </w:r>
+      <w:r>
+        <w:rPr>
+          <w:rFonts w:ascii="Times New Roman" w:cs="Times New Roman" w:eastAsia="Times New Roman" w:hAnsi="Times New Roman"/>
+          <w:i/>
+        </w:rPr>
+        <w:t>ρ</w:t>
+      </w:r>
+      <w:r>
+        <w:rPr>
+          <w:rFonts w:ascii="Times New Roman" w:cs="Times New Roman" w:eastAsia="Times New Roman" w:hAnsi="Times New Roman"/>
+        </w:rPr>
+        <w:t xml:space="preserve"> = 0.3, and </w:t>
+      </w:r>
+      <w:r>
+        <w:rPr>
+          <w:rFonts w:ascii="Times New Roman" w:cs="Times New Roman" w:eastAsia="Times New Roman" w:hAnsi="Times New Roman"/>
+          <w:i/>
+        </w:rPr>
+        <w:t>γ</w:t>
+      </w:r>
+      <w:r>
+        <w:rPr>
+          <w:rFonts w:ascii="Times New Roman" w:cs="Times New Roman" w:eastAsia="Times New Roman" w:hAnsi="Times New Roman"/>
+        </w:rPr>
+        <w:t xml:space="preserve"> = 0.05, labor per unit falls to half and cost per unit to 0.55 of its earlier level, and </w:t>
+      </w:r>
+      <w:r>
+        <w:rPr>
+          <w:rFonts w:ascii="Times New Roman" w:cs="Times New Roman" w:eastAsia="Times New Roman" w:hAnsi="Times New Roman"/>
+          <w:i/>
+        </w:rPr>
+        <w:t>β</w:t>
+      </w:r>
+      <w:r>
+        <w:rPr>
+          <w:rFonts w:ascii="Times New Roman" w:cs="Times New Roman" w:eastAsia="Times New Roman" w:hAnsi="Times New Roman"/>
+        </w:rPr>
+        <w:t xml:space="preserve"> is −0.39 if </w:t>
+      </w:r>
+      <w:r>
+        <w:rPr>
+          <w:rFonts w:ascii="Times New Roman" w:cs="Times New Roman" w:eastAsia="Times New Roman" w:hAnsi="Times New Roman"/>
+          <w:i/>
+        </w:rPr>
+        <w:t>ε</w:t>
+      </w:r>
+      <w:r>
+        <w:rPr>
+          <w:rFonts w:ascii="Times New Roman" w:cs="Times New Roman" w:eastAsia="Times New Roman" w:hAnsi="Times New Roman"/>
+        </w:rPr>
+        <w:t xml:space="preserve"> = 0.5, −0.10 if </w:t>
+      </w:r>
+      <w:r>
+        <w:rPr>
+          <w:rFonts w:ascii="Times New Roman" w:cs="Times New Roman" w:eastAsia="Times New Roman" w:hAnsi="Times New Roman"/>
+          <w:i/>
+        </w:rPr>
+        <w:t>ε</w:t>
+      </w:r>
+      <w:r>
+        <w:rPr>
+          <w:rFonts w:ascii="Times New Roman" w:cs="Times New Roman" w:eastAsia="Times New Roman" w:hAnsi="Times New Roman"/>
+        </w:rPr>
+        <w:t xml:space="preserve"> = 1, and +0.02 if </w:t>
+      </w:r>
+      <w:r>
+        <w:rPr>
+          <w:rFonts w:ascii="Times New Roman" w:cs="Times New Roman" w:eastAsia="Times New Roman" w:hAnsi="Times New Roman"/>
+          <w:i/>
+        </w:rPr>
+        <w:t>ε</w:t>
+      </w:r>
+      <w:r>
+        <w:rPr>
+          <w:rFonts w:ascii="Times New Roman" w:cs="Times New Roman" w:eastAsia="Times New Roman" w:hAnsi="Times New Roman"/>
+        </w:rPr>
+        <w:t xml:space="preserve"> = 1.2.</w:t>
+      </w:r>
+    </w:p>
+    <w:p>
+      <w:pPr>
+        <w:spacing w:after="160" w:line="276"/>
+        <w:jc w:val="both"/>
+      </w:pPr>
+      <w:r>
+        <w:rPr>
+          <w:rFonts w:ascii="Times New Roman" w:cs="Times New Roman" w:eastAsia="Times New Roman" w:hAnsi="Times New Roman"/>
+          <w:b/>
+        </w:rPr>
+        <w:t>Proposition 2 (scale offset).</w:t>
+      </w:r>
+      <w:r>
+        <w:rPr>
+          <w:rFonts w:ascii="Times New Roman" w:cs="Times New Roman" w:eastAsia="Times New Roman" w:hAnsi="Times New Roman"/>
+        </w:rPr>
+        <w:t xml:space="preserve"> The net effect </w:t>
+      </w:r>
+      <w:r>
+        <w:rPr>
+          <w:rFonts w:ascii="Times New Roman" w:cs="Times New Roman" w:eastAsia="Times New Roman" w:hAnsi="Times New Roman"/>
+          <w:i/>
+        </w:rPr>
+        <w:t>β</w:t>
+      </w:r>
+      <w:r>
+        <w:rPr>
+          <w:rFonts w:ascii="Times New Roman" w:cs="Times New Roman" w:eastAsia="Times New Roman" w:hAnsi="Times New Roman"/>
+        </w:rPr>
+        <w:t xml:space="preserve"> is negative if and only if </w:t>
+      </w:r>
+      <w:r>
+        <w:rPr>
+          <w:rFonts w:ascii="Times New Roman" w:cs="Times New Roman" w:eastAsia="Times New Roman" w:hAnsi="Times New Roman"/>
+          <w:i/>
+        </w:rPr>
+        <w:t>ε</w:t>
+      </w:r>
+      <w:r>
+        <w:rPr>
+          <w:rFonts w:ascii="Times New Roman" w:cs="Times New Roman" w:eastAsia="Times New Roman" w:hAnsi="Times New Roman"/>
+        </w:rPr>
+        <w:t xml:space="preserve"> &lt; </w:t>
+      </w:r>
+      <w:r>
+        <w:rPr>
+          <w:rFonts w:ascii="Times New Roman" w:cs="Times New Roman" w:eastAsia="Times New Roman" w:hAnsi="Times New Roman"/>
+          <w:i/>
+        </w:rPr>
+        <w:t>ε</w:t>
+      </w:r>
+      <w:r>
+        <w:rPr>
+          <w:rFonts w:ascii="Times New Roman" w:cs="Times New Roman" w:eastAsia="Times New Roman" w:hAnsi="Times New Roman"/>
+        </w:rPr>
+        <w:t xml:space="preserve">* = ln(1 − </w:t>
+      </w:r>
+      <w:r>
+        <w:rPr>
+          <w:rFonts w:ascii="Times New Roman" w:cs="Times New Roman" w:eastAsia="Times New Roman" w:hAnsi="Times New Roman"/>
+          <w:i/>
+        </w:rPr>
+        <w:t>a</w:t>
+      </w:r>
+      <w:r>
+        <w:rPr>
+          <w:rFonts w:ascii="Times New Roman" w:cs="Times New Roman" w:eastAsia="Times New Roman" w:hAnsi="Times New Roman"/>
+        </w:rPr>
+        <w:t xml:space="preserve"> + </w:t>
+      </w:r>
+      <w:r>
+        <w:rPr>
+          <w:rFonts w:ascii="Times New Roman" w:cs="Times New Roman" w:eastAsia="Times New Roman" w:hAnsi="Times New Roman"/>
+          <w:i/>
+        </w:rPr>
+        <w:t>ρ</w:t>
+      </w:r>
+      <w:r>
+        <w:rPr>
+          <w:rFonts w:ascii="Times New Roman" w:cs="Times New Roman" w:eastAsia="Times New Roman" w:hAnsi="Times New Roman"/>
+        </w:rPr>
+        <w:t xml:space="preserve">) / ln </w:t>
+      </w:r>
+      <w:r>
+        <w:rPr>
+          <w:rFonts w:ascii="Times New Roman" w:cs="Times New Roman" w:eastAsia="Times New Roman" w:hAnsi="Times New Roman"/>
+          <w:i/>
+        </w:rPr>
+        <w:t>κ</w:t>
+      </w:r>
+      <w:r>
+        <w:rPr>
+          <w:rFonts w:ascii="Times New Roman" w:cs="Times New Roman" w:eastAsia="Times New Roman" w:hAnsi="Times New Roman"/>
+        </w:rPr>
+        <w:t xml:space="preserve">, and </w:t>
+      </w:r>
+      <w:r>
+        <w:rPr>
+          <w:rFonts w:ascii="Times New Roman" w:cs="Times New Roman" w:eastAsia="Times New Roman" w:hAnsi="Times New Roman"/>
+          <w:i/>
+        </w:rPr>
+        <w:t>ε</w:t>
+      </w:r>
+      <w:r>
+        <w:rPr>
+          <w:rFonts w:ascii="Times New Roman" w:cs="Times New Roman" w:eastAsia="Times New Roman" w:hAnsi="Times New Roman"/>
+        </w:rPr>
+        <w:t xml:space="preserve">* &gt; 1 whenever </w:t>
+      </w:r>
+      <w:r>
+        <w:rPr>
+          <w:rFonts w:ascii="Times New Roman" w:cs="Times New Roman" w:eastAsia="Times New Roman" w:hAnsi="Times New Roman"/>
+          <w:i/>
+        </w:rPr>
+        <w:t>γ</w:t>
+      </w:r>
+      <w:r>
+        <w:rPr>
+          <w:rFonts w:ascii="Times New Roman" w:cs="Times New Roman" w:eastAsia="Times New Roman" w:hAnsi="Times New Roman"/>
+        </w:rPr>
+        <w:t xml:space="preserve"> &gt; 0. As generation cost falls toward zero, </w:t>
+      </w:r>
+      <w:r>
+        <w:rPr>
+          <w:rFonts w:ascii="Times New Roman" w:cs="Times New Roman" w:eastAsia="Times New Roman" w:hAnsi="Times New Roman"/>
+          <w:i/>
+        </w:rPr>
+        <w:t>ε</w:t>
+      </w:r>
+      <w:r>
+        <w:rPr>
+          <w:rFonts w:ascii="Times New Roman" w:cs="Times New Roman" w:eastAsia="Times New Roman" w:hAnsi="Times New Roman"/>
+        </w:rPr>
+        <w:t>* approaches 1: complete assimilation reduces demand for the occupation if demand for visual output is inelastic and can raise it only if demand is elastic.</w:t>
+      </w:r>
+    </w:p>
+    <w:p>
+      <w:pPr>
+        <w:pStyle w:val="Heading2"/>
+        <w:spacing w:after="120" w:before="280"/>
+      </w:pPr>
+      <w:r>
+        <w:rPr>
+          <w:rFonts w:ascii="Times New Roman" w:cs="Times New Roman" w:eastAsia="Times New Roman" w:hAnsi="Times New Roman"/>
+          <w:bCs/>
+          <w:color w:val="000000"/>
+          <w:sz w:val="24"/>
+          <w:szCs w:val="24"/>
+        </w:rPr>
+        <w:t>3.6 Adjustment Through Attrition</w:t>
+      </w:r>
+    </w:p>
+    <w:p>
+      <w:pPr>
+        <w:spacing w:after="160" w:line="276"/>
+        <w:jc w:val="both"/>
+      </w:pPr>
+      <w:r>
+        <w:rPr>
+          <w:rFonts w:ascii="Times New Roman" w:cs="Times New Roman" w:eastAsia="Times New Roman" w:hAnsi="Times New Roman"/>
+        </w:rPr>
+        <w:t xml:space="preserve">Job adverts measure hiring, and hiring is how most employers reduce a workforce without layoffs. Let </w:t>
+      </w:r>
+      <w:r>
+        <w:rPr>
+          <w:rFonts w:ascii="Times New Roman" w:cs="Times New Roman" w:eastAsia="Times New Roman" w:hAnsi="Times New Roman"/>
+          <w:i/>
+        </w:rPr>
+        <w:t>L</w:t>
+      </w:r>
+      <w:r>
+        <w:rPr>
+          <w:rFonts w:ascii="Times New Roman" w:cs="Times New Roman" w:eastAsia="Times New Roman" w:hAnsi="Times New Roman"/>
+        </w:rPr>
+        <w:t xml:space="preserve">(t) be an employer’s employment in the occupation, </w:t>
+      </w:r>
+      <w:r>
+        <w:rPr>
+          <w:rFonts w:ascii="Times New Roman" w:cs="Times New Roman" w:eastAsia="Times New Roman" w:hAnsi="Times New Roman"/>
+          <w:i/>
+        </w:rPr>
+        <w:t>δ</w:t>
+      </w:r>
+      <w:r>
+        <w:rPr>
+          <w:rFonts w:ascii="Times New Roman" w:cs="Times New Roman" w:eastAsia="Times New Roman" w:hAnsi="Times New Roman"/>
+        </w:rPr>
+        <w:t xml:space="preserve"> the separation rate, and </w:t>
+      </w:r>
+      <w:r>
+        <w:rPr>
+          <w:rFonts w:ascii="Times New Roman" w:cs="Times New Roman" w:eastAsia="Times New Roman" w:hAnsi="Times New Roman"/>
+          <w:i/>
+        </w:rPr>
+        <w:t>H</w:t>
+      </w:r>
+      <w:r>
+        <w:rPr>
+          <w:rFonts w:ascii="Times New Roman" w:cs="Times New Roman" w:eastAsia="Times New Roman" w:hAnsi="Times New Roman"/>
+        </w:rPr>
+        <w:t xml:space="preserve">(t) hires, so that </w:t>
+      </w:r>
+      <w:r>
+        <w:rPr>
+          <w:rFonts w:ascii="Times New Roman" w:cs="Times New Roman" w:eastAsia="Times New Roman" w:hAnsi="Times New Roman"/>
+          <w:i/>
+        </w:rPr>
+        <w:t>L</w:t>
+      </w:r>
+      <w:r>
+        <w:rPr>
+          <w:rFonts w:ascii="Times New Roman" w:cs="Times New Roman" w:eastAsia="Times New Roman" w:hAnsi="Times New Roman"/>
+        </w:rPr>
+        <w:t xml:space="preserve">(t + 1) = (1 − </w:t>
+      </w:r>
+      <w:r>
+        <w:rPr>
+          <w:rFonts w:ascii="Times New Roman" w:cs="Times New Roman" w:eastAsia="Times New Roman" w:hAnsi="Times New Roman"/>
+          <w:i/>
+        </w:rPr>
+        <w:t>δ</w:t>
+      </w:r>
+      <w:r>
+        <w:rPr>
+          <w:rFonts w:ascii="Times New Roman" w:cs="Times New Roman" w:eastAsia="Times New Roman" w:hAnsi="Times New Roman"/>
+        </w:rPr>
+        <w:t>)</w:t>
+      </w:r>
+      <w:r>
+        <w:rPr>
+          <w:rFonts w:ascii="Times New Roman" w:cs="Times New Roman" w:eastAsia="Times New Roman" w:hAnsi="Times New Roman"/>
+          <w:i/>
+        </w:rPr>
+        <w:t>L</w:t>
+      </w:r>
+      <w:r>
+        <w:rPr>
+          <w:rFonts w:ascii="Times New Roman" w:cs="Times New Roman" w:eastAsia="Times New Roman" w:hAnsi="Times New Roman"/>
+        </w:rPr>
+        <w:t xml:space="preserve">(t) + </w:t>
+      </w:r>
+      <w:r>
+        <w:rPr>
+          <w:rFonts w:ascii="Times New Roman" w:cs="Times New Roman" w:eastAsia="Times New Roman" w:hAnsi="Times New Roman"/>
+          <w:i/>
+        </w:rPr>
+        <w:t>H</w:t>
+      </w:r>
+      <w:r>
+        <w:rPr>
+          <w:rFonts w:ascii="Times New Roman" w:cs="Times New Roman" w:eastAsia="Times New Roman" w:hAnsi="Times New Roman"/>
+        </w:rPr>
+        <w:t xml:space="preserve">(t). Suppose assimilation lowers target employment to </w:t>
+      </w:r>
+      <w:r>
+        <w:rPr>
+          <w:rFonts w:ascii="Times New Roman" w:cs="Times New Roman" w:eastAsia="Times New Roman" w:hAnsi="Times New Roman"/>
+          <w:i/>
+        </w:rPr>
+        <w:t>L</w:t>
+      </w:r>
+      <w:r>
+        <w:rPr>
+          <w:rFonts w:ascii="Times New Roman" w:cs="Times New Roman" w:eastAsia="Times New Roman" w:hAnsi="Times New Roman"/>
+        </w:rPr>
+        <w:t xml:space="preserve">* = (1 − </w:t>
+      </w:r>
+      <w:r>
+        <w:rPr>
+          <w:rFonts w:ascii="Times New Roman" w:cs="Times New Roman" w:eastAsia="Times New Roman" w:hAnsi="Times New Roman"/>
+          <w:i/>
+        </w:rPr>
+        <w:t>f</w:t>
+      </w:r>
+      <w:r>
+        <w:rPr>
+          <w:rFonts w:ascii="Times New Roman" w:cs="Times New Roman" w:eastAsia="Times New Roman" w:hAnsi="Times New Roman"/>
+        </w:rPr>
+        <w:t>)</w:t>
+      </w:r>
+      <w:r>
+        <w:rPr>
+          <w:rFonts w:ascii="Times New Roman" w:cs="Times New Roman" w:eastAsia="Times New Roman" w:hAnsi="Times New Roman"/>
+          <w:i/>
+        </w:rPr>
+        <w:t>L</w:t>
+      </w:r>
+      <w:r>
+        <w:rPr>
+          <w:rFonts w:ascii="Times New Roman" w:cs="Times New Roman" w:eastAsia="Times New Roman" w:hAnsi="Times New Roman"/>
+        </w:rPr>
+        <w:t xml:space="preserve">₀ and the employer closes a fraction </w:t>
+      </w:r>
+      <w:r>
+        <w:rPr>
+          <w:rFonts w:ascii="Times New Roman" w:cs="Times New Roman" w:eastAsia="Times New Roman" w:hAnsi="Times New Roman"/>
+          <w:i/>
+        </w:rPr>
+        <w:t>λ</w:t>
+      </w:r>
+      <w:r>
+        <w:rPr>
+          <w:rFonts w:ascii="Times New Roman" w:cs="Times New Roman" w:eastAsia="Times New Roman" w:hAnsi="Times New Roman"/>
+        </w:rPr>
+        <w:t xml:space="preserve"> ≤ </w:t>
+      </w:r>
+      <w:r>
+        <w:rPr>
+          <w:rFonts w:ascii="Times New Roman" w:cs="Times New Roman" w:eastAsia="Times New Roman" w:hAnsi="Times New Roman"/>
+          <w:i/>
+        </w:rPr>
+        <w:t>δ</w:t>
+      </w:r>
+      <w:r>
+        <w:rPr>
+          <w:rFonts w:ascii="Times New Roman" w:cs="Times New Roman" w:eastAsia="Times New Roman" w:hAnsi="Times New Roman"/>
+        </w:rPr>
+        <w:t xml:space="preserve"> of the remaining gap each period by adjusting hiring:</w:t>
+      </w:r>
+    </w:p>
+    <w:p>
+      <w:pPr>
+        <w:spacing w:after="200" w:before="120"/>
+        <w:jc w:val="center"/>
+      </w:pPr>
+      <w:r>
+        <w:rPr>
+          <w:rFonts w:ascii="Times New Roman" w:cs="Times New Roman" w:eastAsia="Times New Roman" w:hAnsi="Times New Roman"/>
+          <w:i/>
+          <w:iCs/>
+        </w:rPr>
+        <w:t>H</w:t>
+      </w:r>
+      <w:r>
+        <w:rPr>
+          <w:rFonts w:ascii="Times New Roman" w:cs="Times New Roman" w:eastAsia="Times New Roman" w:hAnsi="Times New Roman"/>
+          <w:iCs/>
+        </w:rPr>
+        <w:t xml:space="preserve">(t)  =  </w:t>
+      </w:r>
+      <w:r>
+        <w:rPr>
+          <w:rFonts w:ascii="Times New Roman" w:cs="Times New Roman" w:eastAsia="Times New Roman" w:hAnsi="Times New Roman"/>
+          <w:i/>
+          <w:iCs/>
+        </w:rPr>
+        <w:t>δL</w:t>
+      </w:r>
+      <w:r>
+        <w:rPr>
+          <w:rFonts w:ascii="Times New Roman" w:cs="Times New Roman" w:eastAsia="Times New Roman" w:hAnsi="Times New Roman"/>
+          <w:iCs/>
+        </w:rPr>
+        <w:t xml:space="preserve">(t)  +  </w:t>
+      </w:r>
+      <w:r>
+        <w:rPr>
+          <w:rFonts w:ascii="Times New Roman" w:cs="Times New Roman" w:eastAsia="Times New Roman" w:hAnsi="Times New Roman"/>
+          <w:i/>
+          <w:iCs/>
+        </w:rPr>
+        <w:t>λ</w:t>
+      </w:r>
+      <w:r>
+        <w:rPr>
+          <w:rFonts w:ascii="Times New Roman" w:cs="Times New Roman" w:eastAsia="Times New Roman" w:hAnsi="Times New Roman"/>
+          <w:iCs/>
+        </w:rPr>
+        <w:t>(</w:t>
+      </w:r>
+      <w:r>
+        <w:rPr>
+          <w:rFonts w:ascii="Times New Roman" w:cs="Times New Roman" w:eastAsia="Times New Roman" w:hAnsi="Times New Roman"/>
+          <w:i/>
+          <w:iCs/>
+        </w:rPr>
+        <w:t>L</w:t>
+      </w:r>
+      <w:r>
+        <w:rPr>
+          <w:rFonts w:ascii="Times New Roman" w:cs="Times New Roman" w:eastAsia="Times New Roman" w:hAnsi="Times New Roman"/>
+          <w:iCs/>
+        </w:rPr>
+        <w:t xml:space="preserve">*  −  </w:t>
+      </w:r>
+      <w:r>
+        <w:rPr>
+          <w:rFonts w:ascii="Times New Roman" w:cs="Times New Roman" w:eastAsia="Times New Roman" w:hAnsi="Times New Roman"/>
+          <w:i/>
+          <w:iCs/>
+        </w:rPr>
+        <w:t>L</w:t>
+      </w:r>
+      <w:r>
+        <w:rPr>
+          <w:rFonts w:ascii="Times New Roman" w:cs="Times New Roman" w:eastAsia="Times New Roman" w:hAnsi="Times New Roman"/>
+          <w:iCs/>
+        </w:rPr>
+        <w:t>(t)).          (4)</w:t>
+      </w:r>
+    </w:p>
+    <w:p>
+      <w:pPr>
+        <w:spacing w:after="160" w:line="276"/>
+        <w:jc w:val="both"/>
+      </w:pPr>
+      <w:r>
+        <w:rPr>
+          <w:rFonts w:ascii="Times New Roman" w:cs="Times New Roman" w:eastAsia="Times New Roman" w:hAnsi="Times New Roman"/>
+          <w:b/>
+        </w:rPr>
+        <w:t>Proposition 3 (attrition lag).</w:t>
+      </w:r>
+      <w:r>
+        <w:rPr>
+          <w:rFonts w:ascii="Times New Roman" w:cs="Times New Roman" w:eastAsia="Times New Roman" w:hAnsi="Times New Roman"/>
+        </w:rPr>
+        <w:t xml:space="preserve"> Under equation (4), (i) hiring in the first period falls by the fraction (</w:t>
+      </w:r>
+      <w:r>
+        <w:rPr>
+          <w:rFonts w:ascii="Times New Roman" w:cs="Times New Roman" w:eastAsia="Times New Roman" w:hAnsi="Times New Roman"/>
+          <w:i/>
+        </w:rPr>
+        <w:t>λ</w:t>
+      </w:r>
+      <w:r>
+        <w:rPr>
+          <w:rFonts w:ascii="Times New Roman" w:cs="Times New Roman" w:eastAsia="Times New Roman" w:hAnsi="Times New Roman"/>
+        </w:rPr>
+        <w:t>/</w:t>
+      </w:r>
+      <w:r>
+        <w:rPr>
+          <w:rFonts w:ascii="Times New Roman" w:cs="Times New Roman" w:eastAsia="Times New Roman" w:hAnsi="Times New Roman"/>
+          <w:i/>
+        </w:rPr>
+        <w:t>δ</w:t>
+      </w:r>
+      <w:r>
+        <w:rPr>
+          <w:rFonts w:ascii="Times New Roman" w:cs="Times New Roman" w:eastAsia="Times New Roman" w:hAnsi="Times New Roman"/>
+        </w:rPr>
+        <w:t>)</w:t>
+      </w:r>
+      <w:r>
+        <w:rPr>
+          <w:rFonts w:ascii="Times New Roman" w:cs="Times New Roman" w:eastAsia="Times New Roman" w:hAnsi="Times New Roman"/>
+          <w:i/>
+        </w:rPr>
+        <w:t>f</w:t>
+      </w:r>
+      <w:r>
+        <w:rPr>
+          <w:rFonts w:ascii="Times New Roman" w:cs="Times New Roman" w:eastAsia="Times New Roman" w:hAnsi="Times New Roman"/>
+        </w:rPr>
+        <w:t xml:space="preserve"> ≤ </w:t>
+      </w:r>
+      <w:r>
+        <w:rPr>
+          <w:rFonts w:ascii="Times New Roman" w:cs="Times New Roman" w:eastAsia="Times New Roman" w:hAnsi="Times New Roman"/>
+          <w:i/>
+        </w:rPr>
+        <w:t>f</w:t>
+      </w:r>
+      <w:r>
+        <w:rPr>
+          <w:rFonts w:ascii="Times New Roman" w:cs="Times New Roman" w:eastAsia="Times New Roman" w:hAnsi="Times New Roman"/>
+        </w:rPr>
+        <w:t xml:space="preserve"> and converges to a fall of </w:t>
+      </w:r>
+      <w:r>
+        <w:rPr>
+          <w:rFonts w:ascii="Times New Roman" w:cs="Times New Roman" w:eastAsia="Times New Roman" w:hAnsi="Times New Roman"/>
+          <w:i/>
+        </w:rPr>
+        <w:t>f</w:t>
+      </w:r>
+      <w:r>
+        <w:rPr>
+          <w:rFonts w:ascii="Times New Roman" w:cs="Times New Roman" w:eastAsia="Times New Roman" w:hAnsi="Times New Roman"/>
+        </w:rPr>
+        <w:t xml:space="preserve">, so the decline in adverts never exceeds the decline in target employment, and equation (5) below, which gives the coefficient implied by </w:t>
+      </w:r>
+      <w:r>
+        <w:rPr>
+          <w:rFonts w:ascii="Times New Roman" w:cs="Times New Roman" w:eastAsia="Times New Roman" w:hAnsi="Times New Roman"/>
+          <w:i/>
+        </w:rPr>
+        <w:t>f</w:t>
+      </w:r>
+      <w:r>
+        <w:rPr>
+          <w:rFonts w:ascii="Times New Roman" w:cs="Times New Roman" w:eastAsia="Times New Roman" w:hAnsi="Times New Roman"/>
+        </w:rPr>
+        <w:t xml:space="preserve">, is an upper bound for adverts as well as for employment; (ii) employment closes only a fraction 1 − (1 − </w:t>
+      </w:r>
+      <w:r>
+        <w:rPr>
+          <w:rFonts w:ascii="Times New Roman" w:cs="Times New Roman" w:eastAsia="Times New Roman" w:hAnsi="Times New Roman"/>
+          <w:i/>
+        </w:rPr>
+        <w:t>λ</w:t>
+      </w:r>
+      <w:r>
+        <w:rPr>
+          <w:rFonts w:ascii="Times New Roman" w:cs="Times New Roman" w:eastAsia="Times New Roman" w:hAnsi="Times New Roman"/>
+        </w:rPr>
+        <w:t>)^</w:t>
+      </w:r>
+      <w:r>
+        <w:rPr>
+          <w:rFonts w:ascii="Times New Roman" w:cs="Times New Roman" w:eastAsia="Times New Roman" w:hAnsi="Times New Roman"/>
+          <w:i/>
+        </w:rPr>
+        <w:t>T</w:t>
+      </w:r>
+      <w:r>
+        <w:rPr>
+          <w:rFonts w:ascii="Times New Roman" w:cs="Times New Roman" w:eastAsia="Times New Roman" w:hAnsi="Times New Roman"/>
+        </w:rPr>
+        <w:t xml:space="preserve"> of the gap after </w:t>
+      </w:r>
+      <w:r>
+        <w:rPr>
+          <w:rFonts w:ascii="Times New Roman" w:cs="Times New Roman" w:eastAsia="Times New Roman" w:hAnsi="Times New Roman"/>
+          <w:i/>
+        </w:rPr>
+        <w:t>T</w:t>
+      </w:r>
+      <w:r>
+        <w:rPr>
+          <w:rFonts w:ascii="Times New Roman" w:cs="Times New Roman" w:eastAsia="Times New Roman" w:hAnsi="Times New Roman"/>
+        </w:rPr>
+        <w:t xml:space="preserve"> periods. With </w:t>
+      </w:r>
+      <w:r>
+        <w:rPr>
+          <w:rFonts w:ascii="Times New Roman" w:cs="Times New Roman" w:eastAsia="Times New Roman" w:hAnsi="Times New Roman"/>
+          <w:i/>
+        </w:rPr>
+        <w:t>λ</w:t>
+      </w:r>
+      <w:r>
+        <w:rPr>
+          <w:rFonts w:ascii="Times New Roman" w:cs="Times New Roman" w:eastAsia="Times New Roman" w:hAnsi="Times New Roman"/>
+        </w:rPr>
+        <w:t xml:space="preserve"> = 0.10, for example, 19 percent of the gap is closed after two years and 41 percent after five.</w:t>
+      </w:r>
+    </w:p>
+    <w:p>
+      <w:pPr>
+        <w:spacing w:after="160" w:line="276"/>
+        <w:jc w:val="both"/>
+      </w:pPr>
+      <w:r>
+        <w:rPr>
+          <w:rFonts w:ascii="Times New Roman" w:cs="Times New Roman" w:eastAsia="Times New Roman" w:hAnsi="Times New Roman"/>
+        </w:rPr>
+        <w:t>Two consequences follow. Employment series, such as those in Section 7.3, can show no contraction for years after assimilation has begun, so adverts are the earlier signal, though not a larger one. And a decline that began before the technology, because of structural change in the industries that employ the occupation, enters as a lower target employment at an earlier date and follows the same dynamics. A pre-existing trend in adverts and a target cut caused by the technology cannot be told apart without firm-level data that observe use of the tool.</w:t>
+      </w:r>
+    </w:p>
+    <w:p>
+      <w:pPr>
+        <w:pStyle w:val="Heading2"/>
+        <w:spacing w:after="120" w:before="280"/>
+      </w:pPr>
+      <w:r>
+        <w:rPr>
+          <w:rFonts w:ascii="Times New Roman" w:cs="Times New Roman" w:eastAsia="Times New Roman" w:hAnsi="Times New Roman"/>
+          <w:bCs/>
+          <w:color w:val="000000"/>
+          <w:sz w:val="24"/>
+          <w:szCs w:val="24"/>
+        </w:rPr>
+        <w:t>3.7 Competing Accounts</w:t>
       </w:r>
     </w:p>
     <w:p>
@@ -2381,7 +3850,59 @@
           <w:i/>
           <w:iCs/>
         </w:rPr>
-        <w:t xml:space="preserve">γ*  ≈  Aᵘ · β / k.          (3)</w:t>
+        <w:t>γ</w:t>
+      </w:r>
+      <w:r>
+        <w:rPr>
+          <w:rFonts w:ascii="Times New Roman" w:cs="Times New Roman" w:eastAsia="Times New Roman" w:hAnsi="Times New Roman"/>
+          <w:iCs/>
+        </w:rPr>
+        <w:t xml:space="preserve">*  ≈  </w:t>
+      </w:r>
+      <w:r>
+        <w:rPr>
+          <w:rFonts w:ascii="Times New Roman" w:cs="Times New Roman" w:eastAsia="Times New Roman" w:hAnsi="Times New Roman"/>
+          <w:i/>
+          <w:iCs/>
+        </w:rPr>
+        <w:t>A</w:t>
+      </w:r>
+      <w:r>
+        <w:rPr>
+          <w:rFonts w:ascii="Times New Roman" w:cs="Times New Roman" w:eastAsia="Times New Roman" w:hAnsi="Times New Roman"/>
+          <w:iCs/>
+        </w:rPr>
+        <w:t xml:space="preserve">ᵘ · </w:t>
+      </w:r>
+      <w:r>
+        <w:rPr>
+          <w:rFonts w:ascii="Times New Roman" w:cs="Times New Roman" w:eastAsia="Times New Roman" w:hAnsi="Times New Roman"/>
+          <w:i/>
+          <w:iCs/>
+        </w:rPr>
+        <w:t>β</w:t>
+      </w:r>
+      <w:r>
+        <w:rPr>
+          <w:rFonts w:ascii="Times New Roman" w:cs="Times New Roman" w:eastAsia="Times New Roman" w:hAnsi="Times New Roman"/>
+          <w:iCs/>
+        </w:rPr>
+        <w:t xml:space="preserve"> / </w:t>
+      </w:r>
+      <w:r>
+        <w:rPr>
+          <w:rFonts w:ascii="Times New Roman" w:cs="Times New Roman" w:eastAsia="Times New Roman" w:hAnsi="Times New Roman"/>
+          <w:i/>
+          <w:iCs/>
+        </w:rPr>
+        <w:t>k</w:t>
+      </w:r>
+      <w:r>
+        <w:rPr>
+          <w:rFonts w:ascii="Times New Roman" w:cs="Times New Roman" w:eastAsia="Times New Roman" w:hAnsi="Times New Roman"/>
+          <w:iCs/>
+        </w:rPr>
+        <w:t>.          (5)</w:t>
       </w:r>
     </w:p>
     <w:p>
@@ -6267,7 +7788,7 @@
         <w:rPr>
           <w:rFonts w:ascii="Times New Roman" w:cs="Times New Roman" w:eastAsia="Times New Roman" w:hAnsi="Times New Roman"/>
         </w:rPr>
-        <w:t xml:space="preserve"> = 5.7, the value more favorable to detection. Table 5 reports the coefficient per standard deviation that complete assimilation would produce under equation (3) for a range of acquisition rates and substitution effects, alongside the minimum detectable effect and the observed coefficients.</w:t>
+        <w:t xml:space="preserve"> = 5.7, the value more favorable to detection. Table 5 reports the coefficient per standard deviation that complete assimilation would produce under equation (5) for a range of acquisition rates and substitution effects, alongside the minimum detectable effect and the observed coefficients.</w:t>
       </w:r>
     </w:p>
     <w:p>
@@ -7265,7 +8786,7 @@
         <w:rPr>
           <w:rFonts w:ascii="Times New Roman" w:cs="Times New Roman" w:eastAsia="Times New Roman" w:hAnsi="Times New Roman"/>
         </w:rPr>
-        <w:t xml:space="preserve">Equation (3) also tells us when the European design would gain the power to detect complete assimilation. Holding the 2024 standard error fixed, detection for an occupation at </w:t>
+        <w:t xml:space="preserve">Equation (5) also tells us when the European design would gain the power to detect complete assimilation. Holding the 2024 standard error fixed, detection for an occupation at </w:t>
       </w:r>
       <w:r>
         <w:rPr>
@@ -8835,6 +10356,1236 @@
       <w:r>
         <w:rPr>
           <w:rFonts w:ascii="Times New Roman" w:cs="Times New Roman" w:eastAsia="Times New Roman" w:hAnsi="Times New Roman"/>
+          <w:bCs/>
+          <w:color w:val="000000"/>
+          <w:sz w:val="26"/>
+          <w:szCs w:val="26"/>
+        </w:rPr>
+        <w:t>Appendix C. Derivations for Section 3</w:t>
+      </w:r>
+    </w:p>
+    <w:p>
+      <w:pPr>
+        <w:spacing w:after="160" w:line="276"/>
+        <w:jc w:val="both"/>
+      </w:pPr>
+      <w:r>
+        <w:rPr>
+          <w:rFonts w:ascii="Times New Roman" w:cs="Times New Roman" w:eastAsia="Times New Roman" w:hAnsi="Times New Roman"/>
+          <w:b/>
+        </w:rPr>
+        <w:t>Labor and cost ratios.</w:t>
+      </w:r>
+      <w:r>
+        <w:rPr>
+          <w:rFonts w:ascii="Times New Roman" w:cs="Times New Roman" w:eastAsia="Times New Roman" w:hAnsi="Times New Roman"/>
+        </w:rPr>
+        <w:t xml:space="preserve"> Human production of a unit takes </w:t>
+      </w:r>
+      <w:r>
+        <w:rPr>
+          <w:rFonts w:ascii="Times New Roman" w:cs="Times New Roman" w:eastAsia="Times New Roman" w:hAnsi="Times New Roman"/>
+          <w:i/>
+        </w:rPr>
+        <w:t>h</w:t>
+      </w:r>
+      <w:r>
+        <w:rPr>
+          <w:rFonts w:ascii="Times New Roman" w:cs="Times New Roman" w:eastAsia="Times New Roman" w:hAnsi="Times New Roman"/>
+        </w:rPr>
+        <w:t xml:space="preserve"> hours. With the generator, a unit requires </w:t>
+      </w:r>
+      <w:r>
+        <w:rPr>
+          <w:rFonts w:ascii="Times New Roman" w:cs="Times New Roman" w:eastAsia="Times New Roman" w:hAnsi="Times New Roman"/>
+          <w:i/>
+        </w:rPr>
+        <w:t>u</w:t>
+      </w:r>
+      <w:r>
+        <w:rPr>
+          <w:rFonts w:ascii="Times New Roman" w:cs="Times New Roman" w:eastAsia="Times New Roman" w:hAnsi="Times New Roman"/>
+        </w:rPr>
+        <w:t xml:space="preserve"> hours of review and, with probability 1 − </w:t>
+      </w:r>
+      <w:r>
+        <w:rPr>
+          <w:rFonts w:ascii="Times New Roman" w:cs="Times New Roman" w:eastAsia="Times New Roman" w:hAnsi="Times New Roman"/>
+          <w:i/>
+        </w:rPr>
+        <w:t>a</w:t>
+      </w:r>
+      <w:r>
+        <w:rPr>
+          <w:rFonts w:ascii="Times New Roman" w:cs="Times New Roman" w:eastAsia="Times New Roman" w:hAnsi="Times New Roman"/>
+        </w:rPr>
+        <w:t xml:space="preserve">, </w:t>
+      </w:r>
+      <w:r>
+        <w:rPr>
+          <w:rFonts w:ascii="Times New Roman" w:cs="Times New Roman" w:eastAsia="Times New Roman" w:hAnsi="Times New Roman"/>
+          <w:i/>
+        </w:rPr>
+        <w:t>h</w:t>
+      </w:r>
+      <w:r>
+        <w:rPr>
+          <w:rFonts w:ascii="Times New Roman" w:cs="Times New Roman" w:eastAsia="Times New Roman" w:hAnsi="Times New Roman"/>
+        </w:rPr>
+        <w:t xml:space="preserve"> hours of human production, so expected labor per unit is </w:t>
+      </w:r>
+      <w:r>
+        <w:rPr>
+          <w:rFonts w:ascii="Times New Roman" w:cs="Times New Roman" w:eastAsia="Times New Roman" w:hAnsi="Times New Roman"/>
+          <w:i/>
+        </w:rPr>
+        <w:t>u</w:t>
+      </w:r>
+      <w:r>
+        <w:rPr>
+          <w:rFonts w:ascii="Times New Roman" w:cs="Times New Roman" w:eastAsia="Times New Roman" w:hAnsi="Times New Roman"/>
+        </w:rPr>
+        <w:t xml:space="preserve"> + (1 − </w:t>
+      </w:r>
+      <w:r>
+        <w:rPr>
+          <w:rFonts w:ascii="Times New Roman" w:cs="Times New Roman" w:eastAsia="Times New Roman" w:hAnsi="Times New Roman"/>
+          <w:i/>
+        </w:rPr>
+        <w:t>a</w:t>
+      </w:r>
+      <w:r>
+        <w:rPr>
+          <w:rFonts w:ascii="Times New Roman" w:cs="Times New Roman" w:eastAsia="Times New Roman" w:hAnsi="Times New Roman"/>
+        </w:rPr>
+        <w:t>)</w:t>
+      </w:r>
+      <w:r>
+        <w:rPr>
+          <w:rFonts w:ascii="Times New Roman" w:cs="Times New Roman" w:eastAsia="Times New Roman" w:hAnsi="Times New Roman"/>
+          <w:i/>
+        </w:rPr>
+        <w:t>h</w:t>
+      </w:r>
+      <w:r>
+        <w:rPr>
+          <w:rFonts w:ascii="Times New Roman" w:cs="Times New Roman" w:eastAsia="Times New Roman" w:hAnsi="Times New Roman"/>
+        </w:rPr>
+        <w:t xml:space="preserve"> = </w:t>
+      </w:r>
+      <w:r>
+        <w:rPr>
+          <w:rFonts w:ascii="Times New Roman" w:cs="Times New Roman" w:eastAsia="Times New Roman" w:hAnsi="Times New Roman"/>
+          <w:i/>
+        </w:rPr>
+        <w:t>h</w:t>
+      </w:r>
+      <w:r>
+        <w:rPr>
+          <w:rFonts w:ascii="Times New Roman" w:cs="Times New Roman" w:eastAsia="Times New Roman" w:hAnsi="Times New Roman"/>
+        </w:rPr>
+        <w:t>(</w:t>
+      </w:r>
+      <w:r>
+        <w:rPr>
+          <w:rFonts w:ascii="Times New Roman" w:cs="Times New Roman" w:eastAsia="Times New Roman" w:hAnsi="Times New Roman"/>
+          <w:i/>
+        </w:rPr>
+        <w:t>ρ</w:t>
+      </w:r>
+      <w:r>
+        <w:rPr>
+          <w:rFonts w:ascii="Times New Roman" w:cs="Times New Roman" w:eastAsia="Times New Roman" w:hAnsi="Times New Roman"/>
+        </w:rPr>
+        <w:t xml:space="preserve"> + 1 − </w:t>
+      </w:r>
+      <w:r>
+        <w:rPr>
+          <w:rFonts w:ascii="Times New Roman" w:cs="Times New Roman" w:eastAsia="Times New Roman" w:hAnsi="Times New Roman"/>
+          <w:i/>
+        </w:rPr>
+        <w:t>a</w:t>
+      </w:r>
+      <w:r>
+        <w:rPr>
+          <w:rFonts w:ascii="Times New Roman" w:cs="Times New Roman" w:eastAsia="Times New Roman" w:hAnsi="Times New Roman"/>
+        </w:rPr>
+        <w:t xml:space="preserve">) with </w:t>
+      </w:r>
+      <w:r>
+        <w:rPr>
+          <w:rFonts w:ascii="Times New Roman" w:cs="Times New Roman" w:eastAsia="Times New Roman" w:hAnsi="Times New Roman"/>
+          <w:i/>
+        </w:rPr>
+        <w:t>ρ</w:t>
+      </w:r>
+      <w:r>
+        <w:rPr>
+          <w:rFonts w:ascii="Times New Roman" w:cs="Times New Roman" w:eastAsia="Times New Roman" w:hAnsi="Times New Roman"/>
+        </w:rPr>
+        <w:t xml:space="preserve"> = </w:t>
+      </w:r>
+      <w:r>
+        <w:rPr>
+          <w:rFonts w:ascii="Times New Roman" w:cs="Times New Roman" w:eastAsia="Times New Roman" w:hAnsi="Times New Roman"/>
+          <w:i/>
+        </w:rPr>
+        <w:t>u</w:t>
+      </w:r>
+      <w:r>
+        <w:rPr>
+          <w:rFonts w:ascii="Times New Roman" w:cs="Times New Roman" w:eastAsia="Times New Roman" w:hAnsi="Times New Roman"/>
+        </w:rPr>
+        <w:t>/</w:t>
+      </w:r>
+      <w:r>
+        <w:rPr>
+          <w:rFonts w:ascii="Times New Roman" w:cs="Times New Roman" w:eastAsia="Times New Roman" w:hAnsi="Times New Roman"/>
+          <w:i/>
+        </w:rPr>
+        <w:t>h</w:t>
+      </w:r>
+      <w:r>
+        <w:rPr>
+          <w:rFonts w:ascii="Times New Roman" w:cs="Times New Roman" w:eastAsia="Times New Roman" w:hAnsi="Times New Roman"/>
+        </w:rPr>
+        <w:t xml:space="preserve"> = </w:t>
+      </w:r>
+      <w:r>
+        <w:rPr>
+          <w:rFonts w:ascii="Times New Roman" w:cs="Times New Roman" w:eastAsia="Times New Roman" w:hAnsi="Times New Roman"/>
+          <w:i/>
+        </w:rPr>
+        <w:t>r</w:t>
+      </w:r>
+      <w:r>
+        <w:rPr>
+          <w:rFonts w:ascii="Times New Roman" w:cs="Times New Roman" w:eastAsia="Times New Roman" w:hAnsi="Times New Roman"/>
+        </w:rPr>
+        <w:t>/</w:t>
+      </w:r>
+      <w:r>
+        <w:rPr>
+          <w:rFonts w:ascii="Times New Roman" w:cs="Times New Roman" w:eastAsia="Times New Roman" w:hAnsi="Times New Roman"/>
+          <w:i/>
+        </w:rPr>
+        <w:t>θ</w:t>
+      </w:r>
+      <w:r>
+        <w:rPr>
+          <w:rFonts w:ascii="Times New Roman" w:cs="Times New Roman" w:eastAsia="Times New Roman" w:hAnsi="Times New Roman"/>
+        </w:rPr>
+        <w:t xml:space="preserve"> at equal wages. Expected cost per unit is </w:t>
+      </w:r>
+      <w:r>
+        <w:rPr>
+          <w:rFonts w:ascii="Times New Roman" w:cs="Times New Roman" w:eastAsia="Times New Roman" w:hAnsi="Times New Roman"/>
+          <w:i/>
+        </w:rPr>
+        <w:t>c</w:t>
+      </w:r>
+      <w:r>
+        <w:rPr>
+          <w:rFonts w:ascii="Times New Roman" w:cs="Times New Roman" w:eastAsia="Times New Roman" w:hAnsi="Times New Roman"/>
+        </w:rPr>
+        <w:t xml:space="preserve"> + </w:t>
+      </w:r>
+      <w:r>
+        <w:rPr>
+          <w:rFonts w:ascii="Times New Roman" w:cs="Times New Roman" w:eastAsia="Times New Roman" w:hAnsi="Times New Roman"/>
+          <w:i/>
+        </w:rPr>
+        <w:t>r</w:t>
+      </w:r>
+      <w:r>
+        <w:rPr>
+          <w:rFonts w:ascii="Times New Roman" w:cs="Times New Roman" w:eastAsia="Times New Roman" w:hAnsi="Times New Roman"/>
+        </w:rPr>
+        <w:t xml:space="preserve"> + (1 − </w:t>
+      </w:r>
+      <w:r>
+        <w:rPr>
+          <w:rFonts w:ascii="Times New Roman" w:cs="Times New Roman" w:eastAsia="Times New Roman" w:hAnsi="Times New Roman"/>
+          <w:i/>
+        </w:rPr>
+        <w:t>a</w:t>
+      </w:r>
+      <w:r>
+        <w:rPr>
+          <w:rFonts w:ascii="Times New Roman" w:cs="Times New Roman" w:eastAsia="Times New Roman" w:hAnsi="Times New Roman"/>
+        </w:rPr>
+        <w:t>)</w:t>
+      </w:r>
+      <w:r>
+        <w:rPr>
+          <w:rFonts w:ascii="Times New Roman" w:cs="Times New Roman" w:eastAsia="Times New Roman" w:hAnsi="Times New Roman"/>
+          <w:i/>
+        </w:rPr>
+        <w:t>θ</w:t>
+      </w:r>
+      <w:r>
+        <w:rPr>
+          <w:rFonts w:ascii="Times New Roman" w:cs="Times New Roman" w:eastAsia="Times New Roman" w:hAnsi="Times New Roman"/>
+        </w:rPr>
+        <w:t xml:space="preserve"> = </w:t>
+      </w:r>
+      <w:r>
+        <w:rPr>
+          <w:rFonts w:ascii="Times New Roman" w:cs="Times New Roman" w:eastAsia="Times New Roman" w:hAnsi="Times New Roman"/>
+          <w:i/>
+        </w:rPr>
+        <w:t>θκ</w:t>
+      </w:r>
+      <w:r>
+        <w:rPr>
+          <w:rFonts w:ascii="Times New Roman" w:cs="Times New Roman" w:eastAsia="Times New Roman" w:hAnsi="Times New Roman"/>
+        </w:rPr>
+        <w:t xml:space="preserve">. Output scales by </w:t>
+      </w:r>
+      <w:r>
+        <w:rPr>
+          <w:rFonts w:ascii="Times New Roman" w:cs="Times New Roman" w:eastAsia="Times New Roman" w:hAnsi="Times New Roman"/>
+          <w:i/>
+        </w:rPr>
+        <w:t>κ</w:t>
+      </w:r>
+      <w:r>
+        <w:rPr>
+          <w:rFonts w:ascii="Times New Roman" w:cs="Times New Roman" w:eastAsia="Times New Roman" w:hAnsi="Times New Roman"/>
+        </w:rPr>
+        <w:t>^(−</w:t>
+      </w:r>
+      <w:r>
+        <w:rPr>
+          <w:rFonts w:ascii="Times New Roman" w:cs="Times New Roman" w:eastAsia="Times New Roman" w:hAnsi="Times New Roman"/>
+          <w:i/>
+        </w:rPr>
+        <w:t>ε</w:t>
+      </w:r>
+      <w:r>
+        <w:rPr>
+          <w:rFonts w:ascii="Times New Roman" w:cs="Times New Roman" w:eastAsia="Times New Roman" w:hAnsi="Times New Roman"/>
+        </w:rPr>
+        <w:t xml:space="preserve">) under constant elasticity </w:t>
+      </w:r>
+      <w:r>
+        <w:rPr>
+          <w:rFonts w:ascii="Times New Roman" w:cs="Times New Roman" w:eastAsia="Times New Roman" w:hAnsi="Times New Roman"/>
+          <w:i/>
+        </w:rPr>
+        <w:t>ε</w:t>
+      </w:r>
+      <w:r>
+        <w:rPr>
+          <w:rFonts w:ascii="Times New Roman" w:cs="Times New Roman" w:eastAsia="Times New Roman" w:hAnsi="Times New Roman"/>
+        </w:rPr>
+        <w:t xml:space="preserve">, so labor demand scales by (1 − </w:t>
+      </w:r>
+      <w:r>
+        <w:rPr>
+          <w:rFonts w:ascii="Times New Roman" w:cs="Times New Roman" w:eastAsia="Times New Roman" w:hAnsi="Times New Roman"/>
+          <w:i/>
+        </w:rPr>
+        <w:t>a</w:t>
+      </w:r>
+      <w:r>
+        <w:rPr>
+          <w:rFonts w:ascii="Times New Roman" w:cs="Times New Roman" w:eastAsia="Times New Roman" w:hAnsi="Times New Roman"/>
+        </w:rPr>
+        <w:t xml:space="preserve"> + </w:t>
+      </w:r>
+      <w:r>
+        <w:rPr>
+          <w:rFonts w:ascii="Times New Roman" w:cs="Times New Roman" w:eastAsia="Times New Roman" w:hAnsi="Times New Roman"/>
+          <w:i/>
+        </w:rPr>
+        <w:t>ρ</w:t>
+      </w:r>
+      <w:r>
+        <w:rPr>
+          <w:rFonts w:ascii="Times New Roman" w:cs="Times New Roman" w:eastAsia="Times New Roman" w:hAnsi="Times New Roman"/>
+        </w:rPr>
+        <w:t>)</w:t>
+      </w:r>
+      <w:r>
+        <w:rPr>
+          <w:rFonts w:ascii="Times New Roman" w:cs="Times New Roman" w:eastAsia="Times New Roman" w:hAnsi="Times New Roman"/>
+          <w:i/>
+        </w:rPr>
+        <w:t>κ</w:t>
+      </w:r>
+      <w:r>
+        <w:rPr>
+          <w:rFonts w:ascii="Times New Roman" w:cs="Times New Roman" w:eastAsia="Times New Roman" w:hAnsi="Times New Roman"/>
+        </w:rPr>
+        <w:t>^(−</w:t>
+      </w:r>
+      <w:r>
+        <w:rPr>
+          <w:rFonts w:ascii="Times New Roman" w:cs="Times New Roman" w:eastAsia="Times New Roman" w:hAnsi="Times New Roman"/>
+          <w:i/>
+        </w:rPr>
+        <w:t>ε</w:t>
+      </w:r>
+      <w:r>
+        <w:rPr>
+          <w:rFonts w:ascii="Times New Roman" w:cs="Times New Roman" w:eastAsia="Times New Roman" w:hAnsi="Times New Roman"/>
+        </w:rPr>
+        <w:t>), which gives equation (3) after taking logarithms.</w:t>
+      </w:r>
+    </w:p>
+    <w:p>
+      <w:pPr>
+        <w:spacing w:after="160" w:line="276"/>
+        <w:jc w:val="both"/>
+      </w:pPr>
+      <w:r>
+        <w:rPr>
+          <w:rFonts w:ascii="Times New Roman" w:cs="Times New Roman" w:eastAsia="Times New Roman" w:hAnsi="Times New Roman"/>
+          <w:b/>
+        </w:rPr>
+        <w:t>Proposition 2.</w:t>
+      </w:r>
+      <w:r>
+        <w:rPr>
+          <w:rFonts w:ascii="Times New Roman" w:cs="Times New Roman" w:eastAsia="Times New Roman" w:hAnsi="Times New Roman"/>
+        </w:rPr>
+        <w:t xml:space="preserve"> </w:t>
+      </w:r>
+      <w:r>
+        <w:rPr>
+          <w:rFonts w:ascii="Times New Roman" w:cs="Times New Roman" w:eastAsia="Times New Roman" w:hAnsi="Times New Roman"/>
+          <w:i/>
+        </w:rPr>
+        <w:t>β</w:t>
+      </w:r>
+      <w:r>
+        <w:rPr>
+          <w:rFonts w:ascii="Times New Roman" w:cs="Times New Roman" w:eastAsia="Times New Roman" w:hAnsi="Times New Roman"/>
+        </w:rPr>
+        <w:t xml:space="preserve"> &lt; 0 if and only if ln(1 − </w:t>
+      </w:r>
+      <w:r>
+        <w:rPr>
+          <w:rFonts w:ascii="Times New Roman" w:cs="Times New Roman" w:eastAsia="Times New Roman" w:hAnsi="Times New Roman"/>
+          <w:i/>
+        </w:rPr>
+        <w:t>a</w:t>
+      </w:r>
+      <w:r>
+        <w:rPr>
+          <w:rFonts w:ascii="Times New Roman" w:cs="Times New Roman" w:eastAsia="Times New Roman" w:hAnsi="Times New Roman"/>
+        </w:rPr>
+        <w:t xml:space="preserve"> + </w:t>
+      </w:r>
+      <w:r>
+        <w:rPr>
+          <w:rFonts w:ascii="Times New Roman" w:cs="Times New Roman" w:eastAsia="Times New Roman" w:hAnsi="Times New Roman"/>
+          <w:i/>
+        </w:rPr>
+        <w:t>ρ</w:t>
+      </w:r>
+      <w:r>
+        <w:rPr>
+          <w:rFonts w:ascii="Times New Roman" w:cs="Times New Roman" w:eastAsia="Times New Roman" w:hAnsi="Times New Roman"/>
+        </w:rPr>
+        <w:t xml:space="preserve">) &lt; </w:t>
+      </w:r>
+      <w:r>
+        <w:rPr>
+          <w:rFonts w:ascii="Times New Roman" w:cs="Times New Roman" w:eastAsia="Times New Roman" w:hAnsi="Times New Roman"/>
+          <w:i/>
+        </w:rPr>
+        <w:t>ε</w:t>
+      </w:r>
+      <w:r>
+        <w:rPr>
+          <w:rFonts w:ascii="Times New Roman" w:cs="Times New Roman" w:eastAsia="Times New Roman" w:hAnsi="Times New Roman"/>
+        </w:rPr>
+        <w:t xml:space="preserve"> ln </w:t>
+      </w:r>
+      <w:r>
+        <w:rPr>
+          <w:rFonts w:ascii="Times New Roman" w:cs="Times New Roman" w:eastAsia="Times New Roman" w:hAnsi="Times New Roman"/>
+          <w:i/>
+        </w:rPr>
+        <w:t>κ</w:t>
+      </w:r>
+      <w:r>
+        <w:rPr>
+          <w:rFonts w:ascii="Times New Roman" w:cs="Times New Roman" w:eastAsia="Times New Roman" w:hAnsi="Times New Roman"/>
+        </w:rPr>
+        <w:t xml:space="preserve">. When </w:t>
+      </w:r>
+      <w:r>
+        <w:rPr>
+          <w:rFonts w:ascii="Times New Roman" w:cs="Times New Roman" w:eastAsia="Times New Roman" w:hAnsi="Times New Roman"/>
+          <w:i/>
+        </w:rPr>
+        <w:t>γ</w:t>
+      </w:r>
+      <w:r>
+        <w:rPr>
+          <w:rFonts w:ascii="Times New Roman" w:cs="Times New Roman" w:eastAsia="Times New Roman" w:hAnsi="Times New Roman"/>
+        </w:rPr>
+        <w:t xml:space="preserve"> &gt; 0 and </w:t>
+      </w:r>
+      <w:r>
+        <w:rPr>
+          <w:rFonts w:ascii="Times New Roman" w:cs="Times New Roman" w:eastAsia="Times New Roman" w:hAnsi="Times New Roman"/>
+          <w:i/>
+        </w:rPr>
+        <w:t>a</w:t>
+      </w:r>
+      <w:r>
+        <w:rPr>
+          <w:rFonts w:ascii="Times New Roman" w:cs="Times New Roman" w:eastAsia="Times New Roman" w:hAnsi="Times New Roman"/>
+        </w:rPr>
+        <w:t xml:space="preserve"> &gt; </w:t>
+      </w:r>
+      <w:r>
+        <w:rPr>
+          <w:rFonts w:ascii="Times New Roman" w:cs="Times New Roman" w:eastAsia="Times New Roman" w:hAnsi="Times New Roman"/>
+          <w:i/>
+        </w:rPr>
+        <w:t>a</w:t>
+      </w:r>
+      <w:r>
+        <w:rPr>
+          <w:rFonts w:ascii="Times New Roman" w:cs="Times New Roman" w:eastAsia="Times New Roman" w:hAnsi="Times New Roman"/>
+        </w:rPr>
+        <w:t xml:space="preserve">*, 1 − </w:t>
+      </w:r>
+      <w:r>
+        <w:rPr>
+          <w:rFonts w:ascii="Times New Roman" w:cs="Times New Roman" w:eastAsia="Times New Roman" w:hAnsi="Times New Roman"/>
+          <w:i/>
+        </w:rPr>
+        <w:t>a</w:t>
+      </w:r>
+      <w:r>
+        <w:rPr>
+          <w:rFonts w:ascii="Times New Roman" w:cs="Times New Roman" w:eastAsia="Times New Roman" w:hAnsi="Times New Roman"/>
+        </w:rPr>
+        <w:t xml:space="preserve"> + </w:t>
+      </w:r>
+      <w:r>
+        <w:rPr>
+          <w:rFonts w:ascii="Times New Roman" w:cs="Times New Roman" w:eastAsia="Times New Roman" w:hAnsi="Times New Roman"/>
+          <w:i/>
+        </w:rPr>
+        <w:t>ρ</w:t>
+      </w:r>
+      <w:r>
+        <w:rPr>
+          <w:rFonts w:ascii="Times New Roman" w:cs="Times New Roman" w:eastAsia="Times New Roman" w:hAnsi="Times New Roman"/>
+        </w:rPr>
+        <w:t xml:space="preserve"> &lt; </w:t>
+      </w:r>
+      <w:r>
+        <w:rPr>
+          <w:rFonts w:ascii="Times New Roman" w:cs="Times New Roman" w:eastAsia="Times New Roman" w:hAnsi="Times New Roman"/>
+          <w:i/>
+        </w:rPr>
+        <w:t>κ</w:t>
+      </w:r>
+      <w:r>
+        <w:rPr>
+          <w:rFonts w:ascii="Times New Roman" w:cs="Times New Roman" w:eastAsia="Times New Roman" w:hAnsi="Times New Roman"/>
+        </w:rPr>
+        <w:t xml:space="preserve"> &lt; 1, so both logarithms are negative and |ln(1 − </w:t>
+      </w:r>
+      <w:r>
+        <w:rPr>
+          <w:rFonts w:ascii="Times New Roman" w:cs="Times New Roman" w:eastAsia="Times New Roman" w:hAnsi="Times New Roman"/>
+          <w:i/>
+        </w:rPr>
+        <w:t>a</w:t>
+      </w:r>
+      <w:r>
+        <w:rPr>
+          <w:rFonts w:ascii="Times New Roman" w:cs="Times New Roman" w:eastAsia="Times New Roman" w:hAnsi="Times New Roman"/>
+        </w:rPr>
+        <w:t xml:space="preserve"> + </w:t>
+      </w:r>
+      <w:r>
+        <w:rPr>
+          <w:rFonts w:ascii="Times New Roman" w:cs="Times New Roman" w:eastAsia="Times New Roman" w:hAnsi="Times New Roman"/>
+          <w:i/>
+        </w:rPr>
+        <w:t>ρ</w:t>
+      </w:r>
+      <w:r>
+        <w:rPr>
+          <w:rFonts w:ascii="Times New Roman" w:cs="Times New Roman" w:eastAsia="Times New Roman" w:hAnsi="Times New Roman"/>
+        </w:rPr>
+        <w:t xml:space="preserve">)| &gt; |ln </w:t>
+      </w:r>
+      <w:r>
+        <w:rPr>
+          <w:rFonts w:ascii="Times New Roman" w:cs="Times New Roman" w:eastAsia="Times New Roman" w:hAnsi="Times New Roman"/>
+          <w:i/>
+        </w:rPr>
+        <w:t>κ</w:t>
+      </w:r>
+      <w:r>
+        <w:rPr>
+          <w:rFonts w:ascii="Times New Roman" w:cs="Times New Roman" w:eastAsia="Times New Roman" w:hAnsi="Times New Roman"/>
+        </w:rPr>
+        <w:t xml:space="preserve">|. Dividing by ln </w:t>
+      </w:r>
+      <w:r>
+        <w:rPr>
+          <w:rFonts w:ascii="Times New Roman" w:cs="Times New Roman" w:eastAsia="Times New Roman" w:hAnsi="Times New Roman"/>
+          <w:i/>
+        </w:rPr>
+        <w:t>κ</w:t>
+      </w:r>
+      <w:r>
+        <w:rPr>
+          <w:rFonts w:ascii="Times New Roman" w:cs="Times New Roman" w:eastAsia="Times New Roman" w:hAnsi="Times New Roman"/>
+        </w:rPr>
+        <w:t xml:space="preserve"> reverses the inequality: </w:t>
+      </w:r>
+      <w:r>
+        <w:rPr>
+          <w:rFonts w:ascii="Times New Roman" w:cs="Times New Roman" w:eastAsia="Times New Roman" w:hAnsi="Times New Roman"/>
+          <w:i/>
+        </w:rPr>
+        <w:t>β</w:t>
+      </w:r>
+      <w:r>
+        <w:rPr>
+          <w:rFonts w:ascii="Times New Roman" w:cs="Times New Roman" w:eastAsia="Times New Roman" w:hAnsi="Times New Roman"/>
+        </w:rPr>
+        <w:t xml:space="preserve"> &lt; 0 if and only if </w:t>
+      </w:r>
+      <w:r>
+        <w:rPr>
+          <w:rFonts w:ascii="Times New Roman" w:cs="Times New Roman" w:eastAsia="Times New Roman" w:hAnsi="Times New Roman"/>
+          <w:i/>
+        </w:rPr>
+        <w:t>ε</w:t>
+      </w:r>
+      <w:r>
+        <w:rPr>
+          <w:rFonts w:ascii="Times New Roman" w:cs="Times New Roman" w:eastAsia="Times New Roman" w:hAnsi="Times New Roman"/>
+        </w:rPr>
+        <w:t xml:space="preserve"> &lt; </w:t>
+      </w:r>
+      <w:r>
+        <w:rPr>
+          <w:rFonts w:ascii="Times New Roman" w:cs="Times New Roman" w:eastAsia="Times New Roman" w:hAnsi="Times New Roman"/>
+          <w:i/>
+        </w:rPr>
+        <w:t>ε</w:t>
+      </w:r>
+      <w:r>
+        <w:rPr>
+          <w:rFonts w:ascii="Times New Roman" w:cs="Times New Roman" w:eastAsia="Times New Roman" w:hAnsi="Times New Roman"/>
+        </w:rPr>
+        <w:t xml:space="preserve">* = ln(1 − </w:t>
+      </w:r>
+      <w:r>
+        <w:rPr>
+          <w:rFonts w:ascii="Times New Roman" w:cs="Times New Roman" w:eastAsia="Times New Roman" w:hAnsi="Times New Roman"/>
+          <w:i/>
+        </w:rPr>
+        <w:t>a</w:t>
+      </w:r>
+      <w:r>
+        <w:rPr>
+          <w:rFonts w:ascii="Times New Roman" w:cs="Times New Roman" w:eastAsia="Times New Roman" w:hAnsi="Times New Roman"/>
+        </w:rPr>
+        <w:t xml:space="preserve"> + </w:t>
+      </w:r>
+      <w:r>
+        <w:rPr>
+          <w:rFonts w:ascii="Times New Roman" w:cs="Times New Roman" w:eastAsia="Times New Roman" w:hAnsi="Times New Roman"/>
+          <w:i/>
+        </w:rPr>
+        <w:t>ρ</w:t>
+      </w:r>
+      <w:r>
+        <w:rPr>
+          <w:rFonts w:ascii="Times New Roman" w:cs="Times New Roman" w:eastAsia="Times New Roman" w:hAnsi="Times New Roman"/>
+        </w:rPr>
+        <w:t xml:space="preserve">) / ln </w:t>
+      </w:r>
+      <w:r>
+        <w:rPr>
+          <w:rFonts w:ascii="Times New Roman" w:cs="Times New Roman" w:eastAsia="Times New Roman" w:hAnsi="Times New Roman"/>
+          <w:i/>
+        </w:rPr>
+        <w:t>κ</w:t>
+      </w:r>
+      <w:r>
+        <w:rPr>
+          <w:rFonts w:ascii="Times New Roman" w:cs="Times New Roman" w:eastAsia="Times New Roman" w:hAnsi="Times New Roman"/>
+        </w:rPr>
+        <w:t xml:space="preserve">, and </w:t>
+      </w:r>
+      <w:r>
+        <w:rPr>
+          <w:rFonts w:ascii="Times New Roman" w:cs="Times New Roman" w:eastAsia="Times New Roman" w:hAnsi="Times New Roman"/>
+          <w:i/>
+        </w:rPr>
+        <w:t>ε</w:t>
+      </w:r>
+      <w:r>
+        <w:rPr>
+          <w:rFonts w:ascii="Times New Roman" w:cs="Times New Roman" w:eastAsia="Times New Roman" w:hAnsi="Times New Roman"/>
+        </w:rPr>
+        <w:t xml:space="preserve">* &gt; 1. As </w:t>
+      </w:r>
+      <w:r>
+        <w:rPr>
+          <w:rFonts w:ascii="Times New Roman" w:cs="Times New Roman" w:eastAsia="Times New Roman" w:hAnsi="Times New Roman"/>
+          <w:i/>
+        </w:rPr>
+        <w:t>γ</w:t>
+      </w:r>
+      <w:r>
+        <w:rPr>
+          <w:rFonts w:ascii="Times New Roman" w:cs="Times New Roman" w:eastAsia="Times New Roman" w:hAnsi="Times New Roman"/>
+        </w:rPr>
+        <w:t xml:space="preserve"> → 0, </w:t>
+      </w:r>
+      <w:r>
+        <w:rPr>
+          <w:rFonts w:ascii="Times New Roman" w:cs="Times New Roman" w:eastAsia="Times New Roman" w:hAnsi="Times New Roman"/>
+          <w:i/>
+        </w:rPr>
+        <w:t>κ</w:t>
+      </w:r>
+      <w:r>
+        <w:rPr>
+          <w:rFonts w:ascii="Times New Roman" w:cs="Times New Roman" w:eastAsia="Times New Roman" w:hAnsi="Times New Roman"/>
+        </w:rPr>
+        <w:t xml:space="preserve"> → 1 − </w:t>
+      </w:r>
+      <w:r>
+        <w:rPr>
+          <w:rFonts w:ascii="Times New Roman" w:cs="Times New Roman" w:eastAsia="Times New Roman" w:hAnsi="Times New Roman"/>
+          <w:i/>
+        </w:rPr>
+        <w:t>a</w:t>
+      </w:r>
+      <w:r>
+        <w:rPr>
+          <w:rFonts w:ascii="Times New Roman" w:cs="Times New Roman" w:eastAsia="Times New Roman" w:hAnsi="Times New Roman"/>
+        </w:rPr>
+        <w:t xml:space="preserve"> + </w:t>
+      </w:r>
+      <w:r>
+        <w:rPr>
+          <w:rFonts w:ascii="Times New Roman" w:cs="Times New Roman" w:eastAsia="Times New Roman" w:hAnsi="Times New Roman"/>
+          <w:i/>
+        </w:rPr>
+        <w:t>ρ</w:t>
+      </w:r>
+      <w:r>
+        <w:rPr>
+          <w:rFonts w:ascii="Times New Roman" w:cs="Times New Roman" w:eastAsia="Times New Roman" w:hAnsi="Times New Roman"/>
+        </w:rPr>
+        <w:t xml:space="preserve"> and </w:t>
+      </w:r>
+      <w:r>
+        <w:rPr>
+          <w:rFonts w:ascii="Times New Roman" w:cs="Times New Roman" w:eastAsia="Times New Roman" w:hAnsi="Times New Roman"/>
+          <w:i/>
+        </w:rPr>
+        <w:t>ε</w:t>
+      </w:r>
+      <w:r>
+        <w:rPr>
+          <w:rFonts w:ascii="Times New Roman" w:cs="Times New Roman" w:eastAsia="Times New Roman" w:hAnsi="Times New Roman"/>
+        </w:rPr>
+        <w:t>* → 1.</w:t>
+      </w:r>
+    </w:p>
+    <w:p>
+      <w:pPr>
+        <w:spacing w:after="160" w:line="276"/>
+        <w:jc w:val="both"/>
+      </w:pPr>
+      <w:r>
+        <w:rPr>
+          <w:rFonts w:ascii="Times New Roman" w:cs="Times New Roman" w:eastAsia="Times New Roman" w:hAnsi="Times New Roman"/>
+          <w:b/>
+        </w:rPr>
+        <w:t>Proposition 3.</w:t>
+      </w:r>
+      <w:r>
+        <w:rPr>
+          <w:rFonts w:ascii="Times New Roman" w:cs="Times New Roman" w:eastAsia="Times New Roman" w:hAnsi="Times New Roman"/>
+        </w:rPr>
+        <w:t xml:space="preserve"> Substituting equation (4) into the employment equation gives </w:t>
+      </w:r>
+      <w:r>
+        <w:rPr>
+          <w:rFonts w:ascii="Times New Roman" w:cs="Times New Roman" w:eastAsia="Times New Roman" w:hAnsi="Times New Roman"/>
+          <w:i/>
+        </w:rPr>
+        <w:t>L</w:t>
+      </w:r>
+      <w:r>
+        <w:rPr>
+          <w:rFonts w:ascii="Times New Roman" w:cs="Times New Roman" w:eastAsia="Times New Roman" w:hAnsi="Times New Roman"/>
+        </w:rPr>
+        <w:t xml:space="preserve">(t + 1) − </w:t>
+      </w:r>
+      <w:r>
+        <w:rPr>
+          <w:rFonts w:ascii="Times New Roman" w:cs="Times New Roman" w:eastAsia="Times New Roman" w:hAnsi="Times New Roman"/>
+          <w:i/>
+        </w:rPr>
+        <w:t>L</w:t>
+      </w:r>
+      <w:r>
+        <w:rPr>
+          <w:rFonts w:ascii="Times New Roman" w:cs="Times New Roman" w:eastAsia="Times New Roman" w:hAnsi="Times New Roman"/>
+        </w:rPr>
+        <w:t xml:space="preserve">* = (1 − </w:t>
+      </w:r>
+      <w:r>
+        <w:rPr>
+          <w:rFonts w:ascii="Times New Roman" w:cs="Times New Roman" w:eastAsia="Times New Roman" w:hAnsi="Times New Roman"/>
+          <w:i/>
+        </w:rPr>
+        <w:t>λ</w:t>
+      </w:r>
+      <w:r>
+        <w:rPr>
+          <w:rFonts w:ascii="Times New Roman" w:cs="Times New Roman" w:eastAsia="Times New Roman" w:hAnsi="Times New Roman"/>
+        </w:rPr>
+        <w:t>)(</w:t>
+      </w:r>
+      <w:r>
+        <w:rPr>
+          <w:rFonts w:ascii="Times New Roman" w:cs="Times New Roman" w:eastAsia="Times New Roman" w:hAnsi="Times New Roman"/>
+          <w:i/>
+        </w:rPr>
+        <w:t>L</w:t>
+      </w:r>
+      <w:r>
+        <w:rPr>
+          <w:rFonts w:ascii="Times New Roman" w:cs="Times New Roman" w:eastAsia="Times New Roman" w:hAnsi="Times New Roman"/>
+        </w:rPr>
+        <w:t xml:space="preserve">(t) − </w:t>
+      </w:r>
+      <w:r>
+        <w:rPr>
+          <w:rFonts w:ascii="Times New Roman" w:cs="Times New Roman" w:eastAsia="Times New Roman" w:hAnsi="Times New Roman"/>
+          <w:i/>
+        </w:rPr>
+        <w:t>L</w:t>
+      </w:r>
+      <w:r>
+        <w:rPr>
+          <w:rFonts w:ascii="Times New Roman" w:cs="Times New Roman" w:eastAsia="Times New Roman" w:hAnsi="Times New Roman"/>
+        </w:rPr>
+        <w:t xml:space="preserve">*), so </w:t>
+      </w:r>
+      <w:r>
+        <w:rPr>
+          <w:rFonts w:ascii="Times New Roman" w:cs="Times New Roman" w:eastAsia="Times New Roman" w:hAnsi="Times New Roman"/>
+          <w:i/>
+        </w:rPr>
+        <w:t>L</w:t>
+      </w:r>
+      <w:r>
+        <w:rPr>
+          <w:rFonts w:ascii="Times New Roman" w:cs="Times New Roman" w:eastAsia="Times New Roman" w:hAnsi="Times New Roman"/>
+        </w:rPr>
+        <w:t xml:space="preserve">(t) − </w:t>
+      </w:r>
+      <w:r>
+        <w:rPr>
+          <w:rFonts w:ascii="Times New Roman" w:cs="Times New Roman" w:eastAsia="Times New Roman" w:hAnsi="Times New Roman"/>
+          <w:i/>
+        </w:rPr>
+        <w:t>L</w:t>
+      </w:r>
+      <w:r>
+        <w:rPr>
+          <w:rFonts w:ascii="Times New Roman" w:cs="Times New Roman" w:eastAsia="Times New Roman" w:hAnsi="Times New Roman"/>
+        </w:rPr>
+        <w:t xml:space="preserve">* = (1 − </w:t>
+      </w:r>
+      <w:r>
+        <w:rPr>
+          <w:rFonts w:ascii="Times New Roman" w:cs="Times New Roman" w:eastAsia="Times New Roman" w:hAnsi="Times New Roman"/>
+          <w:i/>
+        </w:rPr>
+        <w:t>λ</w:t>
+      </w:r>
+      <w:r>
+        <w:rPr>
+          <w:rFonts w:ascii="Times New Roman" w:cs="Times New Roman" w:eastAsia="Times New Roman" w:hAnsi="Times New Roman"/>
+        </w:rPr>
+        <w:t>)^</w:t>
+      </w:r>
+      <w:r>
+        <w:rPr>
+          <w:rFonts w:ascii="Times New Roman" w:cs="Times New Roman" w:eastAsia="Times New Roman" w:hAnsi="Times New Roman"/>
+          <w:i/>
+        </w:rPr>
+        <w:t>t</w:t>
+      </w:r>
+      <w:r>
+        <w:rPr>
+          <w:rFonts w:ascii="Times New Roman" w:cs="Times New Roman" w:eastAsia="Times New Roman" w:hAnsi="Times New Roman"/>
+        </w:rPr>
+        <w:t xml:space="preserve"> (</w:t>
+      </w:r>
+      <w:r>
+        <w:rPr>
+          <w:rFonts w:ascii="Times New Roman" w:cs="Times New Roman" w:eastAsia="Times New Roman" w:hAnsi="Times New Roman"/>
+          <w:i/>
+        </w:rPr>
+        <w:t>L</w:t>
+      </w:r>
+      <w:r>
+        <w:rPr>
+          <w:rFonts w:ascii="Times New Roman" w:cs="Times New Roman" w:eastAsia="Times New Roman" w:hAnsi="Times New Roman"/>
+        </w:rPr>
+        <w:t xml:space="preserve">₀ − </w:t>
+      </w:r>
+      <w:r>
+        <w:rPr>
+          <w:rFonts w:ascii="Times New Roman" w:cs="Times New Roman" w:eastAsia="Times New Roman" w:hAnsi="Times New Roman"/>
+          <w:i/>
+        </w:rPr>
+        <w:t>L</w:t>
+      </w:r>
+      <w:r>
+        <w:rPr>
+          <w:rFonts w:ascii="Times New Roman" w:cs="Times New Roman" w:eastAsia="Times New Roman" w:hAnsi="Times New Roman"/>
+        </w:rPr>
+        <w:t xml:space="preserve">*) and the share of the gap closed after </w:t>
+      </w:r>
+      <w:r>
+        <w:rPr>
+          <w:rFonts w:ascii="Times New Roman" w:cs="Times New Roman" w:eastAsia="Times New Roman" w:hAnsi="Times New Roman"/>
+          <w:i/>
+        </w:rPr>
+        <w:t>T</w:t>
+      </w:r>
+      <w:r>
+        <w:rPr>
+          <w:rFonts w:ascii="Times New Roman" w:cs="Times New Roman" w:eastAsia="Times New Roman" w:hAnsi="Times New Roman"/>
+        </w:rPr>
+        <w:t xml:space="preserve"> periods is 1 − (1 − </w:t>
+      </w:r>
+      <w:r>
+        <w:rPr>
+          <w:rFonts w:ascii="Times New Roman" w:cs="Times New Roman" w:eastAsia="Times New Roman" w:hAnsi="Times New Roman"/>
+          <w:i/>
+        </w:rPr>
+        <w:t>λ</w:t>
+      </w:r>
+      <w:r>
+        <w:rPr>
+          <w:rFonts w:ascii="Times New Roman" w:cs="Times New Roman" w:eastAsia="Times New Roman" w:hAnsi="Times New Roman"/>
+        </w:rPr>
+        <w:t>)^</w:t>
+      </w:r>
+      <w:r>
+        <w:rPr>
+          <w:rFonts w:ascii="Times New Roman" w:cs="Times New Roman" w:eastAsia="Times New Roman" w:hAnsi="Times New Roman"/>
+          <w:i/>
+        </w:rPr>
+        <w:t>T</w:t>
+      </w:r>
+      <w:r>
+        <w:rPr>
+          <w:rFonts w:ascii="Times New Roman" w:cs="Times New Roman" w:eastAsia="Times New Roman" w:hAnsi="Times New Roman"/>
+        </w:rPr>
+        <w:t xml:space="preserve">. Hires in the first period are </w:t>
+      </w:r>
+      <w:r>
+        <w:rPr>
+          <w:rFonts w:ascii="Times New Roman" w:cs="Times New Roman" w:eastAsia="Times New Roman" w:hAnsi="Times New Roman"/>
+          <w:i/>
+        </w:rPr>
+        <w:t>H</w:t>
+      </w:r>
+      <w:r>
+        <w:rPr>
+          <w:rFonts w:ascii="Times New Roman" w:cs="Times New Roman" w:eastAsia="Times New Roman" w:hAnsi="Times New Roman"/>
+        </w:rPr>
+        <w:t xml:space="preserve">(0) = </w:t>
+      </w:r>
+      <w:r>
+        <w:rPr>
+          <w:rFonts w:ascii="Times New Roman" w:cs="Times New Roman" w:eastAsia="Times New Roman" w:hAnsi="Times New Roman"/>
+          <w:i/>
+        </w:rPr>
+        <w:t>δL</w:t>
+      </w:r>
+      <w:r>
+        <w:rPr>
+          <w:rFonts w:ascii="Times New Roman" w:cs="Times New Roman" w:eastAsia="Times New Roman" w:hAnsi="Times New Roman"/>
+        </w:rPr>
+        <w:t xml:space="preserve">₀ − </w:t>
+      </w:r>
+      <w:r>
+        <w:rPr>
+          <w:rFonts w:ascii="Times New Roman" w:cs="Times New Roman" w:eastAsia="Times New Roman" w:hAnsi="Times New Roman"/>
+          <w:i/>
+        </w:rPr>
+        <w:t>λfL</w:t>
+      </w:r>
+      <w:r>
+        <w:rPr>
+          <w:rFonts w:ascii="Times New Roman" w:cs="Times New Roman" w:eastAsia="Times New Roman" w:hAnsi="Times New Roman"/>
+        </w:rPr>
+        <w:t xml:space="preserve">₀, so </w:t>
+      </w:r>
+      <w:r>
+        <w:rPr>
+          <w:rFonts w:ascii="Times New Roman" w:cs="Times New Roman" w:eastAsia="Times New Roman" w:hAnsi="Times New Roman"/>
+          <w:i/>
+        </w:rPr>
+        <w:t>H</w:t>
+      </w:r>
+      <w:r>
+        <w:rPr>
+          <w:rFonts w:ascii="Times New Roman" w:cs="Times New Roman" w:eastAsia="Times New Roman" w:hAnsi="Times New Roman"/>
+        </w:rPr>
+        <w:t>(0)/(</w:t>
+      </w:r>
+      <w:r>
+        <w:rPr>
+          <w:rFonts w:ascii="Times New Roman" w:cs="Times New Roman" w:eastAsia="Times New Roman" w:hAnsi="Times New Roman"/>
+          <w:i/>
+        </w:rPr>
+        <w:t>δL</w:t>
+      </w:r>
+      <w:r>
+        <w:rPr>
+          <w:rFonts w:ascii="Times New Roman" w:cs="Times New Roman" w:eastAsia="Times New Roman" w:hAnsi="Times New Roman"/>
+        </w:rPr>
+        <w:t>₀) = 1 − (</w:t>
+      </w:r>
+      <w:r>
+        <w:rPr>
+          <w:rFonts w:ascii="Times New Roman" w:cs="Times New Roman" w:eastAsia="Times New Roman" w:hAnsi="Times New Roman"/>
+          <w:i/>
+        </w:rPr>
+        <w:t>λ</w:t>
+      </w:r>
+      <w:r>
+        <w:rPr>
+          <w:rFonts w:ascii="Times New Roman" w:cs="Times New Roman" w:eastAsia="Times New Roman" w:hAnsi="Times New Roman"/>
+        </w:rPr>
+        <w:t>/</w:t>
+      </w:r>
+      <w:r>
+        <w:rPr>
+          <w:rFonts w:ascii="Times New Roman" w:cs="Times New Roman" w:eastAsia="Times New Roman" w:hAnsi="Times New Roman"/>
+          <w:i/>
+        </w:rPr>
+        <w:t>δ</w:t>
+      </w:r>
+      <w:r>
+        <w:rPr>
+          <w:rFonts w:ascii="Times New Roman" w:cs="Times New Roman" w:eastAsia="Times New Roman" w:hAnsi="Times New Roman"/>
+        </w:rPr>
+        <w:t>)</w:t>
+      </w:r>
+      <w:r>
+        <w:rPr>
+          <w:rFonts w:ascii="Times New Roman" w:cs="Times New Roman" w:eastAsia="Times New Roman" w:hAnsi="Times New Roman"/>
+          <w:i/>
+        </w:rPr>
+        <w:t>f</w:t>
+      </w:r>
+      <w:r>
+        <w:rPr>
+          <w:rFonts w:ascii="Times New Roman" w:cs="Times New Roman" w:eastAsia="Times New Roman" w:hAnsi="Times New Roman"/>
+        </w:rPr>
+        <w:t xml:space="preserve">. As </w:t>
+      </w:r>
+      <w:r>
+        <w:rPr>
+          <w:rFonts w:ascii="Times New Roman" w:cs="Times New Roman" w:eastAsia="Times New Roman" w:hAnsi="Times New Roman"/>
+          <w:i/>
+        </w:rPr>
+        <w:t>t</w:t>
+      </w:r>
+      <w:r>
+        <w:rPr>
+          <w:rFonts w:ascii="Times New Roman" w:cs="Times New Roman" w:eastAsia="Times New Roman" w:hAnsi="Times New Roman"/>
+        </w:rPr>
+        <w:t xml:space="preserve"> → ∞, </w:t>
+      </w:r>
+      <w:r>
+        <w:rPr>
+          <w:rFonts w:ascii="Times New Roman" w:cs="Times New Roman" w:eastAsia="Times New Roman" w:hAnsi="Times New Roman"/>
+          <w:i/>
+        </w:rPr>
+        <w:t>L</w:t>
+      </w:r>
+      <w:r>
+        <w:rPr>
+          <w:rFonts w:ascii="Times New Roman" w:cs="Times New Roman" w:eastAsia="Times New Roman" w:hAnsi="Times New Roman"/>
+        </w:rPr>
+        <w:t xml:space="preserve">(t) → </w:t>
+      </w:r>
+      <w:r>
+        <w:rPr>
+          <w:rFonts w:ascii="Times New Roman" w:cs="Times New Roman" w:eastAsia="Times New Roman" w:hAnsi="Times New Roman"/>
+          <w:i/>
+        </w:rPr>
+        <w:t>L</w:t>
+      </w:r>
+      <w:r>
+        <w:rPr>
+          <w:rFonts w:ascii="Times New Roman" w:cs="Times New Roman" w:eastAsia="Times New Roman" w:hAnsi="Times New Roman"/>
+        </w:rPr>
+        <w:t xml:space="preserve">* and </w:t>
+      </w:r>
+      <w:r>
+        <w:rPr>
+          <w:rFonts w:ascii="Times New Roman" w:cs="Times New Roman" w:eastAsia="Times New Roman" w:hAnsi="Times New Roman"/>
+          <w:i/>
+        </w:rPr>
+        <w:t>H</w:t>
+      </w:r>
+      <w:r>
+        <w:rPr>
+          <w:rFonts w:ascii="Times New Roman" w:cs="Times New Roman" w:eastAsia="Times New Roman" w:hAnsi="Times New Roman"/>
+        </w:rPr>
+        <w:t xml:space="preserve">(t) → </w:t>
+      </w:r>
+      <w:r>
+        <w:rPr>
+          <w:rFonts w:ascii="Times New Roman" w:cs="Times New Roman" w:eastAsia="Times New Roman" w:hAnsi="Times New Roman"/>
+          <w:i/>
+        </w:rPr>
+        <w:t>δL</w:t>
+      </w:r>
+      <w:r>
+        <w:rPr>
+          <w:rFonts w:ascii="Times New Roman" w:cs="Times New Roman" w:eastAsia="Times New Roman" w:hAnsi="Times New Roman"/>
+        </w:rPr>
+        <w:t xml:space="preserve">*, so </w:t>
+      </w:r>
+      <w:r>
+        <w:rPr>
+          <w:rFonts w:ascii="Times New Roman" w:cs="Times New Roman" w:eastAsia="Times New Roman" w:hAnsi="Times New Roman"/>
+          <w:i/>
+        </w:rPr>
+        <w:t>H</w:t>
+      </w:r>
+      <w:r>
+        <w:rPr>
+          <w:rFonts w:ascii="Times New Roman" w:cs="Times New Roman" w:eastAsia="Times New Roman" w:hAnsi="Times New Roman"/>
+        </w:rPr>
+        <w:t>(t)/(</w:t>
+      </w:r>
+      <w:r>
+        <w:rPr>
+          <w:rFonts w:ascii="Times New Roman" w:cs="Times New Roman" w:eastAsia="Times New Roman" w:hAnsi="Times New Roman"/>
+          <w:i/>
+        </w:rPr>
+        <w:t>δL</w:t>
+      </w:r>
+      <w:r>
+        <w:rPr>
+          <w:rFonts w:ascii="Times New Roman" w:cs="Times New Roman" w:eastAsia="Times New Roman" w:hAnsi="Times New Roman"/>
+        </w:rPr>
+        <w:t xml:space="preserve">₀) → 1 − </w:t>
+      </w:r>
+      <w:r>
+        <w:rPr>
+          <w:rFonts w:ascii="Times New Roman" w:cs="Times New Roman" w:eastAsia="Times New Roman" w:hAnsi="Times New Roman"/>
+          <w:i/>
+        </w:rPr>
+        <w:t>f</w:t>
+      </w:r>
+      <w:r>
+        <w:rPr>
+          <w:rFonts w:ascii="Times New Roman" w:cs="Times New Roman" w:eastAsia="Times New Roman" w:hAnsi="Times New Roman"/>
+        </w:rPr>
+        <w:t xml:space="preserve">. Hires are non-negative in every period when </w:t>
+      </w:r>
+      <w:r>
+        <w:rPr>
+          <w:rFonts w:ascii="Times New Roman" w:cs="Times New Roman" w:eastAsia="Times New Roman" w:hAnsi="Times New Roman"/>
+          <w:i/>
+        </w:rPr>
+        <w:t>λ</w:t>
+      </w:r>
+      <w:r>
+        <w:rPr>
+          <w:rFonts w:ascii="Times New Roman" w:cs="Times New Roman" w:eastAsia="Times New Roman" w:hAnsi="Times New Roman"/>
+        </w:rPr>
+        <w:t xml:space="preserve"> ≤ </w:t>
+      </w:r>
+      <w:r>
+        <w:rPr>
+          <w:rFonts w:ascii="Times New Roman" w:cs="Times New Roman" w:eastAsia="Times New Roman" w:hAnsi="Times New Roman"/>
+          <w:i/>
+        </w:rPr>
+        <w:t>δ</w:t>
+      </w:r>
+      <w:r>
+        <w:rPr>
+          <w:rFonts w:ascii="Times New Roman" w:cs="Times New Roman" w:eastAsia="Times New Roman" w:hAnsi="Times New Roman"/>
+        </w:rPr>
+        <w:t xml:space="preserve">, because </w:t>
+      </w:r>
+      <w:r>
+        <w:rPr>
+          <w:rFonts w:ascii="Times New Roman" w:cs="Times New Roman" w:eastAsia="Times New Roman" w:hAnsi="Times New Roman"/>
+          <w:i/>
+        </w:rPr>
+        <w:t>λf</w:t>
+      </w:r>
+      <w:r>
+        <w:rPr>
+          <w:rFonts w:ascii="Times New Roman" w:cs="Times New Roman" w:eastAsia="Times New Roman" w:hAnsi="Times New Roman"/>
+        </w:rPr>
+        <w:t xml:space="preserve"> ≤ </w:t>
+      </w:r>
+      <w:r>
+        <w:rPr>
+          <w:rFonts w:ascii="Times New Roman" w:cs="Times New Roman" w:eastAsia="Times New Roman" w:hAnsi="Times New Roman"/>
+          <w:i/>
+        </w:rPr>
+        <w:t>δ</w:t>
+      </w:r>
+      <w:r>
+        <w:rPr>
+          <w:rFonts w:ascii="Times New Roman" w:cs="Times New Roman" w:eastAsia="Times New Roman" w:hAnsi="Times New Roman"/>
+        </w:rPr>
+        <w:t xml:space="preserve"> for </w:t>
+      </w:r>
+      <w:r>
+        <w:rPr>
+          <w:rFonts w:ascii="Times New Roman" w:cs="Times New Roman" w:eastAsia="Times New Roman" w:hAnsi="Times New Roman"/>
+          <w:i/>
+        </w:rPr>
+        <w:t>f</w:t>
+      </w:r>
+      <w:r>
+        <w:rPr>
+          <w:rFonts w:ascii="Times New Roman" w:cs="Times New Roman" w:eastAsia="Times New Roman" w:hAnsi="Times New Roman"/>
+        </w:rPr>
+        <w:t xml:space="preserve"> ≤ 1. The upper bound in part (i) holds when hiring is adjusted smoothly as in equation (4); a temporary hiring freeze could produce a larger transitory fall in adverts.</w:t>
+      </w:r>
+    </w:p>
+    <w:p>
+      <w:pPr>
+        <w:pStyle w:val="Heading1"/>
+        <w:spacing w:after="160" w:before="360"/>
+      </w:pPr>
+      <w:r>
+        <w:rPr>
+          <w:rFonts w:ascii="Times New Roman" w:cs="Times New Roman" w:eastAsia="Times New Roman" w:hAnsi="Times New Roman"/>
           <w:b/>
           <w:bCs/>
           <w:color w:val="000000"/>
@@ -8887,6 +11638,99 @@
           <w:sz w:val="21"/>
           <w:szCs w:val="21"/>
         </w:rPr>
+        <w:t xml:space="preserve">Acemoglu, D., and Restrepo, P. 2018. The race between man and machine: Implications of technology for growth, factor shares, and employment. </w:t>
+      </w:r>
+      <w:r>
+        <w:rPr>
+          <w:rFonts w:ascii="Times New Roman" w:cs="Times New Roman" w:eastAsia="Times New Roman" w:hAnsi="Times New Roman"/>
+          <w:i/>
+          <w:sz w:val="21"/>
+          <w:szCs w:val="21"/>
+        </w:rPr>
+        <w:t>American Economic Review</w:t>
+      </w:r>
+      <w:r>
+        <w:rPr>
+          <w:rFonts w:ascii="Times New Roman" w:cs="Times New Roman" w:eastAsia="Times New Roman" w:hAnsi="Times New Roman"/>
+          <w:sz w:val="21"/>
+          <w:szCs w:val="21"/>
+        </w:rPr>
+        <w:t xml:space="preserve"> 108(6):1488–1542.</w:t>
+      </w:r>
+    </w:p>
+    <w:p>
+      <w:pPr>
+        <w:spacing w:after="100"/>
+        <w:ind w:left="360" w:hanging="360"/>
+      </w:pPr>
+      <w:r>
+        <w:rPr>
+          <w:rFonts w:ascii="Times New Roman" w:cs="Times New Roman" w:eastAsia="Times New Roman" w:hAnsi="Times New Roman"/>
+          <w:sz w:val="21"/>
+          <w:szCs w:val="21"/>
+        </w:rPr>
+        <w:t xml:space="preserve">Acemoglu, D., and Restrepo, P. 2019. Automation and new tasks: How technology displaces and reinstates labor. </w:t>
+      </w:r>
+      <w:r>
+        <w:rPr>
+          <w:rFonts w:ascii="Times New Roman" w:cs="Times New Roman" w:eastAsia="Times New Roman" w:hAnsi="Times New Roman"/>
+          <w:i/>
+          <w:sz w:val="21"/>
+          <w:szCs w:val="21"/>
+        </w:rPr>
+        <w:t>Journal of Economic Perspectives</w:t>
+      </w:r>
+      <w:r>
+        <w:rPr>
+          <w:rFonts w:ascii="Times New Roman" w:cs="Times New Roman" w:eastAsia="Times New Roman" w:hAnsi="Times New Roman"/>
+          <w:sz w:val="21"/>
+          <w:szCs w:val="21"/>
+        </w:rPr>
+        <w:t xml:space="preserve"> 33(2):3–30.</w:t>
+      </w:r>
+    </w:p>
+    <w:p>
+      <w:pPr>
+        <w:spacing w:after="100"/>
+        <w:ind w:left="360" w:hanging="360"/>
+      </w:pPr>
+      <w:r>
+        <w:rPr>
+          <w:rFonts w:ascii="Times New Roman" w:cs="Times New Roman" w:eastAsia="Times New Roman" w:hAnsi="Times New Roman"/>
+          <w:sz w:val="21"/>
+          <w:szCs w:val="21"/>
+        </w:rPr>
+        <w:t xml:space="preserve">Aghion, P., Jones, B. F., and Jones, C. I. 2019. Artificial intelligence and economic growth. In </w:t>
+      </w:r>
+      <w:r>
+        <w:rPr>
+          <w:rFonts w:ascii="Times New Roman" w:cs="Times New Roman" w:eastAsia="Times New Roman" w:hAnsi="Times New Roman"/>
+          <w:i/>
+          <w:sz w:val="21"/>
+          <w:szCs w:val="21"/>
+        </w:rPr>
+        <w:t>The Economics of Artificial Intelligence: An Agenda</w:t>
+      </w:r>
+      <w:r>
+        <w:rPr>
+          <w:rFonts w:ascii="Times New Roman" w:cs="Times New Roman" w:eastAsia="Times New Roman" w:hAnsi="Times New Roman"/>
+          <w:sz w:val="21"/>
+          <w:szCs w:val="21"/>
+        </w:rPr>
+        <w:t>, edited by A. Agrawal, J. Gans, and A. Goldfarb. Chicago: University of Chicago Press.</w:t>
+      </w:r>
+    </w:p>
+    <w:p>
+      <w:pPr>
+        <w:spacing w:after="100"/>
+        <w:ind w:left="360" w:hanging="360"/>
+      </w:pPr>
+      <w:r>
+        <w:rPr>
+          <w:rFonts w:ascii="Times New Roman" w:cs="Times New Roman" w:eastAsia="Times New Roman" w:hAnsi="Times New Roman"/>
+          <w:sz w:val="21"/>
+          <w:szCs w:val="21"/>
+        </w:rPr>
         <w:t xml:space="preserve">Agrawal, A., Gans, J., and Goldfarb, A. 2018. </w:t>
       </w:r>
       <w:r>
@@ -8970,6 +11814,37 @@
           <w:szCs w:val="21"/>
         </w:rPr>
         <w:t xml:space="preserve"> 3(1):1–19.</w:t>
+      </w:r>
+    </w:p>
+    <w:p>
+      <w:pPr>
+        <w:spacing w:after="100"/>
+        <w:ind w:left="360" w:hanging="360"/>
+      </w:pPr>
+      <w:r>
+        <w:rPr>
+          <w:rFonts w:ascii="Times New Roman" w:cs="Times New Roman" w:eastAsia="Times New Roman" w:hAnsi="Times New Roman"/>
+          <w:sz w:val="21"/>
+          <w:szCs w:val="21"/>
+        </w:rPr>
+        <w:t xml:space="preserve">Baumol, W. J. 1967. Macroeconomics of unbalanced growth: The anatomy of urban crisis. </w:t>
+      </w:r>
+      <w:r>
+        <w:rPr>
+          <w:rFonts w:ascii="Times New Roman" w:cs="Times New Roman" w:eastAsia="Times New Roman" w:hAnsi="Times New Roman"/>
+          <w:i/>
+          <w:sz w:val="21"/>
+          <w:szCs w:val="21"/>
+        </w:rPr>
+        <w:t>American Economic Review</w:t>
+      </w:r>
+      <w:r>
+        <w:rPr>
+          <w:rFonts w:ascii="Times New Roman" w:cs="Times New Roman" w:eastAsia="Times New Roman" w:hAnsi="Times New Roman"/>
+          <w:sz w:val="21"/>
+          <w:szCs w:val="21"/>
+        </w:rPr>
+        <w:t xml:space="preserve"> 57(3):415–426.</w:t>
       </w:r>
     </w:p>
     <w:p>

</xml_diff>

<commit_message>
Add sector-level acquisition-employment test (Europe LFS, US BTOS) as proxy for firm-level link
Co-Authored-By: Claude Sonnet 5.5 <noreply@anthropic.com>
Claude-Session: https://claude.ai/code/session_01H4JvRLBkzRHsy6jU5TcEWv
</commit_message>
<xml_diff>
--- a/isr_paper/revised/Acquired_Not_Yet_Assimilated_ISR.docx
+++ b/isr_paper/revised/Acquired_Not_Yet_Assimilated_ISR.docx
@@ -8762,6 +8762,73 @@
     </w:p>
     <w:p>
       <w:pPr>
+        <w:pStyle w:val="Heading2"/>
+        <w:spacing w:after="120" w:before="280"/>
+      </w:pPr>
+      <w:r>
+        <w:rPr>
+          <w:rFonts w:ascii="Times New Roman" w:cs="Times New Roman" w:eastAsia="Times New Roman" w:hAnsi="Times New Roman"/>
+          <w:bCs/>
+          <w:color w:val="000000"/>
+          <w:sz w:val="24"/>
+          <w:szCs w:val="24"/>
+        </w:rPr>
+        <w:t>7.5 Sector-Level Acquisition and Employment</w:t>
+      </w:r>
+    </w:p>
+    <w:p>
+      <w:pPr>
+        <w:spacing w:after="160" w:line="276"/>
+        <w:jc w:val="both"/>
+      </w:pPr>
+      <w:r>
+        <w:rPr>
+          <w:rFonts w:ascii="Times New Roman" w:cs="Times New Roman" w:eastAsia="Times New Roman" w:hAnsi="Times New Roman"/>
+        </w:rPr>
+        <w:t xml:space="preserve">Firm-level links between use and hiring are not public, so we use sectors as the nearest proxy. In 260 country-sector cells (30 countries, 9 NACE sections), sectors with higher acquisition of picture, video, or audio generation in 2025 had higher employment growth between 2019–2021 and 2023–2025: 0.051 log points per standard deviation of acquisition (10.6 percentage points), with country fixed effects (standard error 0.010). The same relationship holds before the technology: for 2016–2018 to 2019–2021 the coefficient is 0.049 (0.008), and the difference between the two periods is 0.002 (0.012). Acquisition is not a separate signal here, because it correlates 0.92 with acquisition of text generation and 0.95 with use of any AI across cells; adding the text-generation control leaves a post-minus-pre difference of 0.041 (0.020), which is imprecise because of this collinearity. In the United States, the sector share of businesses reporting AI use in the Business Trends and Outlook Survey correlates 0.59 across 20 sectors with the sector’s reported employee-change index (descriptive only). Complete assimilation with </w:t>
+      </w:r>
+      <w:r>
+        <w:rPr>
+          <w:rFonts w:ascii="Times New Roman" w:cs="Times New Roman" w:eastAsia="Times New Roman" w:hAnsi="Times New Roman"/>
+          <w:i/>
+        </w:rPr>
+        <w:t>β</w:t>
+      </w:r>
+      <w:r>
+        <w:rPr>
+          <w:rFonts w:ascii="Times New Roman" w:cs="Times New Roman" w:eastAsia="Times New Roman" w:hAnsi="Times New Roman"/>
+        </w:rPr>
+        <w:t xml:space="preserve"> = −0.5 would imply a coefficient of about −0.053 times </w:t>
+      </w:r>
+      <w:r>
+        <w:rPr>
+          <w:rFonts w:ascii="Times New Roman" w:cs="Times New Roman" w:eastAsia="Times New Roman" w:hAnsi="Times New Roman"/>
+          <w:i/>
+        </w:rPr>
+        <w:t>s</w:t>
+      </w:r>
+      <w:r>
+        <w:rPr>
+          <w:rFonts w:ascii="Times New Roman" w:cs="Times New Roman" w:eastAsia="Times New Roman" w:hAnsi="Times New Roman"/>
+        </w:rPr>
+        <w:t xml:space="preserve">, the share of sector employment in visual-production occupations, per standard deviation of acquisition. Because </w:t>
+      </w:r>
+      <w:r>
+        <w:rPr>
+          <w:rFonts w:ascii="Times New Roman" w:cs="Times New Roman" w:eastAsia="Times New Roman" w:hAnsi="Times New Roman"/>
+          <w:i/>
+        </w:rPr>
+        <w:t>s</w:t>
+      </w:r>
+      <w:r>
+        <w:rPr>
+          <w:rFonts w:ascii="Times New Roman" w:cs="Times New Roman" w:eastAsia="Times New Roman" w:hAnsi="Times New Roman"/>
+        </w:rPr>
+        <w:t xml:space="preserve"> is well below one, the implied effect is far smaller than the standard errors. Sector-level data therefore show that acquisition marks growing, digitally intensive sectors, not that it displaces labor, and they cannot reveal the assimilation margin; this is the limit that firm-level data would remove.</w:t>
+      </w:r>
+    </w:p>
+    <w:p>
+      <w:pPr>
         <w:pStyle w:val="Heading1"/>
         <w:spacing w:after="160" w:before="360"/>
       </w:pPr>
@@ -9869,7 +9936,7 @@
         <w:rPr>
           <w:rFonts w:ascii="Times New Roman" w:cs="Times New Roman" w:eastAsia="Times New Roman" w:hAnsi="Times New Roman"/>
         </w:rPr>
-        <w:t>All data are public (Eurostat, Statistics Canada, O*NET, Indeed Hiring Lab). Code, prompts, task scores, and human coding files required to reproduce the tables are available in an anonymized replication repository. Large language models were used as measurement instruments to code task statements. A generative AI assistant was used to help write analysis code and to draft and edit the manuscript. The authors reviewed all results, text, and code and take responsibility for the content.</w:t>
+        <w:t>All data are public (Eurostat, Statistics Canada, U.S. Census Bureau, O*NET, Indeed Hiring Lab). Code, prompts, task scores, and human coding files required to reproduce the tables are available in an anonymized replication repository. Large language models were used as measurement instruments to code task statements. A generative AI assistant was used to help write analysis code and to draft and edit the manuscript. The authors reviewed all results, text, and code and take responsibility for the content.</w:t>
       </w:r>
     </w:p>
     <w:p>
@@ -12299,6 +12366,20 @@
           <w:szCs w:val="21"/>
         </w:rPr>
         <w:t xml:space="preserve">Statistics Canada. Job vacancies by occupation, table 14-10-0444; NOC 2021. Statistics Canada Open Licence.</w:t>
+      </w:r>
+    </w:p>
+    <w:p>
+      <w:pPr>
+        <w:spacing w:after="100"/>
+        <w:ind w:left="360" w:hanging="360"/>
+      </w:pPr>
+      <w:r>
+        <w:rPr>
+          <w:rFonts w:ascii="Times New Roman" w:cs="Times New Roman" w:eastAsia="Times New Roman" w:hAnsi="Times New Roman"/>
+          <w:sz w:val="21"/>
+          <w:szCs w:val="21"/>
+        </w:rPr>
+        <w:t>U.S. Census Bureau. Business Trends and Outlook Survey (BTOS), sector estimates. Public-use tables.</w:t>
       </w:r>
     </w:p>
     <w:p>

</xml_diff>

<commit_message>
Add macroeconomic reading to Discussion (new 10.2) and limitation note
Co-Authored-By: Claude Sonnet 5.5 <noreply@anthropic.com>
Claude-Session: https://claude.ai/code/session_01H4JvRLBkzRHsy6jU5TcEWv
</commit_message>
<xml_diff>
--- a/isr_paper/revised/Acquired_Not_Yet_Assimilated_ISR.docx
+++ b/isr_paper/revised/Acquired_Not_Yet_Assimilated_ISR.docx
@@ -9831,13 +9831,12 @@
       <w:r>
         <w:rPr>
           <w:rFonts w:ascii="Times New Roman" w:cs="Times New Roman" w:eastAsia="Times New Roman" w:hAnsi="Times New Roman"/>
-          <w:b/>
           <w:bCs/>
           <w:color w:val="000000"/>
           <w:sz w:val="24"/>
           <w:szCs w:val="24"/>
         </w:rPr>
-        <w:t xml:space="preserve">10.2 Implications</w:t>
+        <w:t>10.2 A Macroeconomic Reading</w:t>
       </w:r>
     </w:p>
     <w:p>
@@ -9849,7 +9848,31 @@
         <w:rPr>
           <w:rFonts w:ascii="Times New Roman" w:cs="Times New Roman" w:eastAsia="Times New Roman" w:hAnsi="Times New Roman"/>
         </w:rPr>
-        <w:t xml:space="preserve">For researchers, the implication is to report the acquisition rate and reference effect size that an exposure estimate would require, and to treat estimates that exceed that requirement, or that predate the technology, as evidence about something else. For managers, the barrier evidence suggests that the constraints on using generative visual tools are organizational: review capacity and policies for copyright and personal data are complements to the tool, and waiting for better models will not build them. For statistical agencies and policymakers, a rising use indicator should not be read as rising task reassignment, and a small hiring response should not be read as evidence that the response will remain small. Adding questions on task reassignment and on review and compliance practices to enterprise surveys would make the gap directly measurable.</w:t>
+        <w:t>The results fit a standard macroeconomic account of technology shocks. General-purpose technologies take effect only after complementary investments in organization and skills, so adoption can run ahead of measured effects (David 1990; Bresnahan and Trajtenberg 1995; Brynjolfsson, Rock, and Syverson 2021). The task-based framework (Acemoglu and Restrepo 2018, 2019) splits the labor-market effect of a technology into displacement, reinstatement, and productivity components, and equation (3) shows that the net effect on an occupation depends on how much review labor remains and on how elastic demand for visual output is. Because review is a bottleneck task (Baumol 1967), better generation alone does not remove the labor that review requires, and the complements that govern assimilation also govern how much labor assimilation saves.</w:t>
+      </w:r>
+    </w:p>
+    <w:p>
+      <w:pPr>
+        <w:spacing w:after="160" w:line="276"/>
+        <w:jc w:val="both"/>
+      </w:pPr>
+      <w:r>
+        <w:rPr>
+          <w:rFonts w:ascii="Times New Roman" w:cs="Times New Roman" w:eastAsia="Times New Roman" w:hAnsi="Times New Roman"/>
+        </w:rPr>
+        <w:t>Two features of labor adjustment shape what data can show. Employers reduce workforces mainly through attrition, so hiring falls first and employment follows at the pace of separations (Proposition 3). Employment series can therefore show no contraction for years after assimilation begins, and an observed fall does not by itself identify the technology. Technology also often accelerates change already under way, such as the movement of labor out of industries in structural decline, which enters the model as an earlier and lower target employment. The usual macroeconomic expectation is that technology shocks appear as reallocation across tasks, occupations, and industries before they appear in aggregate employment. We study occupations and sectors, not aggregates, and say nothing about unemployment or aggregate productivity.</w:t>
+      </w:r>
+    </w:p>
+    <w:p>
+      <w:pPr>
+        <w:spacing w:after="160" w:line="276"/>
+        <w:jc w:val="both"/>
+      </w:pPr>
+      <w:r>
+        <w:rPr>
+          <w:rFonts w:ascii="Times New Roman" w:cs="Times New Roman" w:eastAsia="Times New Roman" w:hAnsi="Times New Roman"/>
+        </w:rPr>
+        <w:t>On timing, the evidence supports neither a prediction that effects will take decades nor the view that the future cannot be known. Table 6 gives earliest detection dates that range from 2025 for very large effects in high-acquisition sectors to 2035 for moderate effects under slow diffusion in the average firm, and never, in this design, for platform-sized effects. What the data cannot say is whether assimilation is occurring now. Answering that requires firm-level data that link use, complementary assets, task reassignment, and hiring.</w:t>
       </w:r>
     </w:p>
     <w:p>
@@ -9860,13 +9883,12 @@
       <w:r>
         <w:rPr>
           <w:rFonts w:ascii="Times New Roman" w:cs="Times New Roman" w:eastAsia="Times New Roman" w:hAnsi="Times New Roman"/>
-          <w:b/>
           <w:bCs/>
           <w:color w:val="000000"/>
           <w:sz w:val="24"/>
           <w:szCs w:val="24"/>
         </w:rPr>
-        <w:t xml:space="preserve">10.3 Limitations</w:t>
+        <w:t>10.3 Implications</w:t>
       </w:r>
     </w:p>
     <w:p>
@@ -9878,7 +9900,35 @@
         <w:rPr>
           <w:rFonts w:ascii="Times New Roman" w:cs="Times New Roman" w:eastAsia="Times New Roman" w:hAnsi="Times New Roman"/>
         </w:rPr>
-        <w:t>We do not observe assimilation. The barrier items refer to AI in general and to firms that considered it, so they speak to the acquisition margin only. The hiring series are experimental, measure adverts or vacancies rather than employment, and would miss substitution through hours, outsourcing, or freelancing. Exposure is measured with low reliability. Acquisition rates are sector averages and do not identify the employers of particular occupations. The detectability bound rests on a linear mapping from exposure to the visual share of work and on reference effect sizes from platforms, and both could be refined; however, plausible changes alter the numbers in Tables 5 and 6 without changing the conclusion that current designs lack the power to detect complete assimilation at platform-sized effects.</w:t>
+        <w:t xml:space="preserve">For researchers, the implication is to report the acquisition rate and reference effect size that an exposure estimate would require, and to treat estimates that exceed that requirement, or that predate the technology, as evidence about something else. For managers, the barrier evidence suggests that the constraints on using generative visual tools are organizational: review capacity and policies for copyright and personal data are complements to the tool, and waiting for better models will not build them. For statistical agencies and policymakers, a rising use indicator should not be read as rising task reassignment, and a small hiring response should not be read as evidence that the response will remain small. Adding questions on task reassignment and on review and compliance practices to enterprise surveys would make the gap directly measurable.</w:t>
+      </w:r>
+    </w:p>
+    <w:p>
+      <w:pPr>
+        <w:pStyle w:val="Heading2"/>
+        <w:spacing w:after="120" w:before="280"/>
+      </w:pPr>
+      <w:r>
+        <w:rPr>
+          <w:rFonts w:ascii="Times New Roman" w:cs="Times New Roman" w:eastAsia="Times New Roman" w:hAnsi="Times New Roman"/>
+          <w:bCs/>
+          <w:color w:val="000000"/>
+          <w:sz w:val="24"/>
+          <w:szCs w:val="24"/>
+        </w:rPr>
+        <w:t>10.4 Limitations</w:t>
+      </w:r>
+    </w:p>
+    <w:p>
+      <w:pPr>
+        <w:spacing w:after="160" w:line="276"/>
+        <w:jc w:val="both"/>
+      </w:pPr>
+      <w:r>
+        <w:rPr>
+          <w:rFonts w:ascii="Times New Roman" w:cs="Times New Roman" w:eastAsia="Times New Roman" w:hAnsi="Times New Roman"/>
+        </w:rPr>
+        <w:t>We do not observe assimilation. The barrier items refer to AI in general and to firms that considered it, so they speak to the acquisition margin only. The hiring series are experimental, measure adverts or vacancies rather than employment, and would miss substitution through hours, outsourcing, or freelancing. Exposure is measured with low reliability. Acquisition rates are sector averages and do not identify the employers of particular occupations. We study occupations and sectors, not aggregate employment or productivity, and the macroeconomic reading in Section 10.2 interprets the results through the model rather than testing it. The detectability bound rests on a linear mapping from exposure to the visual share of work and on reference effect sizes from platforms, and both could be refined; however, plausible changes alter the numbers in Tables 5 and 6 without changing the conclusion that current designs lack the power to detect complete assimilation at platform-sized effects.</w:t>
       </w:r>
     </w:p>
     <w:p>

</xml_diff>

<commit_message>
Carry macroeconomic perspective into abstract, introduction, and conclusion
Co-Authored-By: Claude Sonnet 5.5 <noreply@anthropic.com>
Claude-Session: https://claude.ai/code/session_01H4JvRLBkzRHsy6jU5TcEWv
</commit_message>
<xml_diff>
--- a/isr_paper/revised/Acquired_Not_Yet_Assimilated_ISR.docx
+++ b/isr_paper/revised/Acquired_Not_Yet_Assimilated_ISR.docx
@@ -92,7 +92,7 @@
         <w:rPr>
           <w:rFonts w:ascii="Times New Roman" w:cs="Times New Roman" w:eastAsia="Times New Roman" w:hAnsi="Times New Roman"/>
         </w:rPr>
-        <w:t>Statistics showing that firms use generative visual AI are increasingly read as evidence that creative work is being displaced. Information systems research separates acquiring an innovation from assimilating it into work. We model a firm that reassigns a visual task to a generator only when output acceptance exceeds a threshold set by generation, review, and human production costs. Review cost depends on organizational complements, so near-free acquisition can run ahead of assimilation. Eurostat data show that 9.6 percent of EU firms use AI that generates pictures, video, or audio, and that firms which considered AI cite missing expertise (70 percent) and legal uncertainty (54 percent) far more than lack of usefulness (18 percent). A detectability bound shows that European and Canadian job-advert designs could not detect even complete assimilation at platform-sized effects; the small gradients they find are no larger than earlier trends. We specify the firm-level evidence needed.</w:t>
+        <w:t>Statistics showing that firms use generative visual AI are read as evidence that creative work is being displaced. Macroeconomic theory of general-purpose technologies and information systems research on assimilation both predict that adoption runs ahead of effects. We model a firm that reassigns a visual task to a generator only when output acceptance exceeds a cost threshold; review is a bottleneck whose cost depends on organizational complements, and employers adjust through attrition. Eurostat data show that 9.6 percent of EU firms use AI that generates pictures, video, or audio, and that non-adopters cite missing expertise (70 percent) and legal uncertainty (54 percent) far more than lack of usefulness (18 percent). A detectability bound shows that European and Canadian job-advert designs could not detect even complete assimilation at platform-sized effects; the small gradients found are no larger than earlier trends. We specify the firm-level evidence needed.</w:t>
       </w:r>
     </w:p>
     <w:p>
@@ -152,7 +152,7 @@
         <w:rPr>
           <w:rFonts w:ascii="Times New Roman" w:cs="Times New Roman" w:eastAsia="Times New Roman" w:hAnsi="Times New Roman"/>
         </w:rPr>
-        <w:t xml:space="preserve">Information systems research offers a reason to be cautious about this reading. Implementation research has long treated adoption as one stage in a sequence that runs through adaptation, acceptance, routinization, and infusion (Cooper and Zmud 1990). Fichman and Kemerer (1999) showed that organizations can acquire an innovation well before they deploy it, so that diffusion statistics overstate use; they called the wedge an assimilation gap and found it widest where knowledge barriers were high. Work on IT business value adds that returns to information technology depend on complementary organizational investments (Brynjolfsson and Hitt 2000; Melville, Kraemer, and Gurbaxani 2004; Aral and Weill 2007). The question for generative visual AI is therefore not only whether it substitutes for creative labor. It is whether reported use reflects assimilation into tasks at all, and whether the evidence that researchers currently use could tell the difference.</w:t>
+        <w:t>Information systems research offers a reason to be cautious about this reading. Implementation research has long treated adoption as one stage in a sequence that runs through adaptation, acceptance, routinization, and infusion (Cooper and Zmud 1990). Fichman and Kemerer (1999) showed that organizations can acquire an innovation well before they deploy it, so that diffusion statistics overstate use; they called the wedge an assimilation gap and found it widest where knowledge barriers were high. Work on IT business value adds that returns to information technology depend on complementary organizational investments (Brynjolfsson and Hitt 2000; Melville, Kraemer, and Gurbaxani 2004; Aral and Weill 2007). Macroeconomics offers the same caution. General-purpose technologies take effect only after complementary investments, labor markets adjust through attrition and reallocation rather than immediate job loss, and technology often accelerates structural change already under way (David 1990; Brynjolfsson, Rock, and Syverson 2021; Acemoglu and Restrepo 2018). The question for generative visual AI is therefore not only whether it substitutes for creative labor. It is whether reported use reflects assimilation into tasks at all, and whether the evidence that researchers currently use could tell the difference.</w:t>
       </w:r>
     </w:p>
     <w:p>
@@ -164,7 +164,7 @@
         <w:rPr>
           <w:rFonts w:ascii="Times New Roman" w:cs="Times New Roman" w:eastAsia="Times New Roman" w:hAnsi="Times New Roman"/>
         </w:rPr>
-        <w:t xml:space="preserve">We make three moves. First, we develop a task-level theory in which a firm reassigns a visual task to a generator only when the acceptance rate of output exceeds a threshold set by generation cost, review cost, and the cost of human production. The theory locates the complementary assets inside review cost: expertise to specify and check output, capacity to run review as a routine, and procedures that make copyright and personal-data exposure manageable. It implies that when review cost alone exceeds the cost of human production, no improvement in the model can trigger assimilation, and that because acquiring a generator costs almost nothing, acquisition can grow without the complements that assimilation requires. Second, we ask what aggregate public data can reveal about this gap. We derive a simple detectability bound that compares the hiring response implied by complete assimilation with the minimum detectable effect of standard exposure designs. Third, we assemble the descriptive evidence that does exist on the acquisition margin and on the barriers that firms report.</w:t>
+        <w:t>We make three moves. First, we develop a task-level theory in which a firm reassigns a visual task to a generator only when the acceptance rate of output exceeds a threshold set by generation cost, review cost, and the cost of human production. The theory locates the complementary assets inside review cost: expertise to specify and check output, capacity to run review as a routine, and procedures that make copyright and personal-data exposure manageable. We embed review in a task-based model of labor demand that separates displacement, reinstatement, and scale effects (Acemoglu and Restrepo 2018, 2019), treat review as a bottleneck task (Baumol 1967), and let employers adjust through attrition. It implies that when review cost alone exceeds the cost of human production, no improvement in the model can trigger assimilation, and that because acquiring a generator costs almost nothing, acquisition can grow without the complements that assimilation requires. Second, we ask what aggregate public data can reveal about this gap. We derive a simple detectability bound that compares the hiring response implied by complete assimilation with the minimum detectable effect of standard exposure designs. Third, we assemble the descriptive evidence that does exist on the acquisition margin and on the barriers that firms report.</w:t>
       </w:r>
     </w:p>
     <w:p>
@@ -9957,7 +9957,7 @@
         <w:rPr>
           <w:rFonts w:ascii="Times New Roman" w:cs="Times New Roman" w:eastAsia="Times New Roman" w:hAnsi="Times New Roman"/>
         </w:rPr>
-        <w:t>Generative visual AI has been widely acquired: about one in ten European firms used it in 2025, and about one in three in publishing, film, and broadcasting. Firms that considered AI and did not adopt it point to missing expertise, legal uncertainty, and data protection rather than to a tool that is not useful. The theory developed here explains why such complements govern assimilation and why near-free acquisition can let adoption statistics run ahead of any change in work. The empirical lesson is equally important. Occupation-level hiring data cannot yet tell us whether acquisition has been assimilated, and the exposure gradients they show are small, imprecise, and no larger than the trend that preceded the technology. Answering the question requires linking firms’ use, their complementary assets, and their hiring, and this paper specifies what that evidence would have to show.</w:t>
+        <w:t>Generative visual AI has been widely acquired: about one in ten European firms used it in 2025, and about one in three in publishing, film, and broadcasting. Firms that considered AI and did not adopt it point to missing expertise, legal uncertainty, and data protection rather than to a tool that is not useful. The theory developed here explains why such complements govern assimilation and why near-free acquisition can let adoption statistics run ahead of any change in work. In macroeconomic terms, general-purpose technologies, task-based labor demand, bottleneck tasks, and attrition-based adjustment together imply that effects reach hiring and employment with a lag and unevenly across occupations. The empirical lesson is equally important. Occupation-level hiring data cannot yet tell us whether acquisition has been assimilated, and the exposure gradients they show are small, imprecise, and no larger than the trend that preceded the technology. Answering the question requires linking firms’ use, their complementary assets, and their hiring, and this paper specifies what that evidence would have to show.</w:t>
       </w:r>
     </w:p>
     <w:p>

</xml_diff>

<commit_message>
Clarity edit of introduction, fix leftover overclaim in contributions, double-spaced body for journal submission format
Co-Authored-By: Claude Sonnet 5.5 <noreply@anthropic.com>
Claude-Session: https://claude.ai/code/session_01H4JvRLBkzRHsy6jU5TcEWv
</commit_message>
<xml_diff>
--- a/isr_paper/revised/Acquired_Not_Yet_Assimilated_ISR.docx
+++ b/isr_paper/revised/Acquired_Not_Yet_Assimilated_ISR.docx
@@ -85,7 +85,7 @@
     </w:p>
     <w:p>
       <w:pPr>
-        <w:spacing w:after="160" w:line="276"/>
+        <w:spacing w:after="160" w:line="480" w:lineRule="auto"/>
         <w:jc w:val="both"/>
       </w:pPr>
       <w:r>
@@ -133,74 +133,74 @@
     </w:p>
     <w:p>
       <w:pPr>
-        <w:spacing w:after="160" w:line="276"/>
+        <w:spacing w:after="160" w:line="480" w:lineRule="auto"/>
         <w:jc w:val="both"/>
       </w:pPr>
       <w:r>
         <w:rPr>
           <w:rFonts w:ascii="Times New Roman" w:cs="Times New Roman" w:eastAsia="Times New Roman" w:hAnsi="Times New Roman"/>
         </w:rPr>
-        <w:t xml:space="preserve">Generative systems that produce images from text, widely available since 2022, and video, available since 2024, have made a first draft of visual content almost free. Official statistics already record their spread: in 2025 roughly one in ten European enterprises with ten or more employees reported using AI that generates pictures, video, or audio, and more than one in three did so in publishing, film, and broadcasting. A natural reading of these numbers is that the people who used to produce such content are being redeployed, and a growing body of exposure-based labor-market research looks for that redeployment in hiring data.</w:t>
-      </w:r>
-    </w:p>
-    <w:p>
-      <w:pPr>
-        <w:spacing w:after="160" w:line="276"/>
+        <w:t>Tools that turn text into images (widely available since 2022) and into video (since 2024) have made a first draft of visual content almost free. Official statistics already record their spread. In 2025, roughly one in ten European enterprises with ten or more employees reported using AI that generates pictures, video, or audio, and more than one in three did so in publishing, film, and broadcasting. The natural reading is that the people who used to produce such content are being redeployed, and a growing body of exposure-based labor-market research looks for that redeployment in hiring data.</w:t>
+      </w:r>
+    </w:p>
+    <w:p>
+      <w:pPr>
+        <w:spacing w:after="160" w:line="480" w:lineRule="auto"/>
         <w:jc w:val="both"/>
       </w:pPr>
       <w:r>
         <w:rPr>
           <w:rFonts w:ascii="Times New Roman" w:cs="Times New Roman" w:eastAsia="Times New Roman" w:hAnsi="Times New Roman"/>
         </w:rPr>
-        <w:t>Information systems research offers a reason to be cautious about this reading. Implementation research has long treated adoption as one stage in a sequence that runs through adaptation, acceptance, routinization, and infusion (Cooper and Zmud 1990). Fichman and Kemerer (1999) showed that organizations can acquire an innovation well before they deploy it, so that diffusion statistics overstate use; they called the wedge an assimilation gap and found it widest where knowledge barriers were high. Work on IT business value adds that returns to information technology depend on complementary organizational investments (Brynjolfsson and Hitt 2000; Melville, Kraemer, and Gurbaxani 2004; Aral and Weill 2007). Macroeconomics offers the same caution. General-purpose technologies take effect only after complementary investments, labor markets adjust through attrition and reallocation rather than immediate job loss, and technology often accelerates structural change already under way (David 1990; Brynjolfsson, Rock, and Syverson 2021; Acemoglu and Restrepo 2018). The question for generative visual AI is therefore not only whether it substitutes for creative labor. It is whether reported use reflects assimilation into tasks at all, and whether the evidence that researchers currently use could tell the difference.</w:t>
-      </w:r>
-    </w:p>
-    <w:p>
-      <w:pPr>
-        <w:spacing w:after="160" w:line="276"/>
+        <w:t>Information systems research gives reason for caution. Implementation research has long treated adoption as one stage in a sequence that runs through adaptation, acceptance, routinization, and infusion (Cooper and Zmud 1990). Fichman and Kemerer (1999) showed that organizations can acquire an innovation well before they deploy it, so diffusion statistics overstate use; they called the wedge an assimilation gap and found it widest where knowledge barriers were high. Work on IT business value adds that returns depend on complementary organizational investments (Brynjolfsson and Hitt 2000; Melville, Kraemer, and Gurbaxani 2004; Aral and Weill 2007). Macroeconomics points the same way. General-purpose technologies take effect only after complementary investments, labor markets adjust through attrition and reallocation rather than immediate job loss, and technology often accelerates structural change already under way (David 1990; Brynjolfsson, Rock, and Syverson 2021; Acemoglu and Restrepo 2018). For generative visual AI, then, the question is not only whether it substitutes for creative labor but also whether reported use reflects assimilation into tasks at all, and whether the evidence researchers currently rely on could tell the difference.</w:t>
+      </w:r>
+    </w:p>
+    <w:p>
+      <w:pPr>
+        <w:spacing w:after="160" w:line="480" w:lineRule="auto"/>
         <w:jc w:val="both"/>
       </w:pPr>
       <w:r>
         <w:rPr>
           <w:rFonts w:ascii="Times New Roman" w:cs="Times New Roman" w:eastAsia="Times New Roman" w:hAnsi="Times New Roman"/>
         </w:rPr>
-        <w:t>We make three moves. First, we develop a task-level theory in which a firm reassigns a visual task to a generator only when the acceptance rate of output exceeds a threshold set by generation cost, review cost, and the cost of human production. The theory locates the complementary assets inside review cost: expertise to specify and check output, capacity to run review as a routine, and procedures that make copyright and personal-data exposure manageable. We embed review in a task-based model of labor demand that separates displacement, reinstatement, and scale effects (Acemoglu and Restrepo 2018, 2019), treat review as a bottleneck task (Baumol 1967), and let employers adjust through attrition. It implies that when review cost alone exceeds the cost of human production, no improvement in the model can trigger assimilation, and that because acquiring a generator costs almost nothing, acquisition can grow without the complements that assimilation requires. Second, we ask what aggregate public data can reveal about this gap. We derive a simple detectability bound that compares the hiring response implied by complete assimilation with the minimum detectable effect of standard exposure designs. Third, we assemble the descriptive evidence that does exist on the acquisition margin and on the barriers that firms report.</w:t>
-      </w:r>
-    </w:p>
-    <w:p>
-      <w:pPr>
-        <w:spacing w:after="160" w:line="276"/>
+        <w:t>The paper has three parts. First, we develop a task-level theory in which a firm reassigns a visual task to a generator only when the acceptance rate of output exceeds a threshold set by generation cost, review cost, and the cost of human production. Complementary assets enter through review cost: expertise to specify and check output, capacity to run review as a routine, and procedures that keep copyright and personal-data exposure manageable. We embed review in a task-based model of labor demand that separates displacement, reinstatement, and scale effects (Acemoglu and Restrepo 2018, 2019), treat review as a bottleneck task (Baumol 1967), and let employers adjust through attrition. The theory implies that when review cost alone exceeds the cost of human production, no improvement in the model can trigger assimilation, and that because acquiring a generator costs almost nothing, acquisition can grow without the complements that assimilation requires. Second, we ask what aggregate public data can reveal about this gap, deriving a detectability bound that compares the hiring response implied by complete assimilation with the minimum detectable effect of standard exposure designs. Third, we assemble the descriptive evidence that exists on the acquisition margin and on the barriers firms report.</w:t>
+      </w:r>
+    </w:p>
+    <w:p>
+      <w:pPr>
+        <w:spacing w:after="160" w:line="480" w:lineRule="auto"/>
         <w:jc w:val="both"/>
       </w:pPr>
       <w:r>
         <w:rPr>
           <w:rFonts w:ascii="Times New Roman" w:cs="Times New Roman" w:eastAsia="Times New Roman" w:hAnsi="Times New Roman"/>
         </w:rPr>
-        <w:t>The results are partly substantive and partly cautionary. Acquisition of generative visual AI is substantial and rising, so a lack of hiring response cannot be explained by a lack of acquisition. Firms that considered AI and did not adopt it describe missing expertise, legal uncertainty, and data-protection concerns far more often than a tool that is not useful, which is the pattern a complementary-asset account predicts and a capability-failure account does not. But the hiring data cannot currently distinguish an assimilation gap from complete assimilation. At observed acquisition rates and at the substitution effects estimated on freelance platforms (Demirci, Hannane, and Zhu 2025), complete assimilation would reduce adverts in the most exposed occupation by roughly 2 to 17 percent, while the European design cannot detect a reduction smaller than about 24 percent for that occupation. The exposure gradients that the designs do report are small and imprecise, about 1 to 2 percent fewer adverts per standard deviation of exposure in 2023 and 2024, and the European gradient was already moving in the same direction before generative tools were released.</w:t>
-      </w:r>
-    </w:p>
-    <w:p>
-      <w:pPr>
-        <w:spacing w:after="160" w:line="276"/>
+        <w:t>The results are partly substantive and partly cautionary. Acquisition of generative visual AI is substantial and rising, so a lack of hiring response cannot be explained by a lack of acquisition. Firms that considered AI and did not adopt it cite missing expertise, legal uncertainty, and data-protection concerns far more often than a tool that is not useful, which is what a complementary-asset account predicts and a capability-failure account does not. The hiring data, however, cannot currently distinguish an assimilation gap from complete assimilation. At observed acquisition rates and at the substitution effects estimated on freelance platforms (Demirci, Hannane, and Zhu 2025), complete assimilation would reduce adverts in the most exposed occupation by roughly 2 to 17 percent, while the European design cannot detect a reduction smaller than about 24 percent. The exposure gradients that the designs do report are small and imprecise, about 1 to 2 percent fewer adverts per standard deviation of exposure in 2023 and 2024, and the European gradient was already moving in the same direction before generative tools were released.</w:t>
+      </w:r>
+    </w:p>
+    <w:p>
+      <w:pPr>
+        <w:spacing w:after="160" w:line="480" w:lineRule="auto"/>
         <w:jc w:val="both"/>
       </w:pPr>
       <w:r>
         <w:rPr>
           <w:rFonts w:ascii="Times New Roman" w:cs="Times New Roman" w:eastAsia="Times New Roman" w:hAnsi="Times New Roman"/>
         </w:rPr>
-        <w:t xml:space="preserve">We are explicit about what this paper does not claim. We do not observe assimilation inside firms, and we do not treat small or fragile hiring responses as evidence of a gap. We show instead that such responses could not, at present, have revealed either a gap or its absence. Four accounts remain in contention: a capability failure, in which the tool does not meet task requirements; complete assimilation with net substitution; assimilation in which scale effects offset substitution; and an assimilation gap held open by missing complements. The barrier evidence weighs against the first account at the acquisition margin. Separating the remaining three requires firm-level data that link use, complementary assets, task reassignment, and hiring, and we specify what such data would have to show.</w:t>
-      </w:r>
-    </w:p>
-    <w:p>
-      <w:pPr>
-        <w:spacing w:after="160" w:line="276"/>
+        <w:t>We are explicit about what the paper does not claim. We do not observe assimilation inside firms, and we do not treat small or fragile hiring responses as evidence of a gap. Our point is that such responses could not, at present, have revealed either a gap or its absence. Four accounts remain in contention: a capability failure, in which the tool does not meet task requirements; complete assimilation with net substitution; assimilation in which scale effects offset substitution; and an assimilation gap held open by missing complements. The barrier evidence weighs against the first at the acquisition margin. Separating the other three requires firm-level data that link use, complementary assets, task reassignment, and hiring, and we specify what such data would have to show.</w:t>
+      </w:r>
+    </w:p>
+    <w:p>
+      <w:pPr>
+        <w:spacing w:after="160" w:line="480" w:lineRule="auto"/>
         <w:jc w:val="both"/>
       </w:pPr>
       <w:r>
         <w:rPr>
           <w:rFonts w:ascii="Times New Roman" w:cs="Times New Roman" w:eastAsia="Times New Roman" w:hAnsi="Times New Roman"/>
         </w:rPr>
-        <w:t>The paper contributes to information systems research in three ways. It extends assimilation theory to generative AI by identifying review cost as the place where complementary assets enter, and by explaining why near-zero acquisition costs should make assimilation gaps wider for generative tools than for the enterprise systems on which the theory was built. Embedding review cost in a task-based model of labor demand shows that review sets a floor on the labor that assimilation can save, that cheaper generation raises employment only if demand for visual output is elastic, and that employers who adjust through attrition make adverts the earlier and employment the later signal. It provides a detectability bound that tells researchers when occupation-level hiring designs can and cannot be informative about generative-AI assimilation, and it shows that a common empirical strategy currently attributes to the technology declines that the technology cannot have produced. And it turns the gap into a falsifiable research design, with predictions that distinguish the four accounts once linked data become available.</w:t>
+        <w:t>The paper contributes to information systems research in three ways. First, it extends assimilation theory to generative AI by identifying review cost as the place where complementary assets enter, and by explaining why near-zero acquisition costs should make assimilation gaps wider for generative tools than for the enterprise systems on which the theory was built. Embedding review cost in a task-based model of labor demand shows that review sets a floor on the labor that assimilation can save, that cheaper generation raises employment only if demand for visual output is elastic, and that employers who adjust through attrition make adverts the earlier and employment the later signal. Second, it provides a detectability bound that tells researchers when occupation-level hiring designs can and cannot be informative about assimilation, and it shows how the bound changes the reading of exposure gradients: the 2023 European gradient is no larger than the trend that preceded the technology, and the 2024 gradient is too imprecise to separate the scenarios. Third, it turns the gap into a falsifiable research design, with predictions that distinguish the four accounts once linked data become available.</w:t>
       </w:r>
     </w:p>
     <w:p>
@@ -239,7 +239,7 @@
     </w:p>
     <w:p>
       <w:pPr>
-        <w:spacing w:after="160" w:line="276"/>
+        <w:spacing w:after="160" w:line="480" w:lineRule="auto"/>
         <w:jc w:val="both"/>
       </w:pPr>
       <w:r>
@@ -268,7 +268,7 @@
     </w:p>
     <w:p>
       <w:pPr>
-        <w:spacing w:after="160" w:line="276"/>
+        <w:spacing w:after="160" w:line="480" w:lineRule="auto"/>
         <w:jc w:val="both"/>
       </w:pPr>
       <w:r>
@@ -297,7 +297,7 @@
     </w:p>
     <w:p>
       <w:pPr>
-        <w:spacing w:after="160" w:line="276"/>
+        <w:spacing w:after="160" w:line="480" w:lineRule="auto"/>
         <w:jc w:val="both"/>
       </w:pPr>
       <w:r>
@@ -343,7 +343,7 @@
     </w:p>
     <w:p>
       <w:pPr>
-        <w:spacing w:after="160" w:line="276"/>
+        <w:spacing w:after="160" w:line="480" w:lineRule="auto"/>
         <w:jc w:val="both"/>
       </w:pPr>
       <w:r>
@@ -383,7 +383,7 @@
     </w:p>
     <w:p>
       <w:pPr>
-        <w:spacing w:after="160" w:line="276"/>
+        <w:spacing w:after="160" w:line="480" w:lineRule="auto"/>
         <w:jc w:val="both"/>
       </w:pPr>
       <w:r>
@@ -412,7 +412,7 @@
     </w:p>
     <w:p>
       <w:pPr>
-        <w:spacing w:after="160" w:line="276"/>
+        <w:spacing w:after="160" w:line="480" w:lineRule="auto"/>
         <w:jc w:val="both"/>
       </w:pPr>
       <w:r>
@@ -578,7 +578,7 @@
     </w:p>
     <w:p>
       <w:pPr>
-        <w:spacing w:after="160" w:line="276"/>
+        <w:spacing w:after="160" w:line="480" w:lineRule="auto"/>
         <w:jc w:val="both"/>
       </w:pPr>
       <w:r>
@@ -842,7 +842,7 @@
     </w:p>
     <w:p>
       <w:pPr>
-        <w:spacing w:after="160" w:line="276"/>
+        <w:spacing w:after="160" w:line="480" w:lineRule="auto"/>
         <w:jc w:val="both"/>
       </w:pPr>
       <w:r>
@@ -996,7 +996,7 @@
     </w:p>
     <w:p>
       <w:pPr>
-        <w:spacing w:after="160" w:line="276"/>
+        <w:spacing w:after="160" w:line="480" w:lineRule="auto"/>
         <w:jc w:val="both"/>
       </w:pPr>
       <w:r>
@@ -1061,7 +1061,7 @@
     </w:p>
     <w:p>
       <w:pPr>
-        <w:spacing w:after="160" w:line="276"/>
+        <w:spacing w:after="160" w:line="480" w:lineRule="auto"/>
         <w:jc w:val="both"/>
       </w:pPr>
       <w:r>
@@ -1171,7 +1171,7 @@
     </w:p>
     <w:p>
       <w:pPr>
-        <w:spacing w:after="160" w:line="276"/>
+        <w:spacing w:after="160" w:line="480" w:lineRule="auto"/>
         <w:jc w:val="both"/>
       </w:pPr>
       <w:r>
@@ -1325,7 +1325,7 @@
     </w:p>
     <w:p>
       <w:pPr>
-        <w:spacing w:after="160" w:line="276"/>
+        <w:spacing w:after="160" w:line="480" w:lineRule="auto"/>
         <w:jc w:val="both"/>
       </w:pPr>
       <w:r>
@@ -1727,7 +1727,7 @@
     </w:p>
     <w:p>
       <w:pPr>
-        <w:spacing w:after="160" w:line="276"/>
+        <w:spacing w:after="160" w:line="480" w:lineRule="auto"/>
         <w:jc w:val="both"/>
       </w:pPr>
       <w:r>
@@ -1798,7 +1798,7 @@
     </w:p>
     <w:p>
       <w:pPr>
-        <w:spacing w:after="160" w:line="276"/>
+        <w:spacing w:after="160" w:line="480" w:lineRule="auto"/>
         <w:jc w:val="both"/>
       </w:pPr>
       <w:r>
@@ -1852,7 +1852,7 @@
     </w:p>
     <w:p>
       <w:pPr>
-        <w:spacing w:after="160" w:line="276"/>
+        <w:spacing w:after="160" w:line="480" w:lineRule="auto"/>
         <w:jc w:val="both"/>
       </w:pPr>
       <w:r>
@@ -2010,7 +2010,7 @@
     </w:p>
     <w:p>
       <w:pPr>
-        <w:spacing w:after="160" w:line="276"/>
+        <w:spacing w:after="160" w:line="480" w:lineRule="auto"/>
         <w:jc w:val="both"/>
       </w:pPr>
       <w:r>
@@ -2217,7 +2217,7 @@
     </w:p>
     <w:p>
       <w:pPr>
-        <w:spacing w:after="160" w:line="276"/>
+        <w:spacing w:after="160" w:line="480" w:lineRule="auto"/>
         <w:jc w:val="both"/>
       </w:pPr>
       <w:r>
@@ -2369,7 +2369,7 @@
     </w:p>
     <w:p>
       <w:pPr>
-        <w:spacing w:after="160" w:line="276"/>
+        <w:spacing w:after="160" w:line="480" w:lineRule="auto"/>
         <w:jc w:val="both"/>
       </w:pPr>
       <w:r>
@@ -2618,7 +2618,7 @@
     </w:p>
     <w:p>
       <w:pPr>
-        <w:spacing w:after="160" w:line="276"/>
+        <w:spacing w:after="160" w:line="480" w:lineRule="auto"/>
         <w:jc w:val="both"/>
       </w:pPr>
       <w:r>
@@ -2767,7 +2767,7 @@
     </w:p>
     <w:p>
       <w:pPr>
-        <w:spacing w:after="160" w:line="276"/>
+        <w:spacing w:after="160" w:line="480" w:lineRule="auto"/>
         <w:jc w:val="both"/>
       </w:pPr>
       <w:r>
@@ -2795,7 +2795,7 @@
     </w:p>
     <w:p>
       <w:pPr>
-        <w:spacing w:after="160" w:line="276"/>
+        <w:spacing w:after="160" w:line="480" w:lineRule="auto"/>
         <w:jc w:val="both"/>
       </w:pPr>
       <w:r>
@@ -3688,7 +3688,7 @@
     </w:p>
     <w:p>
       <w:pPr>
-        <w:spacing w:after="160" w:line="276"/>
+        <w:spacing w:after="160" w:line="480" w:lineRule="auto"/>
         <w:jc w:val="both"/>
       </w:pPr>
       <w:r>
@@ -3773,7 +3773,7 @@
     </w:p>
     <w:p>
       <w:pPr>
-        <w:spacing w:after="160" w:line="276"/>
+        <w:spacing w:after="160" w:line="480" w:lineRule="auto"/>
         <w:jc w:val="both"/>
       </w:pPr>
       <w:r>
@@ -3907,7 +3907,7 @@
     </w:p>
     <w:p>
       <w:pPr>
-        <w:spacing w:after="160" w:line="276"/>
+        <w:spacing w:after="160" w:line="480" w:lineRule="auto"/>
         <w:jc w:val="both"/>
       </w:pPr>
       <w:r>
@@ -3933,7 +3933,7 @@
     </w:p>
     <w:p>
       <w:pPr>
-        <w:spacing w:after="160" w:line="276"/>
+        <w:spacing w:after="160" w:line="480" w:lineRule="auto"/>
         <w:jc w:val="both"/>
       </w:pPr>
       <w:r>
@@ -4010,7 +4010,7 @@
     </w:p>
     <w:p>
       <w:pPr>
-        <w:spacing w:after="160" w:line="276"/>
+        <w:spacing w:after="160" w:line="480" w:lineRule="auto"/>
         <w:jc w:val="both"/>
       </w:pPr>
       <w:r>
@@ -4098,7 +4098,7 @@
     </w:p>
     <w:p>
       <w:pPr>
-        <w:spacing w:after="160" w:line="276"/>
+        <w:spacing w:after="160" w:line="480" w:lineRule="auto"/>
         <w:jc w:val="both"/>
       </w:pPr>
       <w:r>
@@ -4127,7 +4127,7 @@
     </w:p>
     <w:p>
       <w:pPr>
-        <w:spacing w:after="160" w:line="276"/>
+        <w:spacing w:after="160" w:line="480" w:lineRule="auto"/>
         <w:jc w:val="both"/>
       </w:pPr>
       <w:r>
@@ -4156,7 +4156,7 @@
     </w:p>
     <w:p>
       <w:pPr>
-        <w:spacing w:after="160" w:line="276"/>
+        <w:spacing w:after="160" w:line="480" w:lineRule="auto"/>
         <w:jc w:val="both"/>
       </w:pPr>
       <w:r>
@@ -4202,7 +4202,7 @@
     </w:p>
     <w:p>
       <w:pPr>
-        <w:spacing w:after="160" w:line="276"/>
+        <w:spacing w:after="160" w:line="480" w:lineRule="auto"/>
         <w:jc w:val="both"/>
       </w:pPr>
       <w:r>
@@ -5293,7 +5293,7 @@
     </w:p>
     <w:p>
       <w:pPr>
-        <w:spacing w:after="160" w:line="276"/>
+        <w:spacing w:after="160" w:line="480" w:lineRule="auto"/>
         <w:jc w:val="both"/>
       </w:pPr>
       <w:r>
@@ -6262,7 +6262,7 @@
     </w:p>
     <w:p>
       <w:pPr>
-        <w:spacing w:after="160" w:line="276"/>
+        <w:spacing w:after="160" w:line="480" w:lineRule="auto"/>
         <w:jc w:val="both"/>
       </w:pPr>
       <w:r>
@@ -6274,7 +6274,7 @@
     </w:p>
     <w:p>
       <w:pPr>
-        <w:spacing w:after="160" w:line="276"/>
+        <w:spacing w:after="160" w:line="480" w:lineRule="auto"/>
         <w:jc w:val="both"/>
       </w:pPr>
       <w:r>
@@ -6320,7 +6320,7 @@
     </w:p>
     <w:p>
       <w:pPr>
-        <w:spacing w:after="160" w:line="276"/>
+        <w:spacing w:after="160" w:line="480" w:lineRule="auto"/>
         <w:jc w:val="both"/>
       </w:pPr>
       <w:r>
@@ -7739,7 +7739,7 @@
     </w:p>
     <w:p>
       <w:pPr>
-        <w:spacing w:after="160" w:line="276"/>
+        <w:spacing w:after="160" w:line="480" w:lineRule="auto"/>
         <w:jc w:val="both"/>
       </w:pPr>
       <w:r>
@@ -7768,7 +7768,7 @@
     </w:p>
     <w:p>
       <w:pPr>
-        <w:spacing w:after="160" w:line="276"/>
+        <w:spacing w:after="160" w:line="480" w:lineRule="auto"/>
         <w:jc w:val="both"/>
       </w:pPr>
       <w:r>
@@ -8643,7 +8643,7 @@
     </w:p>
     <w:p>
       <w:pPr>
-        <w:spacing w:after="160" w:line="276"/>
+        <w:spacing w:after="160" w:line="480" w:lineRule="auto"/>
         <w:jc w:val="both"/>
       </w:pPr>
       <w:r>
@@ -8681,7 +8681,7 @@
     </w:p>
     <w:p>
       <w:pPr>
-        <w:spacing w:after="160" w:line="276"/>
+        <w:spacing w:after="160" w:line="480" w:lineRule="auto"/>
         <w:jc w:val="both"/>
       </w:pPr>
       <w:r>
@@ -8709,7 +8709,7 @@
     </w:p>
     <w:p>
       <w:pPr>
-        <w:spacing w:after="160" w:line="276"/>
+        <w:spacing w:after="160" w:line="480" w:lineRule="auto"/>
         <w:jc w:val="both"/>
       </w:pPr>
       <w:r>
@@ -8737,7 +8737,7 @@
     </w:p>
     <w:p>
       <w:pPr>
-        <w:spacing w:after="160" w:line="276"/>
+        <w:spacing w:after="160" w:line="480" w:lineRule="auto"/>
         <w:jc w:val="both"/>
       </w:pPr>
       <w:r>
@@ -8778,7 +8778,7 @@
     </w:p>
     <w:p>
       <w:pPr>
-        <w:spacing w:after="160" w:line="276"/>
+        <w:spacing w:after="160" w:line="480" w:lineRule="auto"/>
         <w:jc w:val="both"/>
       </w:pPr>
       <w:r>
@@ -8846,7 +8846,7 @@
     </w:p>
     <w:p>
       <w:pPr>
-        <w:spacing w:after="160" w:line="276"/>
+        <w:spacing w:after="160" w:line="480" w:lineRule="auto"/>
         <w:jc w:val="both"/>
       </w:pPr>
       <w:r>
@@ -9702,7 +9702,7 @@
     </w:p>
     <w:p>
       <w:pPr>
-        <w:spacing w:after="160" w:line="276"/>
+        <w:spacing w:after="160" w:line="480" w:lineRule="auto"/>
         <w:jc w:val="both"/>
       </w:pPr>
       <w:r>
@@ -9731,7 +9731,7 @@
     </w:p>
     <w:p>
       <w:pPr>
-        <w:spacing w:after="160" w:line="276"/>
+        <w:spacing w:after="160" w:line="480" w:lineRule="auto"/>
         <w:jc w:val="both"/>
       </w:pPr>
       <w:r>
@@ -9743,7 +9743,7 @@
     </w:p>
     <w:p>
       <w:pPr>
-        <w:spacing w:after="160" w:line="276"/>
+        <w:spacing w:after="160" w:line="480" w:lineRule="auto"/>
         <w:jc w:val="both"/>
       </w:pPr>
       <w:r>
@@ -9789,7 +9789,7 @@
     </w:p>
     <w:p>
       <w:pPr>
-        <w:spacing w:after="160" w:line="276"/>
+        <w:spacing w:after="160" w:line="480" w:lineRule="auto"/>
         <w:jc w:val="both"/>
       </w:pPr>
       <w:r>
@@ -9801,7 +9801,7 @@
     </w:p>
     <w:p>
       <w:pPr>
-        <w:spacing w:after="160" w:line="276"/>
+        <w:spacing w:after="160" w:line="480" w:lineRule="auto"/>
         <w:jc w:val="both"/>
       </w:pPr>
       <w:r>
@@ -9813,7 +9813,7 @@
     </w:p>
     <w:p>
       <w:pPr>
-        <w:spacing w:after="160" w:line="276"/>
+        <w:spacing w:after="160" w:line="480" w:lineRule="auto"/>
         <w:jc w:val="both"/>
       </w:pPr>
       <w:r>
@@ -9841,7 +9841,7 @@
     </w:p>
     <w:p>
       <w:pPr>
-        <w:spacing w:after="160" w:line="276"/>
+        <w:spacing w:after="160" w:line="480" w:lineRule="auto"/>
         <w:jc w:val="both"/>
       </w:pPr>
       <w:r>
@@ -9853,7 +9853,7 @@
     </w:p>
     <w:p>
       <w:pPr>
-        <w:spacing w:after="160" w:line="276"/>
+        <w:spacing w:after="160" w:line="480" w:lineRule="auto"/>
         <w:jc w:val="both"/>
       </w:pPr>
       <w:r>
@@ -9865,7 +9865,7 @@
     </w:p>
     <w:p>
       <w:pPr>
-        <w:spacing w:after="160" w:line="276"/>
+        <w:spacing w:after="160" w:line="480" w:lineRule="auto"/>
         <w:jc w:val="both"/>
       </w:pPr>
       <w:r>
@@ -9893,7 +9893,7 @@
     </w:p>
     <w:p>
       <w:pPr>
-        <w:spacing w:after="160" w:line="276"/>
+        <w:spacing w:after="160" w:line="480" w:lineRule="auto"/>
         <w:jc w:val="both"/>
       </w:pPr>
       <w:r>
@@ -9921,7 +9921,7 @@
     </w:p>
     <w:p>
       <w:pPr>
-        <w:spacing w:after="160" w:line="276"/>
+        <w:spacing w:after="160" w:line="480" w:lineRule="auto"/>
         <w:jc w:val="both"/>
       </w:pPr>
       <w:r>
@@ -9950,7 +9950,7 @@
     </w:p>
     <w:p>
       <w:pPr>
-        <w:spacing w:after="160" w:line="276"/>
+        <w:spacing w:after="160" w:line="480" w:lineRule="auto"/>
         <w:jc w:val="both"/>
       </w:pPr>
       <w:r>
@@ -9979,7 +9979,7 @@
     </w:p>
     <w:p>
       <w:pPr>
-        <w:spacing w:after="160" w:line="276"/>
+        <w:spacing w:after="160" w:line="480" w:lineRule="auto"/>
         <w:jc w:val="both"/>
       </w:pPr>
       <w:r>
@@ -10008,7 +10008,7 @@
     </w:p>
     <w:p>
       <w:pPr>
-        <w:spacing w:after="160" w:line="276"/>
+        <w:spacing w:after="160" w:line="480" w:lineRule="auto"/>
         <w:jc w:val="both"/>
       </w:pPr>
       <w:r>
@@ -10028,7 +10028,7 @@
     </w:p>
     <w:p>
       <w:pPr>
-        <w:spacing w:after="160" w:line="276"/>
+        <w:spacing w:after="160" w:line="480" w:lineRule="auto"/>
         <w:jc w:val="both"/>
       </w:pPr>
       <w:r>
@@ -10065,7 +10065,7 @@
     </w:p>
     <w:p>
       <w:pPr>
-        <w:spacing w:after="160" w:line="276"/>
+        <w:spacing w:after="160" w:line="480" w:lineRule="auto"/>
         <w:jc w:val="both"/>
       </w:pPr>
       <w:r>
@@ -10483,7 +10483,7 @@
     </w:p>
     <w:p>
       <w:pPr>
-        <w:spacing w:after="160" w:line="276"/>
+        <w:spacing w:after="160" w:line="480" w:lineRule="auto"/>
         <w:jc w:val="both"/>
       </w:pPr>
       <w:r>
@@ -10853,7 +10853,7 @@
     </w:p>
     <w:p>
       <w:pPr>
-        <w:spacing w:after="160" w:line="276"/>
+        <w:spacing w:after="160" w:line="480" w:lineRule="auto"/>
         <w:jc w:val="both"/>
       </w:pPr>
       <w:r>
@@ -11223,7 +11223,7 @@
     </w:p>
     <w:p>
       <w:pPr>
-        <w:spacing w:after="160" w:line="276"/>
+        <w:spacing w:after="160" w:line="480" w:lineRule="auto"/>
         <w:jc w:val="both"/>
       </w:pPr>
       <w:r>

</xml_diff>

<commit_message>
State conclusion as no detectable effect so far (not evidence of none); data retrieval date 4 Oct 2026 in citations
Co-Authored-By: Claude Sonnet 5.5 <noreply@anthropic.com>
Claude-Session: https://claude.ai/code/session_01H4JvRLBkzRHsy6jU5TcEWv
</commit_message>
<xml_diff>
--- a/isr_paper/revised/Acquired_Not_Yet_Assimilated_ISR.docx
+++ b/isr_paper/revised/Acquired_Not_Yet_Assimilated_ISR.docx
@@ -92,7 +92,7 @@
         <w:rPr>
           <w:rFonts w:ascii="Times New Roman" w:cs="Times New Roman" w:eastAsia="Times New Roman" w:hAnsi="Times New Roman"/>
         </w:rPr>
-        <w:t>Statistics showing that firms use generative visual AI are read as evidence that creative work is being displaced. Macroeconomic theory of general-purpose technologies and information systems research on assimilation both predict that adoption runs ahead of effects. We model a firm that reassigns a visual task to a generator only when output acceptance exceeds a cost threshold; review is a bottleneck whose cost depends on organizational complements, and employers adjust through attrition. Eurostat data show that 9.6 percent of EU firms use AI that generates pictures, video, or audio, and that non-adopters cite missing expertise (70 percent) and legal uncertainty (54 percent) far more than lack of usefulness (18 percent). A detectability bound shows that European and Canadian job-advert designs could not detect even complete assimilation at platform-sized effects; the small gradients found are no larger than earlier trends. We specify the firm-level evidence needed.</w:t>
+        <w:t>Statistics showing that firms use generative visual AI are read as evidence that creative work is being displaced. Macroeconomic theory of general-purpose technologies and information systems research on assimilation both predict that adoption runs ahead of effects. We model a firm that reassigns a visual task to a generator only when output acceptance exceeds a cost threshold; review is a bottleneck whose cost depends on organizational complements, and employers adjust through attrition. Eurostat data show that 9.6 percent of EU firms use AI that generates pictures, video, or audio, and that non-adopters cite missing expertise (70 percent) and legal uncertainty (54 percent) far more than lack of usefulness (18 percent). European and Canadian job-advert data show no detectable labor-market effect yet: the small gradients are no larger than earlier trends, and the designs could not detect even complete assimilation at platform-sized effects. No detectable effect is not evidence of none; we specify the firm-level evidence needed.</w:t>
       </w:r>
     </w:p>
     <w:p>
@@ -9957,7 +9957,7 @@
         <w:rPr>
           <w:rFonts w:ascii="Times New Roman" w:cs="Times New Roman" w:eastAsia="Times New Roman" w:hAnsi="Times New Roman"/>
         </w:rPr>
-        <w:t>Generative visual AI has been widely acquired: about one in ten European firms used it in 2025, and about one in three in publishing, film, and broadcasting. Firms that considered AI and did not adopt it point to missing expertise, legal uncertainty, and data protection rather than to a tool that is not useful. The theory developed here explains why such complements govern assimilation and why near-free acquisition can let adoption statistics run ahead of any change in work. In macroeconomic terms, general-purpose technologies, task-based labor demand, bottleneck tasks, and attrition-based adjustment together imply that effects reach hiring and employment with a lag and unevenly across occupations. The empirical lesson is equally important. Occupation-level hiring data cannot yet tell us whether acquisition has been assimilated, and the exposure gradients they show are small, imprecise, and no larger than the trend that preceded the technology. Answering the question requires linking firms’ use, their complementary assets, and their hiring, and this paper specifies what that evidence would have to show.</w:t>
+        <w:t>Generative visual AI has been widely acquired: about one in ten European firms used it in 2025, and about one in three in publishing, film, and broadcasting. Firms that considered AI and did not adopt it point to missing expertise, legal uncertainty, and data protection rather than to a tool that is not useful. The theory developed here explains why such complements govern assimilation and why near-free acquisition can let adoption statistics run ahead of any change in work. In macroeconomic terms, general-purpose technologies, task-based labor demand, bottleneck tasks, and attrition-based adjustment together imply that effects reach hiring and employment with a lag and unevenly across occupations. The empirical lesson is equally important. So far, occupation-level hiring data show no detectable labor-market effect of generative visual AI: the exposure gradients are small, imprecise, and no larger than the trend that preceded the technology. That is not evidence of no effect, because these designs could not have detected complete assimilation at platform-sized effects and cannot tell whether acquisition has been assimilated. Answering the question requires linking firms’ use, their complementary assets, and their hiring, and this paper specifies what that evidence would have to show.</w:t>
       </w:r>
     </w:p>
     <w:p>

</xml_diff>